<commit_message>
Updet file and Add My Activities Screen
</commit_message>
<xml_diff>
--- a/_ IT353 Project_.docx
+++ b/_ IT353 Project_.docx
@@ -1,6 +1,6 @@
 
 <file path=word/document.xml><?xml version="1.0" encoding="utf-8"?>
-<w:document xmlns:wpc="http://schemas.microsoft.com/office/word/2010/wordprocessingCanvas" xmlns:cx="http://schemas.microsoft.com/office/drawing/2014/chartex" xmlns:cx1="http://schemas.microsoft.com/office/drawing/2015/9/8/chartex" xmlns:cx2="http://schemas.microsoft.com/office/drawing/2015/10/21/chartex" xmlns:cx3="http://schemas.microsoft.com/office/drawing/2016/5/9/chartex" xmlns:cx4="http://schemas.microsoft.com/office/drawing/2016/5/10/chartex" xmlns:cx5="http://schemas.microsoft.com/office/drawing/2016/5/11/chartex" xmlns:cx6="http://schemas.microsoft.com/office/drawing/2016/5/12/chartex" xmlns:cx7="http://schemas.microsoft.com/office/drawing/2016/5/13/chartex" xmlns:cx8="http://schemas.microsoft.com/office/drawing/2016/5/14/chartex" xmlns:mc="http://schemas.openxmlformats.org/markup-compatibility/2006" xmlns:m="http://schemas.openxmlformats.org/officeDocument/2006/math" xmlns:aink="http://schemas.microsoft.com/office/drawing/2016/ink" xmlns:am3d="http://schemas.microsoft.com/office/drawing/2017/model3d" xmlns:oel="http://schemas.microsoft.com/office/2019/extlst" xmlns:r="http://schemas.openxmlformats.org/officeDocument/2006/relationships" xmlns:wp14="http://schemas.microsoft.com/office/word/2010/wordprocessingDrawing" xmlns:wp="http://schemas.openxmlformats.org/drawingml/2006/wordprocessingDrawing" xmlns:wpg="http://schemas.microsoft.com/office/word/2010/wordprocessingGroup" xmlns:wpi="http://schemas.microsoft.com/office/word/2010/wordprocessingInk" xmlns:wps="http://schemas.microsoft.com/office/word/2010/wordprocessingShape" xmlns:o="urn:schemas-microsoft-com:office:office" xmlns:v="urn:schemas-microsoft-com:vml" xmlns:w10="urn:schemas-microsoft-com:office:word" xmlns:w="http://schemas.openxmlformats.org/wordprocessingml/2006/main" xmlns:w14="http://schemas.microsoft.com/office/word/2010/wordml" xmlns:w15="http://schemas.microsoft.com/office/word/2012/wordml" xmlns:w16cei="http://schemas.microsoft.com/office/word/2026/wordml/cei" xmlns:w16cex="http://schemas.microsoft.com/office/word/2018/wordml/cex" xmlns:w16cid="http://schemas.microsoft.com/office/word/2016/wordml/cid" xmlns:w16="http://schemas.microsoft.com/office/word/2018/wordml" xmlns:w16sdtdh="http://schemas.microsoft.com/office/word/2020/wordml/sdtdatahash" xmlns:w16sdtfl="http://schemas.microsoft.com/office/word/2024/wordml/sdtformatlock" xmlns:w16se="http://schemas.microsoft.com/office/word/2015/wordml/symex" xmlns:w16du="http://schemas.microsoft.com/office/word/2023/wordml/word16du" xmlns:wne="http://schemas.microsoft.com/office/word/2006/wordml" mc:Ignorable="w14 w15 w16se w16cid w16 w16cex w16sdtdh w16sdtfl w16du wp14">
+<w:document xmlns:wpc="http://schemas.microsoft.com/office/word/2010/wordprocessingCanvas" xmlns:cx="http://schemas.microsoft.com/office/drawing/2014/chartex" xmlns:cx1="http://schemas.microsoft.com/office/drawing/2015/9/8/chartex" xmlns:cx2="http://schemas.microsoft.com/office/drawing/2015/10/21/chartex" xmlns:cx3="http://schemas.microsoft.com/office/drawing/2016/5/9/chartex" xmlns:cx4="http://schemas.microsoft.com/office/drawing/2016/5/10/chartex" xmlns:cx5="http://schemas.microsoft.com/office/drawing/2016/5/11/chartex" xmlns:cx6="http://schemas.microsoft.com/office/drawing/2016/5/12/chartex" xmlns:cx7="http://schemas.microsoft.com/office/drawing/2016/5/13/chartex" xmlns:cx8="http://schemas.microsoft.com/office/drawing/2016/5/14/chartex" xmlns:mc="http://schemas.openxmlformats.org/markup-compatibility/2006" xmlns:aink="http://schemas.microsoft.com/office/drawing/2016/ink" xmlns:am3d="http://schemas.microsoft.com/office/drawing/2017/model3d" xmlns:o="urn:schemas-microsoft-com:office:office" xmlns:oel="http://schemas.microsoft.com/office/2019/extlst" xmlns:r="http://schemas.openxmlformats.org/officeDocument/2006/relationships" xmlns:m="http://schemas.openxmlformats.org/officeDocument/2006/math" xmlns:v="urn:schemas-microsoft-com:vml" xmlns:wp14="http://schemas.microsoft.com/office/word/2010/wordprocessingDrawing" xmlns:wp="http://schemas.openxmlformats.org/drawingml/2006/wordprocessingDrawing" xmlns:w10="urn:schemas-microsoft-com:office:word" xmlns:w="http://schemas.openxmlformats.org/wordprocessingml/2006/main" xmlns:w14="http://schemas.microsoft.com/office/word/2010/wordml" xmlns:w15="http://schemas.microsoft.com/office/word/2012/wordml" xmlns:w16cex="http://schemas.microsoft.com/office/word/2018/wordml/cex" xmlns:w16cid="http://schemas.microsoft.com/office/word/2016/wordml/cid" xmlns:w16="http://schemas.microsoft.com/office/word/2018/wordml" xmlns:w16du="http://schemas.microsoft.com/office/word/2023/wordml/word16du" xmlns:w16sdtdh="http://schemas.microsoft.com/office/word/2020/wordml/sdtdatahash" xmlns:w16sdtfl="http://schemas.microsoft.com/office/word/2024/wordml/sdtformatlock" xmlns:w16se="http://schemas.microsoft.com/office/word/2015/wordml/symex" xmlns:wpg="http://schemas.microsoft.com/office/word/2010/wordprocessingGroup" xmlns:wpi="http://schemas.microsoft.com/office/word/2010/wordprocessingInk" xmlns:wne="http://schemas.microsoft.com/office/word/2006/wordml" xmlns:wps="http://schemas.microsoft.com/office/word/2010/wordprocessingShape" mc:Ignorable="w14 w15 w16se w16cid w16 w16cex w16sdtdh w16sdtfl w16du wp14">
   <w:body>
     <w:p>
       <w:r>
@@ -371,49 +371,7 @@
                                       <w14:round/>
                                     </w14:textOutline>
                                   </w:rPr>
-                                  <w:t xml:space="preserve">Phase 2 (Final </w:t>
-                                </w:r>
-                                <w:proofErr w:type="gramStart"/>
-                                <w:r>
-                                  <w:rPr>
-                                    <w:b w:val="0"/>
-                                    <w:bCs w:val="0"/>
-                                    <w:color w:val="0070C0"/>
-                                    <w:sz w:val="28"/>
-                                    <w:szCs w:val="28"/>
-                                    <w14:shadow w14:blurRad="38100" w14:dist="19050" w14:dir="2700000" w14:sx="100000" w14:sy="100000" w14:kx="0" w14:ky="0" w14:algn="tl">
-                                      <w14:schemeClr w14:val="dk1">
-                                        <w14:alpha w14:val="60000"/>
-                                      </w14:schemeClr>
-                                    </w14:shadow>
-                                    <w14:textOutline w14:w="0" w14:cap="flat" w14:cmpd="sng" w14:algn="ctr">
-                                      <w14:noFill/>
-                                      <w14:prstDash w14:val="solid"/>
-                                      <w14:round/>
-                                    </w14:textOutline>
-                                  </w:rPr>
-                                  <w:t>project  Report</w:t>
-                                </w:r>
-                                <w:proofErr w:type="gramEnd"/>
-                                <w:r>
-                                  <w:rPr>
-                                    <w:b w:val="0"/>
-                                    <w:bCs w:val="0"/>
-                                    <w:color w:val="0070C0"/>
-                                    <w:sz w:val="28"/>
-                                    <w:szCs w:val="28"/>
-                                    <w14:shadow w14:blurRad="38100" w14:dist="19050" w14:dir="2700000" w14:sx="100000" w14:sy="100000" w14:kx="0" w14:ky="0" w14:algn="tl">
-                                      <w14:schemeClr w14:val="dk1">
-                                        <w14:alpha w14:val="60000"/>
-                                      </w14:schemeClr>
-                                    </w14:shadow>
-                                    <w14:textOutline w14:w="0" w14:cap="flat" w14:cmpd="sng" w14:algn="ctr">
-                                      <w14:noFill/>
-                                      <w14:prstDash w14:val="solid"/>
-                                      <w14:round/>
-                                    </w14:textOutline>
-                                  </w:rPr>
-                                  <w:t>)</w:t>
+                                  <w:t>Phase 2 (Final project  Report)</w:t>
                                 </w:r>
                                 <w:r>
                                   <w:rPr>
@@ -604,13 +562,13 @@
               </wp:anchor>
             </w:drawing>
           </mc:Choice>
-          <mc:Fallback>
+          <mc:Fallback xmlns:w16cei="http://schemas.microsoft.com/office/word/2026/wordml/cei">
             <w:pict>
               <v:shapetype w14:anchorId="31BDEDF3" id="_x0000_t202" coordsize="21600,21600" o:spt="202" path="m,l,21600r21600,l21600,xe">
                 <v:stroke joinstyle="miter"/>
                 <v:path gradientshapeok="t" o:connecttype="rect"/>
               </v:shapetype>
-              <v:shape id="Text Box 14" o:spid="_x0000_s1026" type="#_x0000_t202" alt="Report title" style="position:absolute;margin-left:36.5pt;margin-top:90.15pt;width:540pt;height:141.5pt;z-index:-251641856;visibility:visible;mso-wrap-style:square;mso-width-percent:0;mso-height-percent:0;mso-wrap-distance-left:9pt;mso-wrap-distance-top:0;mso-wrap-distance-right:9pt;mso-wrap-distance-bottom:0;mso-position-horizontal:absolute;mso-position-horizontal-relative:page;mso-position-vertical:absolute;mso-position-vertical-relative:margin;mso-width-percent:0;mso-height-percent:0;mso-width-relative:margin;mso-height-relative:margin;v-text-anchor:bottom" o:gfxdata="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" o:allowoverlap="f" filled="f" stroked="f">
+              <v:shape id="Text Box 14" o:spid="_x0000_s1026" type="#_x0000_t202" alt="Report title" style="position:absolute;margin-left:36.5pt;margin-top:90.15pt;width:540pt;height:141.5pt;z-index:-251641856;visibility:visible;mso-wrap-style:square;mso-width-percent:0;mso-height-percent:0;mso-wrap-distance-left:9pt;mso-wrap-distance-top:0;mso-wrap-distance-right:9pt;mso-wrap-distance-bottom:0;mso-position-horizontal:absolute;mso-position-horizontal-relative:page;mso-position-vertical:absolute;mso-position-vertical-relative:margin;mso-width-percent:0;mso-height-percent:0;mso-width-relative:margin;mso-height-relative:margin;v-text-anchor:bottom" o:gfxdata="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" o:allowoverlap="f" filled="f" stroked="f">
                 <v:textbox inset="0,0,0,0">
                   <w:txbxContent>
                     <w:sdt>
@@ -1309,9 +1267,9 @@
               </wp:anchor>
             </w:drawing>
           </mc:Choice>
-          <mc:Fallback>
+          <mc:Fallback xmlns:w16cei="http://schemas.microsoft.com/office/word/2026/wordml/cei">
             <w:pict>
-              <v:shape w14:anchorId="6466823C" id="Text Box 2" o:spid="_x0000_s1027" type="#_x0000_t202" style="position:absolute;margin-left:40.3pt;margin-top:4.65pt;width:545.45pt;height:87.55pt;z-index:251679744;visibility:visible;mso-wrap-style:square;mso-width-percent:0;mso-height-percent:0;mso-wrap-distance-left:9pt;mso-wrap-distance-top:7.2pt;mso-wrap-distance-right:9pt;mso-wrap-distance-bottom:7.2pt;mso-position-horizontal:absolute;mso-position-horizontal-relative:page;mso-position-vertical:absolute;mso-position-vertical-relative:text;mso-width-percent:0;mso-height-percent:0;mso-width-relative:margin;mso-height-relative:margin;v-text-anchor:top" o:gfxdata="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" filled="f" stroked="f">
+              <v:shape w14:anchorId="6466823C" id="Text Box 2" o:spid="_x0000_s1027" type="#_x0000_t202" style="position:absolute;margin-left:40.3pt;margin-top:4.65pt;width:545.45pt;height:87.55pt;z-index:251679744;visibility:visible;mso-wrap-style:square;mso-width-percent:0;mso-height-percent:0;mso-wrap-distance-left:9pt;mso-wrap-distance-top:7.2pt;mso-wrap-distance-right:9pt;mso-wrap-distance-bottom:7.2pt;mso-position-horizontal:absolute;mso-position-horizontal-relative:page;mso-position-vertical:absolute;mso-position-vertical-relative:text;mso-width-percent:0;mso-height-percent:0;mso-width-relative:margin;mso-height-relative:margin;v-text-anchor:top" o:gfxdata="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" filled="f" stroked="f">
                 <v:textbox>
                   <w:txbxContent>
                     <w:p>
@@ -2014,10 +1972,10 @@
                   </wp:anchor>
                 </w:drawing>
               </mc:Choice>
-              <mc:Fallback>
+              <mc:Fallback xmlns:w16cei="http://schemas.microsoft.com/office/word/2026/wordml/cei">
                 <w:pict>
-                  <v:group w14:anchorId="31857F9A" id="Group 198" o:spid="_x0000_s1028" style="position:absolute;margin-left:-101.8pt;margin-top:331.65pt;width:518.25pt;height:308.6pt;z-index:251677696;mso-wrap-distance-left:14.4pt;mso-wrap-distance-top:3.6pt;mso-wrap-distance-right:14.4pt;mso-wrap-distance-bottom:3.6pt;mso-position-horizontal-relative:margin;mso-position-vertical-relative:margin;mso-width-relative:margin;mso-height-relative:margin" coordorigin=",228" coordsize="35784,21867" o:gfxdata="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">
-                    <v:rect id="Rectangle 199" o:spid="_x0000_s1029" style="position:absolute;top:228;width:35674;height:1949;visibility:visible;mso-wrap-style:square;v-text-anchor:middle" o:gfxdata="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" fillcolor="#ef4623 [3204]" stroked="f" strokeweight="2pt">
+                  <v:group w14:anchorId="31857F9A" id="Group 198" o:spid="_x0000_s1028" style="position:absolute;margin-left:-101.8pt;margin-top:331.65pt;width:518.25pt;height:308.6pt;z-index:251677696;mso-wrap-distance-left:14.4pt;mso-wrap-distance-top:3.6pt;mso-wrap-distance-right:14.4pt;mso-wrap-distance-bottom:3.6pt;mso-position-horizontal-relative:margin;mso-position-vertical-relative:margin;mso-width-relative:margin;mso-height-relative:margin" coordorigin=",228" coordsize="35784,21867" o:gfxdata="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">
+                    <v:rect id="Rectangle 199" o:spid="_x0000_s1029" style="position:absolute;top:228;width:35674;height:1949;visibility:visible;mso-wrap-style:square;v-text-anchor:middle" o:gfxdata="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" fillcolor="#ef4623 [3204]" stroked="f" strokeweight="2pt">
                       <v:textbox>
                         <w:txbxContent>
                           <w:p>
@@ -2046,7 +2004,7 @@
                         </w:txbxContent>
                       </v:textbox>
                     </v:rect>
-                    <v:shape id="Text Box 200" o:spid="_x0000_s1030" type="#_x0000_t202" style="position:absolute;top:2187;width:35784;height:19908;visibility:visible;mso-wrap-style:square;v-text-anchor:top" o:gfxdata="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" filled="f" stroked="f" strokeweight=".5pt">
+                    <v:shape id="Text Box 200" o:spid="_x0000_s1030" type="#_x0000_t202" style="position:absolute;top:2187;width:35784;height:19908;visibility:visible;mso-wrap-style:square;v-text-anchor:top" o:gfxdata="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" filled="f" stroked="f" strokeweight=".5pt">
                       <v:textbox inset=",7.2pt,,0">
                         <w:txbxContent>
                           <w:p>
@@ -2654,27 +2612,7 @@
                                           <w:sz w:val="28"/>
                                           <w:szCs w:val="28"/>
                                         </w:rPr>
-                                        <w:t xml:space="preserve">Bushra </w:t>
-                                      </w:r>
-                                      <w:proofErr w:type="spellStart"/>
-                                      <w:r>
-                                        <w:rPr>
-                                          <w:b/>
-                                          <w:bCs/>
-                                          <w:sz w:val="28"/>
-                                          <w:szCs w:val="28"/>
-                                        </w:rPr>
-                                        <w:t>Alshayeb</w:t>
-                                      </w:r>
-                                      <w:proofErr w:type="spellEnd"/>
-                                      <w:r>
-                                        <w:rPr>
-                                          <w:b/>
-                                          <w:bCs/>
-                                          <w:sz w:val="28"/>
-                                          <w:szCs w:val="28"/>
-                                        </w:rPr>
-                                        <w:t xml:space="preserve"> </w:t>
+                                        <w:t xml:space="preserve">Bushra Alshayeb </w:t>
                                       </w:r>
                                     </w:p>
                                     <w:p>
@@ -2703,19 +2641,8 @@
                                           <w:sz w:val="28"/>
                                           <w:szCs w:val="28"/>
                                         </w:rPr>
-                                        <w:t xml:space="preserve">Gala </w:t>
+                                        <w:t>Gala Algodah</w:t>
                                       </w:r>
-                                      <w:proofErr w:type="spellStart"/>
-                                      <w:r>
-                                        <w:rPr>
-                                          <w:b/>
-                                          <w:bCs/>
-                                          <w:sz w:val="28"/>
-                                          <w:szCs w:val="28"/>
-                                        </w:rPr>
-                                        <w:t>Algodah</w:t>
-                                      </w:r>
-                                      <w:proofErr w:type="spellEnd"/>
                                     </w:p>
                                     <w:p>
                                       <w:pPr>
@@ -3082,7 +3009,7 @@
                     <v:stroke joinstyle="miter"/>
                     <v:path gradientshapeok="t" o:connecttype="rect"/>
                   </v:shapetype>
-                  <v:shape id="Text Box 15" o:spid="_x0000_s1031" type="#_x0000_t202" alt="contact info" style="position:absolute;margin-left:36.5pt;margin-top:226.65pt;width:540pt;height:114pt;z-index:251675648;visibility:visible;mso-wrap-style:square;mso-width-percent:1282;mso-height-percent:0;mso-wrap-distance-left:9pt;mso-wrap-distance-top:0;mso-wrap-distance-right:9pt;mso-wrap-distance-bottom:0;mso-position-horizontal:absolute;mso-position-horizontal-relative:page;mso-position-vertical:absolute;mso-position-vertical-relative:margin;mso-width-percent:1282;mso-height-percent:0;mso-width-relative:margin;mso-height-relative:margin;v-text-anchor:bottom" o:gfxdata="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" o:allowoverlap="f" filled="f" stroked="f" strokeweight=".5pt">
+                  <v:shape id="Text Box 15" o:spid="_x0000_s1031" type="#_x0000_t202" alt="contact info" style="position:absolute;margin-left:36.5pt;margin-top:226.65pt;width:540pt;height:114pt;z-index:251675648;visibility:visible;mso-wrap-style:square;mso-width-percent:1282;mso-height-percent:0;mso-wrap-distance-left:9pt;mso-wrap-distance-top:0;mso-wrap-distance-right:9pt;mso-wrap-distance-bottom:0;mso-position-horizontal:absolute;mso-position-horizontal-relative:page;mso-position-vertical:absolute;mso-position-vertical-relative:margin;mso-width-percent:1282;mso-height-percent:0;mso-width-relative:margin;mso-height-relative:margin;v-text-anchor:bottom" o:gfxdata="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" o:allowoverlap="f" filled="f" stroked="f" strokeweight=".5pt">
                     <v:textbox inset="0,0,0,0">
                       <w:txbxContent>
                         <w:p>
@@ -3201,27 +3128,7 @@
                                     <w:sz w:val="28"/>
                                     <w:szCs w:val="28"/>
                                   </w:rPr>
-                                  <w:t xml:space="preserve">Bushra </w:t>
-                                </w:r>
-                                <w:proofErr w:type="spellStart"/>
-                                <w:r>
-                                  <w:rPr>
-                                    <w:b/>
-                                    <w:bCs/>
-                                    <w:sz w:val="28"/>
-                                    <w:szCs w:val="28"/>
-                                  </w:rPr>
-                                  <w:t>Alshayeb</w:t>
-                                </w:r>
-                                <w:proofErr w:type="spellEnd"/>
-                                <w:r>
-                                  <w:rPr>
-                                    <w:b/>
-                                    <w:bCs/>
-                                    <w:sz w:val="28"/>
-                                    <w:szCs w:val="28"/>
-                                  </w:rPr>
-                                  <w:t xml:space="preserve"> </w:t>
+                                  <w:t xml:space="preserve">Bushra Alshayeb </w:t>
                                 </w:r>
                               </w:p>
                               <w:p>
@@ -3250,19 +3157,8 @@
                                     <w:sz w:val="28"/>
                                     <w:szCs w:val="28"/>
                                   </w:rPr>
-                                  <w:t xml:space="preserve">Gala </w:t>
+                                  <w:t>Gala Algodah</w:t>
                                 </w:r>
-                                <w:proofErr w:type="spellStart"/>
-                                <w:r>
-                                  <w:rPr>
-                                    <w:b/>
-                                    <w:bCs/>
-                                    <w:sz w:val="28"/>
-                                    <w:szCs w:val="28"/>
-                                  </w:rPr>
-                                  <w:t>Algodah</w:t>
-                                </w:r>
-                                <w:proofErr w:type="spellEnd"/>
                               </w:p>
                               <w:p>
                                 <w:pPr>
@@ -4946,9 +4842,9 @@
               </wp:anchor>
             </w:drawing>
           </mc:Choice>
-          <mc:Fallback>
+          <mc:Fallback xmlns:w16cei="http://schemas.microsoft.com/office/word/2026/wordml/cei">
             <w:pict>
-              <v:shape w14:anchorId="54D30FE5" id="Text Box 5" o:spid="_x0000_s1032" type="#_x0000_t202" alt="Sidebar" style="position:absolute;margin-left:35.8pt;margin-top:-4.85pt;width:98.25pt;height:181.45pt;z-index:251681792;visibility:visible;mso-wrap-style:square;mso-width-percent:250;mso-height-percent:950;mso-wrap-distance-left:14.4pt;mso-wrap-distance-top:0;mso-wrap-distance-right:14.4pt;mso-wrap-distance-bottom:3in;mso-position-horizontal:absolute;mso-position-horizontal-relative:page;mso-position-vertical:absolute;mso-position-vertical-relative:margin;mso-width-percent:250;mso-height-percent:950;mso-width-relative:margin;mso-height-relative:margin;v-text-anchor:top" o:gfxdata="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" filled="f" stroked="f" strokeweight=".5pt">
+              <v:shape w14:anchorId="54D30FE5" id="Text Box 5" o:spid="_x0000_s1032" type="#_x0000_t202" alt="Sidebar" style="position:absolute;margin-left:35.8pt;margin-top:-4.85pt;width:98.25pt;height:181.45pt;z-index:251681792;visibility:visible;mso-wrap-style:square;mso-width-percent:250;mso-height-percent:950;mso-wrap-distance-left:14.4pt;mso-wrap-distance-top:0;mso-wrap-distance-right:14.4pt;mso-wrap-distance-bottom:3in;mso-position-horizontal:absolute;mso-position-horizontal-relative:page;mso-position-vertical:absolute;mso-position-vertical-relative:margin;mso-width-percent:250;mso-height-percent:950;mso-width-relative:margin;mso-height-relative:margin;v-text-anchor:top" o:gfxdata="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" filled="f" stroked="f" strokeweight=".5pt">
                 <v:textbox inset="3.6pt,0,3.6pt,0">
                   <w:txbxContent>
                     <w:p/>
@@ -5109,9 +5005,9 @@
               </wp:anchor>
             </w:drawing>
           </mc:Choice>
-          <mc:Fallback>
+          <mc:Fallback xmlns:w16cei="http://schemas.microsoft.com/office/word/2026/wordml/cei">
             <w:pict>
-              <v:shape w14:anchorId="1D5252A4" id="Text Box 574844441" o:spid="_x0000_s1033" type="#_x0000_t202" alt="Sidebar" style="position:absolute;margin-left:47.8pt;margin-top:7.15pt;width:98.25pt;height:181.45pt;z-index:251689984;visibility:visible;mso-wrap-style:square;mso-width-percent:250;mso-height-percent:950;mso-wrap-distance-left:14.4pt;mso-wrap-distance-top:0;mso-wrap-distance-right:14.4pt;mso-wrap-distance-bottom:3in;mso-position-horizontal:absolute;mso-position-horizontal-relative:page;mso-position-vertical:absolute;mso-position-vertical-relative:margin;mso-width-percent:250;mso-height-percent:950;mso-width-relative:margin;mso-height-relative:margin;v-text-anchor:top" o:gfxdata="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" filled="f" stroked="f" strokeweight=".5pt">
+              <v:shape w14:anchorId="1D5252A4" id="Text Box 574844441" o:spid="_x0000_s1033" type="#_x0000_t202" alt="Sidebar" style="position:absolute;margin-left:47.8pt;margin-top:7.15pt;width:98.25pt;height:181.45pt;z-index:251689984;visibility:visible;mso-wrap-style:square;mso-width-percent:250;mso-height-percent:950;mso-wrap-distance-left:14.4pt;mso-wrap-distance-top:0;mso-wrap-distance-right:14.4pt;mso-wrap-distance-bottom:3in;mso-position-horizontal:absolute;mso-position-horizontal-relative:page;mso-position-vertical:absolute;mso-position-vertical-relative:margin;mso-width-percent:250;mso-height-percent:950;mso-width-relative:margin;mso-height-relative:margin;v-text-anchor:top" o:gfxdata="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" filled="f" stroked="f" strokeweight=".5pt">
                 <v:textbox inset="3.6pt,0,3.6pt,0">
                   <w:txbxContent>
                     <w:p>
@@ -5649,7 +5545,327 @@
         <w:t>Evolutionary Prototyping was selected because it allows the system to be improved step by step based on user feedback. Since the Student Activities Management System includes different features such as browsing activities, registration, notifications, attendance tracking, and activity management, this approach is more suitable. It helps the team understand user needs better, make improvements during development, and reduce the chance of creating a system that does not meet user expectations. </w:t>
       </w:r>
     </w:p>
-    <w:p/>
+    <w:p>
+      <w:pPr>
+        <w:rPr>
+          <w:lang w:val="en-US"/>
+        </w:rPr>
+      </w:pPr>
+    </w:p>
+    <w:p>
+      <w:pPr>
+        <w:rPr>
+          <w:sz w:val="28"/>
+          <w:szCs w:val="28"/>
+        </w:rPr>
+      </w:pPr>
+      <w:r>
+        <w:rPr>
+          <w:b/>
+          <w:bCs/>
+          <w:sz w:val="28"/>
+          <w:szCs w:val="28"/>
+        </w:rPr>
+        <w:t>Low-Fidelity Prototype Screens </w:t>
+      </w:r>
+    </w:p>
+    <w:p>
+      <w:pPr>
+        <w:rPr>
+          <w:lang w:val="en-US"/>
+        </w:rPr>
+      </w:pPr>
+    </w:p>
+    <w:p>
+      <w:pPr>
+        <w:rPr>
+          <w:lang w:val="en-US"/>
+        </w:rPr>
+      </w:pPr>
+    </w:p>
+    <w:p>
+      <w:pPr>
+        <w:rPr>
+          <w:lang w:val="en-US"/>
+        </w:rPr>
+      </w:pPr>
+    </w:p>
+    <w:p>
+      <w:pPr>
+        <w:rPr>
+          <w:lang w:val="en-US"/>
+        </w:rPr>
+      </w:pPr>
+    </w:p>
+    <w:p>
+      <w:pPr>
+        <w:rPr>
+          <w:lang w:val="en-US"/>
+        </w:rPr>
+      </w:pPr>
+    </w:p>
+    <w:p>
+      <w:pPr>
+        <w:rPr>
+          <w:lang w:val="en-US"/>
+        </w:rPr>
+      </w:pPr>
+    </w:p>
+    <w:p>
+      <w:pPr>
+        <w:rPr>
+          <w:lang w:val="en-US"/>
+        </w:rPr>
+      </w:pPr>
+    </w:p>
+    <w:p>
+      <w:pPr>
+        <w:rPr>
+          <w:lang w:val="en-US"/>
+        </w:rPr>
+      </w:pPr>
+    </w:p>
+    <w:p>
+      <w:pPr>
+        <w:rPr>
+          <w:lang w:val="en-US"/>
+        </w:rPr>
+      </w:pPr>
+    </w:p>
+    <w:p>
+      <w:pPr>
+        <w:rPr>
+          <w:lang w:val="en-US"/>
+        </w:rPr>
+      </w:pPr>
+    </w:p>
+    <w:p>
+      <w:pPr>
+        <w:rPr>
+          <w:lang w:val="en-US"/>
+        </w:rPr>
+      </w:pPr>
+    </w:p>
+    <w:p>
+      <w:pPr>
+        <w:rPr>
+          <w:lang w:val="en-US"/>
+        </w:rPr>
+      </w:pPr>
+    </w:p>
+    <w:p>
+      <w:pPr>
+        <w:rPr>
+          <w:lang w:val="en-US"/>
+        </w:rPr>
+      </w:pPr>
+    </w:p>
+    <w:p>
+      <w:pPr>
+        <w:rPr>
+          <w:lang w:val="en-US"/>
+        </w:rPr>
+      </w:pPr>
+    </w:p>
+    <w:p>
+      <w:pPr>
+        <w:rPr>
+          <w:lang w:val="en-US"/>
+        </w:rPr>
+      </w:pPr>
+    </w:p>
+    <w:p>
+      <w:pPr>
+        <w:rPr>
+          <w:lang w:val="en-US"/>
+        </w:rPr>
+      </w:pPr>
+    </w:p>
+    <w:p>
+      <w:pPr>
+        <w:rPr>
+          <w:lang w:val="en-US"/>
+        </w:rPr>
+      </w:pPr>
+    </w:p>
+    <w:p>
+      <w:pPr>
+        <w:rPr>
+          <w:lang w:val="en-US"/>
+        </w:rPr>
+      </w:pPr>
+    </w:p>
+    <w:p>
+      <w:pPr>
+        <w:rPr>
+          <w:lang w:val="en-US"/>
+        </w:rPr>
+      </w:pPr>
+    </w:p>
+    <w:p>
+      <w:pPr>
+        <w:rPr>
+          <w:b/>
+          <w:bCs/>
+          <w:rtl/>
+        </w:rPr>
+      </w:pPr>
+      <w:r>
+        <w:rPr>
+          <w:b/>
+          <w:bCs/>
+        </w:rPr>
+        <w:lastRenderedPageBreak/>
+        <w:t>Screen 1: Home</w:t>
+      </w:r>
+    </w:p>
+    <w:p>
+      <w:pPr>
+        <w:rPr>
+          <w:lang w:val="en-US"/>
+        </w:rPr>
+      </w:pPr>
+      <w:r>
+        <w:rPr>
+          <w:noProof/>
+          <w:lang w:val="en-US"/>
+        </w:rPr>
+        <w:drawing>
+          <wp:inline distT="0" distB="0" distL="0" distR="0" wp14:anchorId="7CE120E1" wp14:editId="7FFF6D56">
+            <wp:extent cx="3648584" cy="6592220"/>
+            <wp:effectExtent l="0" t="0" r="9525" b="0"/>
+            <wp:docPr id="1390823466" name="Picture 12"/>
+            <wp:cNvGraphicFramePr>
+              <a:graphicFrameLocks xmlns:a="http://schemas.openxmlformats.org/drawingml/2006/main" noChangeAspect="1"/>
+            </wp:cNvGraphicFramePr>
+            <a:graphic xmlns:a="http://schemas.openxmlformats.org/drawingml/2006/main">
+              <a:graphicData uri="http://schemas.openxmlformats.org/drawingml/2006/picture">
+                <pic:pic xmlns:pic="http://schemas.openxmlformats.org/drawingml/2006/picture">
+                  <pic:nvPicPr>
+                    <pic:cNvPr id="1390823466" name="Picture 1390823466"/>
+                    <pic:cNvPicPr/>
+                  </pic:nvPicPr>
+                  <pic:blipFill>
+                    <a:blip r:embed="rId16"/>
+                    <a:stretch>
+                      <a:fillRect/>
+                    </a:stretch>
+                  </pic:blipFill>
+                  <pic:spPr>
+                    <a:xfrm>
+                      <a:off x="0" y="0"/>
+                      <a:ext cx="3648584" cy="6592220"/>
+                    </a:xfrm>
+                    <a:prstGeom prst="rect">
+                      <a:avLst/>
+                    </a:prstGeom>
+                  </pic:spPr>
+                </pic:pic>
+              </a:graphicData>
+            </a:graphic>
+          </wp:inline>
+        </w:drawing>
+      </w:r>
+    </w:p>
+    <w:p>
+      <w:pPr>
+        <w:rPr>
+          <w:lang w:val="en-US"/>
+        </w:rPr>
+      </w:pPr>
+    </w:p>
+    <w:p>
+      <w:pPr>
+        <w:rPr>
+          <w:lang w:val="en-US"/>
+        </w:rPr>
+      </w:pPr>
+    </w:p>
+    <w:p>
+      <w:pPr>
+        <w:rPr>
+          <w:lang w:val="en-US"/>
+        </w:rPr>
+      </w:pPr>
+    </w:p>
+    <w:p>
+      <w:pPr>
+        <w:rPr>
+          <w:b/>
+          <w:bCs/>
+        </w:rPr>
+      </w:pPr>
+      <w:r>
+        <w:rPr>
+          <w:b/>
+          <w:bCs/>
+        </w:rPr>
+        <w:lastRenderedPageBreak/>
+        <w:t>Screen 2: My Activitie</w:t>
+      </w:r>
+      <w:r>
+        <w:rPr>
+          <w:b/>
+          <w:bCs/>
+        </w:rPr>
+        <w:t>s</w:t>
+      </w:r>
+    </w:p>
+    <w:p>
+      <w:pPr>
+        <w:rPr>
+          <w:lang w:val="en-US"/>
+        </w:rPr>
+      </w:pPr>
+      <w:r>
+        <w:rPr>
+          <w:noProof/>
+          <w:lang w:val="en-US"/>
+        </w:rPr>
+        <w:drawing>
+          <wp:inline distT="0" distB="0" distL="0" distR="0" wp14:anchorId="69989472" wp14:editId="3D8B5DEE">
+            <wp:extent cx="3115110" cy="6354062"/>
+            <wp:effectExtent l="0" t="0" r="9525" b="8890"/>
+            <wp:docPr id="1151313455" name="Picture 13"/>
+            <wp:cNvGraphicFramePr>
+              <a:graphicFrameLocks xmlns:a="http://schemas.openxmlformats.org/drawingml/2006/main" noChangeAspect="1"/>
+            </wp:cNvGraphicFramePr>
+            <a:graphic xmlns:a="http://schemas.openxmlformats.org/drawingml/2006/main">
+              <a:graphicData uri="http://schemas.openxmlformats.org/drawingml/2006/picture">
+                <pic:pic xmlns:pic="http://schemas.openxmlformats.org/drawingml/2006/picture">
+                  <pic:nvPicPr>
+                    <pic:cNvPr id="1151313455" name="Picture 1151313455"/>
+                    <pic:cNvPicPr/>
+                  </pic:nvPicPr>
+                  <pic:blipFill>
+                    <a:blip r:embed="rId17"/>
+                    <a:stretch>
+                      <a:fillRect/>
+                    </a:stretch>
+                  </pic:blipFill>
+                  <pic:spPr>
+                    <a:xfrm>
+                      <a:off x="0" y="0"/>
+                      <a:ext cx="3115110" cy="6354062"/>
+                    </a:xfrm>
+                    <a:prstGeom prst="rect">
+                      <a:avLst/>
+                    </a:prstGeom>
+                  </pic:spPr>
+                </pic:pic>
+              </a:graphicData>
+            </a:graphic>
+          </wp:inline>
+        </w:drawing>
+      </w:r>
+    </w:p>
+    <w:p>
+      <w:pPr>
+        <w:rPr>
+          <w:lang w:val="en-US"/>
+        </w:rPr>
+      </w:pPr>
+    </w:p>
     <w:p>
       <w:pPr>
         <w:pStyle w:val="Heading1"/>
@@ -5696,21 +5912,12 @@
           <w:szCs w:val="24"/>
         </w:rPr>
       </w:pPr>
-      <w:proofErr w:type="gramStart"/>
       <w:r>
         <w:rPr>
           <w:sz w:val="24"/>
           <w:szCs w:val="24"/>
         </w:rPr>
-        <w:t>Level-0</w:t>
-      </w:r>
-      <w:proofErr w:type="gramEnd"/>
-      <w:r>
-        <w:rPr>
-          <w:sz w:val="24"/>
-          <w:szCs w:val="24"/>
-        </w:rPr>
-        <w:t xml:space="preserve"> DFD</w:t>
+        <w:t>Level-0 DFD</w:t>
       </w:r>
     </w:p>
     <w:p>
@@ -5737,23 +5944,7 @@
           <w:sz w:val="24"/>
           <w:szCs w:val="24"/>
         </w:rPr>
-        <w:t xml:space="preserve"> </w:t>
-      </w:r>
-      <w:proofErr w:type="gramStart"/>
-      <w:r>
-        <w:rPr>
-          <w:sz w:val="24"/>
-          <w:szCs w:val="24"/>
-        </w:rPr>
-        <w:t>Level-1</w:t>
-      </w:r>
-      <w:proofErr w:type="gramEnd"/>
-      <w:r>
-        <w:rPr>
-          <w:sz w:val="24"/>
-          <w:szCs w:val="24"/>
-        </w:rPr>
-        <w:t xml:space="preserve"> DFD for </w:t>
+        <w:t xml:space="preserve"> Level-1 DFD for </w:t>
       </w:r>
       <w:r>
         <w:rPr>
@@ -5839,7 +6030,7 @@
                     <pic:cNvPicPr/>
                   </pic:nvPicPr>
                   <pic:blipFill>
-                    <a:blip r:embed="rId16"/>
+                    <a:blip r:embed="rId18"/>
                     <a:stretch>
                       <a:fillRect/>
                     </a:stretch>
@@ -5898,7 +6089,7 @@
                     <pic:cNvPicPr/>
                   </pic:nvPicPr>
                   <pic:blipFill>
-                    <a:blip r:embed="rId17"/>
+                    <a:blip r:embed="rId19"/>
                     <a:stretch>
                       <a:fillRect/>
                     </a:stretch>
@@ -5960,7 +6151,7 @@
                     <pic:cNvPicPr/>
                   </pic:nvPicPr>
                   <pic:blipFill>
-                    <a:blip r:embed="rId18"/>
+                    <a:blip r:embed="rId20"/>
                     <a:stretch>
                       <a:fillRect/>
                     </a:stretch>
@@ -6014,7 +6205,7 @@
                     <pic:cNvPicPr/>
                   </pic:nvPicPr>
                   <pic:blipFill>
-                    <a:blip r:embed="rId19"/>
+                    <a:blip r:embed="rId21"/>
                     <a:stretch>
                       <a:fillRect/>
                     </a:stretch>
@@ -6075,7 +6266,7 @@
                     <pic:cNvPicPr/>
                   </pic:nvPicPr>
                   <pic:blipFill>
-                    <a:blip r:embed="rId20"/>
+                    <a:blip r:embed="rId22"/>
                     <a:stretch>
                       <a:fillRect/>
                     </a:stretch>
@@ -6444,7 +6635,7 @@
     </w:p>
     <w:p/>
     <w:sectPr>
-      <w:headerReference w:type="default" r:id="rId21"/>
+      <w:headerReference w:type="default" r:id="rId23"/>
       <w:pgSz w:w="12240" w:h="15840" w:code="1"/>
       <w:pgMar w:top="1080" w:right="720" w:bottom="2160" w:left="3096" w:header="1080" w:footer="720" w:gutter="0"/>
       <w:pgNumType w:start="1"/>
@@ -6456,7 +6647,7 @@
 </file>
 
 <file path=word/endnotes.xml><?xml version="1.0" encoding="utf-8"?>
-<w:endnotes xmlns:wpc="http://schemas.microsoft.com/office/word/2010/wordprocessingCanvas" xmlns:cx="http://schemas.microsoft.com/office/drawing/2014/chartex" xmlns:cx1="http://schemas.microsoft.com/office/drawing/2015/9/8/chartex" xmlns:cx2="http://schemas.microsoft.com/office/drawing/2015/10/21/chartex" xmlns:cx3="http://schemas.microsoft.com/office/drawing/2016/5/9/chartex" xmlns:cx4="http://schemas.microsoft.com/office/drawing/2016/5/10/chartex" xmlns:cx5="http://schemas.microsoft.com/office/drawing/2016/5/11/chartex" xmlns:cx6="http://schemas.microsoft.com/office/drawing/2016/5/12/chartex" xmlns:cx7="http://schemas.microsoft.com/office/drawing/2016/5/13/chartex" xmlns:cx8="http://schemas.microsoft.com/office/drawing/2016/5/14/chartex" xmlns:mc="http://schemas.openxmlformats.org/markup-compatibility/2006" xmlns:m="http://schemas.openxmlformats.org/officeDocument/2006/math" xmlns:aink="http://schemas.microsoft.com/office/drawing/2016/ink" xmlns:am3d="http://schemas.microsoft.com/office/drawing/2017/model3d" xmlns:oel="http://schemas.microsoft.com/office/2019/extlst" xmlns:r="http://schemas.openxmlformats.org/officeDocument/2006/relationships" xmlns:wp14="http://schemas.microsoft.com/office/word/2010/wordprocessingDrawing" xmlns:wp="http://schemas.openxmlformats.org/drawingml/2006/wordprocessingDrawing" xmlns:wpg="http://schemas.microsoft.com/office/word/2010/wordprocessingGroup" xmlns:wpi="http://schemas.microsoft.com/office/word/2010/wordprocessingInk" xmlns:wps="http://schemas.microsoft.com/office/word/2010/wordprocessingShape" xmlns:o="urn:schemas-microsoft-com:office:office" xmlns:v="urn:schemas-microsoft-com:vml" xmlns:w10="urn:schemas-microsoft-com:office:word" xmlns:w="http://schemas.openxmlformats.org/wordprocessingml/2006/main" xmlns:w14="http://schemas.microsoft.com/office/word/2010/wordml" xmlns:w15="http://schemas.microsoft.com/office/word/2012/wordml" xmlns:w16cei="http://schemas.microsoft.com/office/word/2026/wordml/cei" xmlns:w16cex="http://schemas.microsoft.com/office/word/2018/wordml/cex" xmlns:w16cid="http://schemas.microsoft.com/office/word/2016/wordml/cid" xmlns:w16="http://schemas.microsoft.com/office/word/2018/wordml" xmlns:w16sdtdh="http://schemas.microsoft.com/office/word/2020/wordml/sdtdatahash" xmlns:w16sdtfl="http://schemas.microsoft.com/office/word/2024/wordml/sdtformatlock" xmlns:w16se="http://schemas.microsoft.com/office/word/2015/wordml/symex" xmlns:w16du="http://schemas.microsoft.com/office/word/2023/wordml/word16du" xmlns:wne="http://schemas.microsoft.com/office/word/2006/wordml" mc:Ignorable="w14 w15 w16se w16cid w16 w16cex w16sdtdh w16sdtfl w16du wp14">
+<w:endnotes xmlns:wpc="http://schemas.microsoft.com/office/word/2010/wordprocessingCanvas" xmlns:cx="http://schemas.microsoft.com/office/drawing/2014/chartex" xmlns:cx1="http://schemas.microsoft.com/office/drawing/2015/9/8/chartex" xmlns:cx2="http://schemas.microsoft.com/office/drawing/2015/10/21/chartex" xmlns:cx3="http://schemas.microsoft.com/office/drawing/2016/5/9/chartex" xmlns:cx4="http://schemas.microsoft.com/office/drawing/2016/5/10/chartex" xmlns:cx5="http://schemas.microsoft.com/office/drawing/2016/5/11/chartex" xmlns:cx6="http://schemas.microsoft.com/office/drawing/2016/5/12/chartex" xmlns:cx7="http://schemas.microsoft.com/office/drawing/2016/5/13/chartex" xmlns:cx8="http://schemas.microsoft.com/office/drawing/2016/5/14/chartex" xmlns:mc="http://schemas.openxmlformats.org/markup-compatibility/2006" xmlns:aink="http://schemas.microsoft.com/office/drawing/2016/ink" xmlns:am3d="http://schemas.microsoft.com/office/drawing/2017/model3d" xmlns:o="urn:schemas-microsoft-com:office:office" xmlns:oel="http://schemas.microsoft.com/office/2019/extlst" xmlns:r="http://schemas.openxmlformats.org/officeDocument/2006/relationships" xmlns:m="http://schemas.openxmlformats.org/officeDocument/2006/math" xmlns:v="urn:schemas-microsoft-com:vml" xmlns:wp14="http://schemas.microsoft.com/office/word/2010/wordprocessingDrawing" xmlns:wp="http://schemas.openxmlformats.org/drawingml/2006/wordprocessingDrawing" xmlns:w10="urn:schemas-microsoft-com:office:word" xmlns:w="http://schemas.openxmlformats.org/wordprocessingml/2006/main" xmlns:w14="http://schemas.microsoft.com/office/word/2010/wordml" xmlns:w15="http://schemas.microsoft.com/office/word/2012/wordml" xmlns:w16cex="http://schemas.microsoft.com/office/word/2018/wordml/cex" xmlns:w16cid="http://schemas.microsoft.com/office/word/2016/wordml/cid" xmlns:w16="http://schemas.microsoft.com/office/word/2018/wordml" xmlns:w16du="http://schemas.microsoft.com/office/word/2023/wordml/word16du" xmlns:w16sdtdh="http://schemas.microsoft.com/office/word/2020/wordml/sdtdatahash" xmlns:w16sdtfl="http://schemas.microsoft.com/office/word/2024/wordml/sdtformatlock" xmlns:w16se="http://schemas.microsoft.com/office/word/2015/wordml/symex" xmlns:wpg="http://schemas.microsoft.com/office/word/2010/wordprocessingGroup" xmlns:wpi="http://schemas.microsoft.com/office/word/2010/wordprocessingInk" xmlns:wne="http://schemas.microsoft.com/office/word/2006/wordml" xmlns:wps="http://schemas.microsoft.com/office/word/2010/wordprocessingShape" mc:Ignorable="w14 w15 w16se w16cid w16 w16cex w16sdtdh w16sdtfl w16du wp14">
   <w:endnote w:type="separator" w:id="-1">
     <w:p>
       <w:r>
@@ -6479,7 +6670,7 @@
 </file>
 
 <file path=word/footer1.xml><?xml version="1.0" encoding="utf-8"?>
-<w:ftr xmlns:wpc="http://schemas.microsoft.com/office/word/2010/wordprocessingCanvas" xmlns:cx="http://schemas.microsoft.com/office/drawing/2014/chartex" xmlns:cx1="http://schemas.microsoft.com/office/drawing/2015/9/8/chartex" xmlns:cx2="http://schemas.microsoft.com/office/drawing/2015/10/21/chartex" xmlns:cx3="http://schemas.microsoft.com/office/drawing/2016/5/9/chartex" xmlns:cx4="http://schemas.microsoft.com/office/drawing/2016/5/10/chartex" xmlns:cx5="http://schemas.microsoft.com/office/drawing/2016/5/11/chartex" xmlns:cx6="http://schemas.microsoft.com/office/drawing/2016/5/12/chartex" xmlns:cx7="http://schemas.microsoft.com/office/drawing/2016/5/13/chartex" xmlns:cx8="http://schemas.microsoft.com/office/drawing/2016/5/14/chartex" xmlns:mc="http://schemas.openxmlformats.org/markup-compatibility/2006" xmlns:m="http://schemas.openxmlformats.org/officeDocument/2006/math" xmlns:aink="http://schemas.microsoft.com/office/drawing/2016/ink" xmlns:am3d="http://schemas.microsoft.com/office/drawing/2017/model3d" xmlns:oel="http://schemas.microsoft.com/office/2019/extlst" xmlns:r="http://schemas.openxmlformats.org/officeDocument/2006/relationships" xmlns:wp14="http://schemas.microsoft.com/office/word/2010/wordprocessingDrawing" xmlns:wp="http://schemas.openxmlformats.org/drawingml/2006/wordprocessingDrawing" xmlns:wpg="http://schemas.microsoft.com/office/word/2010/wordprocessingGroup" xmlns:wpi="http://schemas.microsoft.com/office/word/2010/wordprocessingInk" xmlns:wps="http://schemas.microsoft.com/office/word/2010/wordprocessingShape" xmlns:o="urn:schemas-microsoft-com:office:office" xmlns:v="urn:schemas-microsoft-com:vml" xmlns:w10="urn:schemas-microsoft-com:office:word" xmlns:w="http://schemas.openxmlformats.org/wordprocessingml/2006/main" xmlns:w14="http://schemas.microsoft.com/office/word/2010/wordml" xmlns:w15="http://schemas.microsoft.com/office/word/2012/wordml" xmlns:w16cei="http://schemas.microsoft.com/office/word/2026/wordml/cei" xmlns:w16cex="http://schemas.microsoft.com/office/word/2018/wordml/cex" xmlns:w16cid="http://schemas.microsoft.com/office/word/2016/wordml/cid" xmlns:w16="http://schemas.microsoft.com/office/word/2018/wordml" xmlns:w16sdtdh="http://schemas.microsoft.com/office/word/2020/wordml/sdtdatahash" xmlns:w16sdtfl="http://schemas.microsoft.com/office/word/2024/wordml/sdtformatlock" xmlns:w16se="http://schemas.microsoft.com/office/word/2015/wordml/symex" xmlns:w16du="http://schemas.microsoft.com/office/word/2023/wordml/word16du" xmlns:wne="http://schemas.microsoft.com/office/word/2006/wordml" mc:Ignorable="w14 w15 w16se w16cid w16 w16cex w16sdtdh w16sdtfl w16du wp14">
+<w:ftr xmlns:wpc="http://schemas.microsoft.com/office/word/2010/wordprocessingCanvas" xmlns:cx="http://schemas.microsoft.com/office/drawing/2014/chartex" xmlns:cx1="http://schemas.microsoft.com/office/drawing/2015/9/8/chartex" xmlns:cx2="http://schemas.microsoft.com/office/drawing/2015/10/21/chartex" xmlns:cx3="http://schemas.microsoft.com/office/drawing/2016/5/9/chartex" xmlns:cx4="http://schemas.microsoft.com/office/drawing/2016/5/10/chartex" xmlns:cx5="http://schemas.microsoft.com/office/drawing/2016/5/11/chartex" xmlns:cx6="http://schemas.microsoft.com/office/drawing/2016/5/12/chartex" xmlns:cx7="http://schemas.microsoft.com/office/drawing/2016/5/13/chartex" xmlns:cx8="http://schemas.microsoft.com/office/drawing/2016/5/14/chartex" xmlns:mc="http://schemas.openxmlformats.org/markup-compatibility/2006" xmlns:aink="http://schemas.microsoft.com/office/drawing/2016/ink" xmlns:am3d="http://schemas.microsoft.com/office/drawing/2017/model3d" xmlns:o="urn:schemas-microsoft-com:office:office" xmlns:oel="http://schemas.microsoft.com/office/2019/extlst" xmlns:r="http://schemas.openxmlformats.org/officeDocument/2006/relationships" xmlns:m="http://schemas.openxmlformats.org/officeDocument/2006/math" xmlns:v="urn:schemas-microsoft-com:vml" xmlns:wp14="http://schemas.microsoft.com/office/word/2010/wordprocessingDrawing" xmlns:wp="http://schemas.openxmlformats.org/drawingml/2006/wordprocessingDrawing" xmlns:w10="urn:schemas-microsoft-com:office:word" xmlns:w="http://schemas.openxmlformats.org/wordprocessingml/2006/main" xmlns:w14="http://schemas.microsoft.com/office/word/2010/wordml" xmlns:w15="http://schemas.microsoft.com/office/word/2012/wordml" xmlns:w16cex="http://schemas.microsoft.com/office/word/2018/wordml/cex" xmlns:w16cid="http://schemas.microsoft.com/office/word/2016/wordml/cid" xmlns:w16="http://schemas.microsoft.com/office/word/2018/wordml" xmlns:w16du="http://schemas.microsoft.com/office/word/2023/wordml/word16du" xmlns:w16sdtdh="http://schemas.microsoft.com/office/word/2020/wordml/sdtdatahash" xmlns:w16sdtfl="http://schemas.microsoft.com/office/word/2024/wordml/sdtformatlock" xmlns:w16se="http://schemas.microsoft.com/office/word/2015/wordml/symex" xmlns:wpg="http://schemas.microsoft.com/office/word/2010/wordprocessingGroup" xmlns:wpi="http://schemas.microsoft.com/office/word/2010/wordprocessingInk" xmlns:wne="http://schemas.microsoft.com/office/word/2006/wordml" xmlns:wps="http://schemas.microsoft.com/office/word/2010/wordprocessingShape" mc:Ignorable="w14 w15 w16se w16cid w16 w16cex w16sdtdh w16sdtfl w16du wp14">
   <w:p>
     <w:pPr>
       <w:pStyle w:val="Footer"/>
@@ -6578,13 +6769,13 @@
             </wp:anchor>
           </w:drawing>
         </mc:Choice>
-        <mc:Fallback>
+        <mc:Fallback xmlns:w16cei="http://schemas.microsoft.com/office/word/2026/wordml/cei">
           <w:pict>
             <v:shapetype w14:anchorId="1B6FB134" id="_x0000_t202" coordsize="21600,21600" o:spt="202" path="m,l,21600r21600,l21600,xe">
               <v:stroke joinstyle="miter"/>
               <v:path gradientshapeok="t" o:connecttype="rect"/>
             </v:shapetype>
-            <v:shape id="Text Box 9" o:spid="_x0000_s1034" type="#_x0000_t202" alt="Restricted - مقيد " style="position:absolute;left:0;text-align:left;margin-left:0;margin-top:0;width:84.4pt;height:32.1pt;z-index:251663360;visibility:visible;mso-wrap-style:none;mso-wrap-distance-left:0;mso-wrap-distance-top:0;mso-wrap-distance-right:0;mso-wrap-distance-bottom:0;mso-position-horizontal:left;mso-position-horizontal-relative:page;mso-position-vertical:bottom;mso-position-vertical-relative:page;v-text-anchor:bottom" o:gfxdata="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" filled="f" stroked="f">
+            <v:shape id="Text Box 9" o:spid="_x0000_s1034" type="#_x0000_t202" alt="Restricted - مقيد " style="position:absolute;left:0;text-align:left;margin-left:0;margin-top:0;width:84.4pt;height:32.1pt;z-index:251663360;visibility:visible;mso-wrap-style:none;mso-wrap-distance-left:0;mso-wrap-distance-top:0;mso-wrap-distance-right:0;mso-wrap-distance-bottom:0;mso-position-horizontal:left;mso-position-horizontal-relative:page;mso-position-vertical:bottom;mso-position-vertical-relative:page;v-text-anchor:bottom" o:gfxdata="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" filled="f" stroked="f">
               <v:textbox style="mso-fit-shape-to-text:t" inset="20pt,0,0,15pt">
                 <w:txbxContent>
                   <w:p>
@@ -6634,7 +6825,7 @@
 </file>
 
 <file path=word/footer2.xml><?xml version="1.0" encoding="utf-8"?>
-<w:ftr xmlns:wpc="http://schemas.microsoft.com/office/word/2010/wordprocessingCanvas" xmlns:cx="http://schemas.microsoft.com/office/drawing/2014/chartex" xmlns:cx1="http://schemas.microsoft.com/office/drawing/2015/9/8/chartex" xmlns:cx2="http://schemas.microsoft.com/office/drawing/2015/10/21/chartex" xmlns:cx3="http://schemas.microsoft.com/office/drawing/2016/5/9/chartex" xmlns:cx4="http://schemas.microsoft.com/office/drawing/2016/5/10/chartex" xmlns:cx5="http://schemas.microsoft.com/office/drawing/2016/5/11/chartex" xmlns:cx6="http://schemas.microsoft.com/office/drawing/2016/5/12/chartex" xmlns:cx7="http://schemas.microsoft.com/office/drawing/2016/5/13/chartex" xmlns:cx8="http://schemas.microsoft.com/office/drawing/2016/5/14/chartex" xmlns:mc="http://schemas.openxmlformats.org/markup-compatibility/2006" xmlns:m="http://schemas.openxmlformats.org/officeDocument/2006/math" xmlns:aink="http://schemas.microsoft.com/office/drawing/2016/ink" xmlns:am3d="http://schemas.microsoft.com/office/drawing/2017/model3d" xmlns:oel="http://schemas.microsoft.com/office/2019/extlst" xmlns:r="http://schemas.openxmlformats.org/officeDocument/2006/relationships" xmlns:wp14="http://schemas.microsoft.com/office/word/2010/wordprocessingDrawing" xmlns:wp="http://schemas.openxmlformats.org/drawingml/2006/wordprocessingDrawing" xmlns:wpg="http://schemas.microsoft.com/office/word/2010/wordprocessingGroup" xmlns:wpi="http://schemas.microsoft.com/office/word/2010/wordprocessingInk" xmlns:wps="http://schemas.microsoft.com/office/word/2010/wordprocessingShape" xmlns:o="urn:schemas-microsoft-com:office:office" xmlns:v="urn:schemas-microsoft-com:vml" xmlns:w10="urn:schemas-microsoft-com:office:word" xmlns:w="http://schemas.openxmlformats.org/wordprocessingml/2006/main" xmlns:w14="http://schemas.microsoft.com/office/word/2010/wordml" xmlns:w15="http://schemas.microsoft.com/office/word/2012/wordml" xmlns:w16cei="http://schemas.microsoft.com/office/word/2026/wordml/cei" xmlns:w16cex="http://schemas.microsoft.com/office/word/2018/wordml/cex" xmlns:w16cid="http://schemas.microsoft.com/office/word/2016/wordml/cid" xmlns:w16="http://schemas.microsoft.com/office/word/2018/wordml" xmlns:w16sdtdh="http://schemas.microsoft.com/office/word/2020/wordml/sdtdatahash" xmlns:w16sdtfl="http://schemas.microsoft.com/office/word/2024/wordml/sdtformatlock" xmlns:w16se="http://schemas.microsoft.com/office/word/2015/wordml/symex" xmlns:w16du="http://schemas.microsoft.com/office/word/2023/wordml/word16du" xmlns:wne="http://schemas.microsoft.com/office/word/2006/wordml" mc:Ignorable="w14 w15 w16se w16cid w16 w16cex w16sdtdh w16sdtfl w16du wp14">
+<w:ftr xmlns:wpc="http://schemas.microsoft.com/office/word/2010/wordprocessingCanvas" xmlns:cx="http://schemas.microsoft.com/office/drawing/2014/chartex" xmlns:cx1="http://schemas.microsoft.com/office/drawing/2015/9/8/chartex" xmlns:cx2="http://schemas.microsoft.com/office/drawing/2015/10/21/chartex" xmlns:cx3="http://schemas.microsoft.com/office/drawing/2016/5/9/chartex" xmlns:cx4="http://schemas.microsoft.com/office/drawing/2016/5/10/chartex" xmlns:cx5="http://schemas.microsoft.com/office/drawing/2016/5/11/chartex" xmlns:cx6="http://schemas.microsoft.com/office/drawing/2016/5/12/chartex" xmlns:cx7="http://schemas.microsoft.com/office/drawing/2016/5/13/chartex" xmlns:cx8="http://schemas.microsoft.com/office/drawing/2016/5/14/chartex" xmlns:mc="http://schemas.openxmlformats.org/markup-compatibility/2006" xmlns:aink="http://schemas.microsoft.com/office/drawing/2016/ink" xmlns:am3d="http://schemas.microsoft.com/office/drawing/2017/model3d" xmlns:o="urn:schemas-microsoft-com:office:office" xmlns:oel="http://schemas.microsoft.com/office/2019/extlst" xmlns:r="http://schemas.openxmlformats.org/officeDocument/2006/relationships" xmlns:m="http://schemas.openxmlformats.org/officeDocument/2006/math" xmlns:v="urn:schemas-microsoft-com:vml" xmlns:wp14="http://schemas.microsoft.com/office/word/2010/wordprocessingDrawing" xmlns:wp="http://schemas.openxmlformats.org/drawingml/2006/wordprocessingDrawing" xmlns:w10="urn:schemas-microsoft-com:office:word" xmlns:w="http://schemas.openxmlformats.org/wordprocessingml/2006/main" xmlns:w14="http://schemas.microsoft.com/office/word/2010/wordml" xmlns:w15="http://schemas.microsoft.com/office/word/2012/wordml" xmlns:w16cex="http://schemas.microsoft.com/office/word/2018/wordml/cex" xmlns:w16cid="http://schemas.microsoft.com/office/word/2016/wordml/cid" xmlns:w16="http://schemas.microsoft.com/office/word/2018/wordml" xmlns:w16du="http://schemas.microsoft.com/office/word/2023/wordml/word16du" xmlns:w16sdtdh="http://schemas.microsoft.com/office/word/2020/wordml/sdtdatahash" xmlns:w16sdtfl="http://schemas.microsoft.com/office/word/2024/wordml/sdtformatlock" xmlns:w16se="http://schemas.microsoft.com/office/word/2015/wordml/symex" xmlns:wpg="http://schemas.microsoft.com/office/word/2010/wordprocessingGroup" xmlns:wpi="http://schemas.microsoft.com/office/word/2010/wordprocessingInk" xmlns:wne="http://schemas.microsoft.com/office/word/2006/wordml" xmlns:wps="http://schemas.microsoft.com/office/word/2010/wordprocessingShape" mc:Ignorable="w14 w15 w16se w16cid w16 w16cex w16sdtdh w16sdtfl w16du wp14">
   <w:p>
     <w:pPr>
       <w:pStyle w:val="Footer"/>
@@ -6733,13 +6924,13 @@
             </wp:anchor>
           </w:drawing>
         </mc:Choice>
-        <mc:Fallback>
+        <mc:Fallback xmlns:w16cei="http://schemas.microsoft.com/office/word/2026/wordml/cei">
           <w:pict>
             <v:shapetype w14:anchorId="5602C1D6" id="_x0000_t202" coordsize="21600,21600" o:spt="202" path="m,l,21600r21600,l21600,xe">
               <v:stroke joinstyle="miter"/>
               <v:path gradientshapeok="t" o:connecttype="rect"/>
             </v:shapetype>
-            <v:shape id="Text Box 10" o:spid="_x0000_s1035" type="#_x0000_t202" alt="Restricted - مقيد " style="position:absolute;left:0;text-align:left;margin-left:0;margin-top:0;width:84.4pt;height:32.1pt;z-index:251664384;visibility:visible;mso-wrap-style:none;mso-wrap-distance-left:0;mso-wrap-distance-top:0;mso-wrap-distance-right:0;mso-wrap-distance-bottom:0;mso-position-horizontal:left;mso-position-horizontal-relative:page;mso-position-vertical:bottom;mso-position-vertical-relative:page;v-text-anchor:bottom" o:gfxdata="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" filled="f" stroked="f">
+            <v:shape id="Text Box 10" o:spid="_x0000_s1035" type="#_x0000_t202" alt="Restricted - مقيد " style="position:absolute;left:0;text-align:left;margin-left:0;margin-top:0;width:84.4pt;height:32.1pt;z-index:251664384;visibility:visible;mso-wrap-style:none;mso-wrap-distance-left:0;mso-wrap-distance-top:0;mso-wrap-distance-right:0;mso-wrap-distance-bottom:0;mso-position-horizontal:left;mso-position-horizontal-relative:page;mso-position-vertical:bottom;mso-position-vertical-relative:page;v-text-anchor:bottom" o:gfxdata="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" filled="f" stroked="f">
               <v:textbox style="mso-fit-shape-to-text:t" inset="20pt,0,0,15pt">
                 <w:txbxContent>
                   <w:p>
@@ -6789,7 +6980,7 @@
 </file>
 
 <file path=word/footer3.xml><?xml version="1.0" encoding="utf-8"?>
-<w:ftr xmlns:wpc="http://schemas.microsoft.com/office/word/2010/wordprocessingCanvas" xmlns:cx="http://schemas.microsoft.com/office/drawing/2014/chartex" xmlns:cx1="http://schemas.microsoft.com/office/drawing/2015/9/8/chartex" xmlns:cx2="http://schemas.microsoft.com/office/drawing/2015/10/21/chartex" xmlns:cx3="http://schemas.microsoft.com/office/drawing/2016/5/9/chartex" xmlns:cx4="http://schemas.microsoft.com/office/drawing/2016/5/10/chartex" xmlns:cx5="http://schemas.microsoft.com/office/drawing/2016/5/11/chartex" xmlns:cx6="http://schemas.microsoft.com/office/drawing/2016/5/12/chartex" xmlns:cx7="http://schemas.microsoft.com/office/drawing/2016/5/13/chartex" xmlns:cx8="http://schemas.microsoft.com/office/drawing/2016/5/14/chartex" xmlns:mc="http://schemas.openxmlformats.org/markup-compatibility/2006" xmlns:m="http://schemas.openxmlformats.org/officeDocument/2006/math" xmlns:aink="http://schemas.microsoft.com/office/drawing/2016/ink" xmlns:am3d="http://schemas.microsoft.com/office/drawing/2017/model3d" xmlns:oel="http://schemas.microsoft.com/office/2019/extlst" xmlns:r="http://schemas.openxmlformats.org/officeDocument/2006/relationships" xmlns:wp14="http://schemas.microsoft.com/office/word/2010/wordprocessingDrawing" xmlns:wp="http://schemas.openxmlformats.org/drawingml/2006/wordprocessingDrawing" xmlns:wpg="http://schemas.microsoft.com/office/word/2010/wordprocessingGroup" xmlns:wpi="http://schemas.microsoft.com/office/word/2010/wordprocessingInk" xmlns:wps="http://schemas.microsoft.com/office/word/2010/wordprocessingShape" xmlns:o="urn:schemas-microsoft-com:office:office" xmlns:v="urn:schemas-microsoft-com:vml" xmlns:w10="urn:schemas-microsoft-com:office:word" xmlns:w="http://schemas.openxmlformats.org/wordprocessingml/2006/main" xmlns:w14="http://schemas.microsoft.com/office/word/2010/wordml" xmlns:w15="http://schemas.microsoft.com/office/word/2012/wordml" xmlns:w16cei="http://schemas.microsoft.com/office/word/2026/wordml/cei" xmlns:w16cex="http://schemas.microsoft.com/office/word/2018/wordml/cex" xmlns:w16cid="http://schemas.microsoft.com/office/word/2016/wordml/cid" xmlns:w16="http://schemas.microsoft.com/office/word/2018/wordml" xmlns:w16sdtdh="http://schemas.microsoft.com/office/word/2020/wordml/sdtdatahash" xmlns:w16sdtfl="http://schemas.microsoft.com/office/word/2024/wordml/sdtformatlock" xmlns:w16se="http://schemas.microsoft.com/office/word/2015/wordml/symex" xmlns:w16du="http://schemas.microsoft.com/office/word/2023/wordml/word16du" xmlns:wne="http://schemas.microsoft.com/office/word/2006/wordml" mc:Ignorable="w14 w15 w16se w16cid w16 w16cex w16sdtdh w16sdtfl w16du wp14">
+<w:ftr xmlns:wpc="http://schemas.microsoft.com/office/word/2010/wordprocessingCanvas" xmlns:cx="http://schemas.microsoft.com/office/drawing/2014/chartex" xmlns:cx1="http://schemas.microsoft.com/office/drawing/2015/9/8/chartex" xmlns:cx2="http://schemas.microsoft.com/office/drawing/2015/10/21/chartex" xmlns:cx3="http://schemas.microsoft.com/office/drawing/2016/5/9/chartex" xmlns:cx4="http://schemas.microsoft.com/office/drawing/2016/5/10/chartex" xmlns:cx5="http://schemas.microsoft.com/office/drawing/2016/5/11/chartex" xmlns:cx6="http://schemas.microsoft.com/office/drawing/2016/5/12/chartex" xmlns:cx7="http://schemas.microsoft.com/office/drawing/2016/5/13/chartex" xmlns:cx8="http://schemas.microsoft.com/office/drawing/2016/5/14/chartex" xmlns:mc="http://schemas.openxmlformats.org/markup-compatibility/2006" xmlns:aink="http://schemas.microsoft.com/office/drawing/2016/ink" xmlns:am3d="http://schemas.microsoft.com/office/drawing/2017/model3d" xmlns:o="urn:schemas-microsoft-com:office:office" xmlns:oel="http://schemas.microsoft.com/office/2019/extlst" xmlns:r="http://schemas.openxmlformats.org/officeDocument/2006/relationships" xmlns:m="http://schemas.openxmlformats.org/officeDocument/2006/math" xmlns:v="urn:schemas-microsoft-com:vml" xmlns:wp14="http://schemas.microsoft.com/office/word/2010/wordprocessingDrawing" xmlns:wp="http://schemas.openxmlformats.org/drawingml/2006/wordprocessingDrawing" xmlns:w10="urn:schemas-microsoft-com:office:word" xmlns:w="http://schemas.openxmlformats.org/wordprocessingml/2006/main" xmlns:w14="http://schemas.microsoft.com/office/word/2010/wordml" xmlns:w15="http://schemas.microsoft.com/office/word/2012/wordml" xmlns:w16cex="http://schemas.microsoft.com/office/word/2018/wordml/cex" xmlns:w16cid="http://schemas.microsoft.com/office/word/2016/wordml/cid" xmlns:w16="http://schemas.microsoft.com/office/word/2018/wordml" xmlns:w16du="http://schemas.microsoft.com/office/word/2023/wordml/word16du" xmlns:w16sdtdh="http://schemas.microsoft.com/office/word/2020/wordml/sdtdatahash" xmlns:w16sdtfl="http://schemas.microsoft.com/office/word/2024/wordml/sdtformatlock" xmlns:w16se="http://schemas.microsoft.com/office/word/2015/wordml/symex" xmlns:wpg="http://schemas.microsoft.com/office/word/2010/wordprocessingGroup" xmlns:wpi="http://schemas.microsoft.com/office/word/2010/wordprocessingInk" xmlns:wne="http://schemas.microsoft.com/office/word/2006/wordml" xmlns:wps="http://schemas.microsoft.com/office/word/2010/wordprocessingShape" mc:Ignorable="w14 w15 w16se w16cid w16 w16cex w16sdtdh w16sdtfl w16du wp14">
   <w:p>
     <w:pPr>
       <w:pStyle w:val="Footer"/>
@@ -6888,13 +7079,13 @@
             </wp:anchor>
           </w:drawing>
         </mc:Choice>
-        <mc:Fallback>
+        <mc:Fallback xmlns:w16cei="http://schemas.microsoft.com/office/word/2026/wordml/cei">
           <w:pict>
             <v:shapetype w14:anchorId="30AB902B" id="_x0000_t202" coordsize="21600,21600" o:spt="202" path="m,l,21600r21600,l21600,xe">
               <v:stroke joinstyle="miter"/>
               <v:path gradientshapeok="t" o:connecttype="rect"/>
             </v:shapetype>
-            <v:shape id="Text Box 8" o:spid="_x0000_s1036" type="#_x0000_t202" alt="Restricted - مقيد " style="position:absolute;left:0;text-align:left;margin-left:0;margin-top:0;width:84.4pt;height:32.1pt;z-index:251662336;visibility:visible;mso-wrap-style:none;mso-wrap-distance-left:0;mso-wrap-distance-top:0;mso-wrap-distance-right:0;mso-wrap-distance-bottom:0;mso-position-horizontal:left;mso-position-horizontal-relative:page;mso-position-vertical:bottom;mso-position-vertical-relative:page;v-text-anchor:bottom" o:gfxdata="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" filled="f" stroked="f">
+            <v:shape id="Text Box 8" o:spid="_x0000_s1036" type="#_x0000_t202" alt="Restricted - مقيد " style="position:absolute;left:0;text-align:left;margin-left:0;margin-top:0;width:84.4pt;height:32.1pt;z-index:251662336;visibility:visible;mso-wrap-style:none;mso-wrap-distance-left:0;mso-wrap-distance-top:0;mso-wrap-distance-right:0;mso-wrap-distance-bottom:0;mso-position-horizontal:left;mso-position-horizontal-relative:page;mso-position-vertical:bottom;mso-position-vertical-relative:page;v-text-anchor:bottom" o:gfxdata="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" filled="f" stroked="f">
               <v:textbox style="mso-fit-shape-to-text:t" inset="20pt,0,0,15pt">
                 <w:txbxContent>
                   <w:p>
@@ -6944,7 +7135,7 @@
 </file>
 
 <file path=word/footnotes.xml><?xml version="1.0" encoding="utf-8"?>
-<w:footnotes xmlns:wpc="http://schemas.microsoft.com/office/word/2010/wordprocessingCanvas" xmlns:cx="http://schemas.microsoft.com/office/drawing/2014/chartex" xmlns:cx1="http://schemas.microsoft.com/office/drawing/2015/9/8/chartex" xmlns:cx2="http://schemas.microsoft.com/office/drawing/2015/10/21/chartex" xmlns:cx3="http://schemas.microsoft.com/office/drawing/2016/5/9/chartex" xmlns:cx4="http://schemas.microsoft.com/office/drawing/2016/5/10/chartex" xmlns:cx5="http://schemas.microsoft.com/office/drawing/2016/5/11/chartex" xmlns:cx6="http://schemas.microsoft.com/office/drawing/2016/5/12/chartex" xmlns:cx7="http://schemas.microsoft.com/office/drawing/2016/5/13/chartex" xmlns:cx8="http://schemas.microsoft.com/office/drawing/2016/5/14/chartex" xmlns:mc="http://schemas.openxmlformats.org/markup-compatibility/2006" xmlns:m="http://schemas.openxmlformats.org/officeDocument/2006/math" xmlns:aink="http://schemas.microsoft.com/office/drawing/2016/ink" xmlns:am3d="http://schemas.microsoft.com/office/drawing/2017/model3d" xmlns:oel="http://schemas.microsoft.com/office/2019/extlst" xmlns:r="http://schemas.openxmlformats.org/officeDocument/2006/relationships" xmlns:wp14="http://schemas.microsoft.com/office/word/2010/wordprocessingDrawing" xmlns:wp="http://schemas.openxmlformats.org/drawingml/2006/wordprocessingDrawing" xmlns:wpg="http://schemas.microsoft.com/office/word/2010/wordprocessingGroup" xmlns:wpi="http://schemas.microsoft.com/office/word/2010/wordprocessingInk" xmlns:wps="http://schemas.microsoft.com/office/word/2010/wordprocessingShape" xmlns:o="urn:schemas-microsoft-com:office:office" xmlns:v="urn:schemas-microsoft-com:vml" xmlns:w10="urn:schemas-microsoft-com:office:word" xmlns:w="http://schemas.openxmlformats.org/wordprocessingml/2006/main" xmlns:w14="http://schemas.microsoft.com/office/word/2010/wordml" xmlns:w15="http://schemas.microsoft.com/office/word/2012/wordml" xmlns:w16cei="http://schemas.microsoft.com/office/word/2026/wordml/cei" xmlns:w16cex="http://schemas.microsoft.com/office/word/2018/wordml/cex" xmlns:w16cid="http://schemas.microsoft.com/office/word/2016/wordml/cid" xmlns:w16="http://schemas.microsoft.com/office/word/2018/wordml" xmlns:w16sdtdh="http://schemas.microsoft.com/office/word/2020/wordml/sdtdatahash" xmlns:w16sdtfl="http://schemas.microsoft.com/office/word/2024/wordml/sdtformatlock" xmlns:w16se="http://schemas.microsoft.com/office/word/2015/wordml/symex" xmlns:w16du="http://schemas.microsoft.com/office/word/2023/wordml/word16du" xmlns:wne="http://schemas.microsoft.com/office/word/2006/wordml" mc:Ignorable="w14 w15 w16se w16cid w16 w16cex w16sdtdh w16sdtfl w16du wp14">
+<w:footnotes xmlns:wpc="http://schemas.microsoft.com/office/word/2010/wordprocessingCanvas" xmlns:cx="http://schemas.microsoft.com/office/drawing/2014/chartex" xmlns:cx1="http://schemas.microsoft.com/office/drawing/2015/9/8/chartex" xmlns:cx2="http://schemas.microsoft.com/office/drawing/2015/10/21/chartex" xmlns:cx3="http://schemas.microsoft.com/office/drawing/2016/5/9/chartex" xmlns:cx4="http://schemas.microsoft.com/office/drawing/2016/5/10/chartex" xmlns:cx5="http://schemas.microsoft.com/office/drawing/2016/5/11/chartex" xmlns:cx6="http://schemas.microsoft.com/office/drawing/2016/5/12/chartex" xmlns:cx7="http://schemas.microsoft.com/office/drawing/2016/5/13/chartex" xmlns:cx8="http://schemas.microsoft.com/office/drawing/2016/5/14/chartex" xmlns:mc="http://schemas.openxmlformats.org/markup-compatibility/2006" xmlns:aink="http://schemas.microsoft.com/office/drawing/2016/ink" xmlns:am3d="http://schemas.microsoft.com/office/drawing/2017/model3d" xmlns:o="urn:schemas-microsoft-com:office:office" xmlns:oel="http://schemas.microsoft.com/office/2019/extlst" xmlns:r="http://schemas.openxmlformats.org/officeDocument/2006/relationships" xmlns:m="http://schemas.openxmlformats.org/officeDocument/2006/math" xmlns:v="urn:schemas-microsoft-com:vml" xmlns:wp14="http://schemas.microsoft.com/office/word/2010/wordprocessingDrawing" xmlns:wp="http://schemas.openxmlformats.org/drawingml/2006/wordprocessingDrawing" xmlns:w10="urn:schemas-microsoft-com:office:word" xmlns:w="http://schemas.openxmlformats.org/wordprocessingml/2006/main" xmlns:w14="http://schemas.microsoft.com/office/word/2010/wordml" xmlns:w15="http://schemas.microsoft.com/office/word/2012/wordml" xmlns:w16cex="http://schemas.microsoft.com/office/word/2018/wordml/cex" xmlns:w16cid="http://schemas.microsoft.com/office/word/2016/wordml/cid" xmlns:w16="http://schemas.microsoft.com/office/word/2018/wordml" xmlns:w16du="http://schemas.microsoft.com/office/word/2023/wordml/word16du" xmlns:w16sdtdh="http://schemas.microsoft.com/office/word/2020/wordml/sdtdatahash" xmlns:w16sdtfl="http://schemas.microsoft.com/office/word/2024/wordml/sdtformatlock" xmlns:w16se="http://schemas.microsoft.com/office/word/2015/wordml/symex" xmlns:wpg="http://schemas.microsoft.com/office/word/2010/wordprocessingGroup" xmlns:wpi="http://schemas.microsoft.com/office/word/2010/wordprocessingInk" xmlns:wne="http://schemas.microsoft.com/office/word/2006/wordml" xmlns:wps="http://schemas.microsoft.com/office/word/2010/wordprocessingShape" mc:Ignorable="w14 w15 w16se w16cid w16 w16cex w16sdtdh w16sdtfl w16du wp14">
   <w:footnote w:type="separator" w:id="-1">
     <w:p>
       <w:r>
@@ -6967,7 +7158,7 @@
 </file>
 
 <file path=word/header1.xml><?xml version="1.0" encoding="utf-8"?>
-<w:hdr xmlns:wpc="http://schemas.microsoft.com/office/word/2010/wordprocessingCanvas" xmlns:cx="http://schemas.microsoft.com/office/drawing/2014/chartex" xmlns:cx1="http://schemas.microsoft.com/office/drawing/2015/9/8/chartex" xmlns:cx2="http://schemas.microsoft.com/office/drawing/2015/10/21/chartex" xmlns:cx3="http://schemas.microsoft.com/office/drawing/2016/5/9/chartex" xmlns:cx4="http://schemas.microsoft.com/office/drawing/2016/5/10/chartex" xmlns:cx5="http://schemas.microsoft.com/office/drawing/2016/5/11/chartex" xmlns:cx6="http://schemas.microsoft.com/office/drawing/2016/5/12/chartex" xmlns:cx7="http://schemas.microsoft.com/office/drawing/2016/5/13/chartex" xmlns:cx8="http://schemas.microsoft.com/office/drawing/2016/5/14/chartex" xmlns:mc="http://schemas.openxmlformats.org/markup-compatibility/2006" xmlns:m="http://schemas.openxmlformats.org/officeDocument/2006/math" xmlns:aink="http://schemas.microsoft.com/office/drawing/2016/ink" xmlns:am3d="http://schemas.microsoft.com/office/drawing/2017/model3d" xmlns:oel="http://schemas.microsoft.com/office/2019/extlst" xmlns:r="http://schemas.openxmlformats.org/officeDocument/2006/relationships" xmlns:wp14="http://schemas.microsoft.com/office/word/2010/wordprocessingDrawing" xmlns:wp="http://schemas.openxmlformats.org/drawingml/2006/wordprocessingDrawing" xmlns:wpg="http://schemas.microsoft.com/office/word/2010/wordprocessingGroup" xmlns:wpi="http://schemas.microsoft.com/office/word/2010/wordprocessingInk" xmlns:wps="http://schemas.microsoft.com/office/word/2010/wordprocessingShape" xmlns:o="urn:schemas-microsoft-com:office:office" xmlns:v="urn:schemas-microsoft-com:vml" xmlns:w10="urn:schemas-microsoft-com:office:word" xmlns:w="http://schemas.openxmlformats.org/wordprocessingml/2006/main" xmlns:w14="http://schemas.microsoft.com/office/word/2010/wordml" xmlns:w15="http://schemas.microsoft.com/office/word/2012/wordml" xmlns:w16cei="http://schemas.microsoft.com/office/word/2026/wordml/cei" xmlns:w16cex="http://schemas.microsoft.com/office/word/2018/wordml/cex" xmlns:w16cid="http://schemas.microsoft.com/office/word/2016/wordml/cid" xmlns:w16="http://schemas.microsoft.com/office/word/2018/wordml" xmlns:w16sdtdh="http://schemas.microsoft.com/office/word/2020/wordml/sdtdatahash" xmlns:w16sdtfl="http://schemas.microsoft.com/office/word/2024/wordml/sdtformatlock" xmlns:w16se="http://schemas.microsoft.com/office/word/2015/wordml/symex" xmlns:w16du="http://schemas.microsoft.com/office/word/2023/wordml/word16du" xmlns:wne="http://schemas.microsoft.com/office/word/2006/wordml" mc:Ignorable="w14 w15 w16se w16cid w16 w16cex w16sdtdh w16sdtfl w16du wp14">
+<w:hdr xmlns:wpc="http://schemas.microsoft.com/office/word/2010/wordprocessingCanvas" xmlns:cx="http://schemas.microsoft.com/office/drawing/2014/chartex" xmlns:cx1="http://schemas.microsoft.com/office/drawing/2015/9/8/chartex" xmlns:cx2="http://schemas.microsoft.com/office/drawing/2015/10/21/chartex" xmlns:cx3="http://schemas.microsoft.com/office/drawing/2016/5/9/chartex" xmlns:cx4="http://schemas.microsoft.com/office/drawing/2016/5/10/chartex" xmlns:cx5="http://schemas.microsoft.com/office/drawing/2016/5/11/chartex" xmlns:cx6="http://schemas.microsoft.com/office/drawing/2016/5/12/chartex" xmlns:cx7="http://schemas.microsoft.com/office/drawing/2016/5/13/chartex" xmlns:cx8="http://schemas.microsoft.com/office/drawing/2016/5/14/chartex" xmlns:mc="http://schemas.openxmlformats.org/markup-compatibility/2006" xmlns:aink="http://schemas.microsoft.com/office/drawing/2016/ink" xmlns:am3d="http://schemas.microsoft.com/office/drawing/2017/model3d" xmlns:o="urn:schemas-microsoft-com:office:office" xmlns:oel="http://schemas.microsoft.com/office/2019/extlst" xmlns:r="http://schemas.openxmlformats.org/officeDocument/2006/relationships" xmlns:m="http://schemas.openxmlformats.org/officeDocument/2006/math" xmlns:v="urn:schemas-microsoft-com:vml" xmlns:wp14="http://schemas.microsoft.com/office/word/2010/wordprocessingDrawing" xmlns:wp="http://schemas.openxmlformats.org/drawingml/2006/wordprocessingDrawing" xmlns:w10="urn:schemas-microsoft-com:office:word" xmlns:w="http://schemas.openxmlformats.org/wordprocessingml/2006/main" xmlns:w14="http://schemas.microsoft.com/office/word/2010/wordml" xmlns:w15="http://schemas.microsoft.com/office/word/2012/wordml" xmlns:w16cex="http://schemas.microsoft.com/office/word/2018/wordml/cex" xmlns:w16cid="http://schemas.microsoft.com/office/word/2016/wordml/cid" xmlns:w16="http://schemas.microsoft.com/office/word/2018/wordml" xmlns:w16du="http://schemas.microsoft.com/office/word/2023/wordml/word16du" xmlns:w16sdtdh="http://schemas.microsoft.com/office/word/2020/wordml/sdtdatahash" xmlns:w16sdtfl="http://schemas.microsoft.com/office/word/2024/wordml/sdtformatlock" xmlns:w16se="http://schemas.microsoft.com/office/word/2015/wordml/symex" xmlns:wpg="http://schemas.microsoft.com/office/word/2010/wordprocessingGroup" xmlns:wpi="http://schemas.microsoft.com/office/word/2010/wordprocessingInk" xmlns:wne="http://schemas.microsoft.com/office/word/2006/wordml" xmlns:wps="http://schemas.microsoft.com/office/word/2010/wordprocessingShape" mc:Ignorable="w14 w15 w16se w16cid w16 w16cex w16sdtdh w16sdtfl w16du wp14">
   <w:tbl>
     <w:tblPr>
       <w:tblW w:w="6410" w:type="pct"/>
@@ -7067,7 +7258,7 @@
 </file>
 
 <file path=word/header2.xml><?xml version="1.0" encoding="utf-8"?>
-<w:hdr xmlns:wpc="http://schemas.microsoft.com/office/word/2010/wordprocessingCanvas" xmlns:cx="http://schemas.microsoft.com/office/drawing/2014/chartex" xmlns:cx1="http://schemas.microsoft.com/office/drawing/2015/9/8/chartex" xmlns:cx2="http://schemas.microsoft.com/office/drawing/2015/10/21/chartex" xmlns:cx3="http://schemas.microsoft.com/office/drawing/2016/5/9/chartex" xmlns:cx4="http://schemas.microsoft.com/office/drawing/2016/5/10/chartex" xmlns:cx5="http://schemas.microsoft.com/office/drawing/2016/5/11/chartex" xmlns:cx6="http://schemas.microsoft.com/office/drawing/2016/5/12/chartex" xmlns:cx7="http://schemas.microsoft.com/office/drawing/2016/5/13/chartex" xmlns:cx8="http://schemas.microsoft.com/office/drawing/2016/5/14/chartex" xmlns:mc="http://schemas.openxmlformats.org/markup-compatibility/2006" xmlns:m="http://schemas.openxmlformats.org/officeDocument/2006/math" xmlns:aink="http://schemas.microsoft.com/office/drawing/2016/ink" xmlns:am3d="http://schemas.microsoft.com/office/drawing/2017/model3d" xmlns:oel="http://schemas.microsoft.com/office/2019/extlst" xmlns:r="http://schemas.openxmlformats.org/officeDocument/2006/relationships" xmlns:wp14="http://schemas.microsoft.com/office/word/2010/wordprocessingDrawing" xmlns:wp="http://schemas.openxmlformats.org/drawingml/2006/wordprocessingDrawing" xmlns:wpg="http://schemas.microsoft.com/office/word/2010/wordprocessingGroup" xmlns:wpi="http://schemas.microsoft.com/office/word/2010/wordprocessingInk" xmlns:wps="http://schemas.microsoft.com/office/word/2010/wordprocessingShape" xmlns:o="urn:schemas-microsoft-com:office:office" xmlns:v="urn:schemas-microsoft-com:vml" xmlns:w10="urn:schemas-microsoft-com:office:word" xmlns:w="http://schemas.openxmlformats.org/wordprocessingml/2006/main" xmlns:w14="http://schemas.microsoft.com/office/word/2010/wordml" xmlns:w15="http://schemas.microsoft.com/office/word/2012/wordml" xmlns:w16cei="http://schemas.microsoft.com/office/word/2026/wordml/cei" xmlns:w16cex="http://schemas.microsoft.com/office/word/2018/wordml/cex" xmlns:w16cid="http://schemas.microsoft.com/office/word/2016/wordml/cid" xmlns:w16="http://schemas.microsoft.com/office/word/2018/wordml" xmlns:w16sdtdh="http://schemas.microsoft.com/office/word/2020/wordml/sdtdatahash" xmlns:w16sdtfl="http://schemas.microsoft.com/office/word/2024/wordml/sdtformatlock" xmlns:w16se="http://schemas.microsoft.com/office/word/2015/wordml/symex" xmlns:w16du="http://schemas.microsoft.com/office/word/2023/wordml/word16du" xmlns:wne="http://schemas.microsoft.com/office/word/2006/wordml" mc:Ignorable="w14 w15 w16se w16cid w16 w16cex w16sdtdh w16sdtfl w16du wp14">
+<w:hdr xmlns:wpc="http://schemas.microsoft.com/office/word/2010/wordprocessingCanvas" xmlns:cx="http://schemas.microsoft.com/office/drawing/2014/chartex" xmlns:cx1="http://schemas.microsoft.com/office/drawing/2015/9/8/chartex" xmlns:cx2="http://schemas.microsoft.com/office/drawing/2015/10/21/chartex" xmlns:cx3="http://schemas.microsoft.com/office/drawing/2016/5/9/chartex" xmlns:cx4="http://schemas.microsoft.com/office/drawing/2016/5/10/chartex" xmlns:cx5="http://schemas.microsoft.com/office/drawing/2016/5/11/chartex" xmlns:cx6="http://schemas.microsoft.com/office/drawing/2016/5/12/chartex" xmlns:cx7="http://schemas.microsoft.com/office/drawing/2016/5/13/chartex" xmlns:cx8="http://schemas.microsoft.com/office/drawing/2016/5/14/chartex" xmlns:mc="http://schemas.openxmlformats.org/markup-compatibility/2006" xmlns:aink="http://schemas.microsoft.com/office/drawing/2016/ink" xmlns:am3d="http://schemas.microsoft.com/office/drawing/2017/model3d" xmlns:o="urn:schemas-microsoft-com:office:office" xmlns:oel="http://schemas.microsoft.com/office/2019/extlst" xmlns:r="http://schemas.openxmlformats.org/officeDocument/2006/relationships" xmlns:m="http://schemas.openxmlformats.org/officeDocument/2006/math" xmlns:v="urn:schemas-microsoft-com:vml" xmlns:wp14="http://schemas.microsoft.com/office/word/2010/wordprocessingDrawing" xmlns:wp="http://schemas.openxmlformats.org/drawingml/2006/wordprocessingDrawing" xmlns:w10="urn:schemas-microsoft-com:office:word" xmlns:w="http://schemas.openxmlformats.org/wordprocessingml/2006/main" xmlns:w14="http://schemas.microsoft.com/office/word/2010/wordml" xmlns:w15="http://schemas.microsoft.com/office/word/2012/wordml" xmlns:w16cex="http://schemas.microsoft.com/office/word/2018/wordml/cex" xmlns:w16cid="http://schemas.microsoft.com/office/word/2016/wordml/cid" xmlns:w16="http://schemas.microsoft.com/office/word/2018/wordml" xmlns:w16du="http://schemas.microsoft.com/office/word/2023/wordml/word16du" xmlns:w16sdtdh="http://schemas.microsoft.com/office/word/2020/wordml/sdtdatahash" xmlns:w16sdtfl="http://schemas.microsoft.com/office/word/2024/wordml/sdtformatlock" xmlns:w16se="http://schemas.microsoft.com/office/word/2015/wordml/symex" xmlns:wpg="http://schemas.microsoft.com/office/word/2010/wordprocessingGroup" xmlns:wpi="http://schemas.microsoft.com/office/word/2010/wordprocessingInk" xmlns:wne="http://schemas.microsoft.com/office/word/2006/wordml" xmlns:wps="http://schemas.microsoft.com/office/word/2010/wordprocessingShape" mc:Ignorable="w14 w15 w16se w16cid w16 w16cex w16sdtdh w16sdtfl w16du wp14">
   <w:p>
     <w:pPr>
       <w:ind w:left="-2340"/>
@@ -7235,7 +7426,7 @@
             </wp:anchor>
           </w:drawing>
         </mc:Choice>
-        <mc:Fallback>
+        <mc:Fallback xmlns:w16cei="http://schemas.microsoft.com/office/word/2026/wordml/cei">
           <w:pict>
             <v:line w14:anchorId="7169C831" id="Straight Connector 6" o:spid="_x0000_s1026" style="position:absolute;z-index:251660288;visibility:visible;mso-wrap-style:square;mso-width-percent:0;mso-height-percent:0;mso-wrap-distance-left:9pt;mso-wrap-distance-top:-3e-5mm;mso-wrap-distance-right:9pt;mso-wrap-distance-bottom:-3e-5mm;mso-position-horizontal:absolute;mso-position-horizontal-relative:text;mso-position-vertical:absolute;mso-position-vertical-relative:text;mso-width-percent:0;mso-height-percent:0;mso-width-relative:page;mso-height-relative:page" from="-68.95pt,-666.45pt" to="489.05pt,-666.45pt" o:gfxdata="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" strokecolor="#4f81bd" strokeweight="2pt">
               <v:shadow on="t" opacity="24903f" origin=",.5" offset="0,.55556mm"/>
@@ -7250,7 +7441,7 @@
 </file>
 
 <file path=word/header3.xml><?xml version="1.0" encoding="utf-8"?>
-<w:hdr xmlns:wpc="http://schemas.microsoft.com/office/word/2010/wordprocessingCanvas" xmlns:cx="http://schemas.microsoft.com/office/drawing/2014/chartex" xmlns:cx1="http://schemas.microsoft.com/office/drawing/2015/9/8/chartex" xmlns:cx2="http://schemas.microsoft.com/office/drawing/2015/10/21/chartex" xmlns:cx3="http://schemas.microsoft.com/office/drawing/2016/5/9/chartex" xmlns:cx4="http://schemas.microsoft.com/office/drawing/2016/5/10/chartex" xmlns:cx5="http://schemas.microsoft.com/office/drawing/2016/5/11/chartex" xmlns:cx6="http://schemas.microsoft.com/office/drawing/2016/5/12/chartex" xmlns:cx7="http://schemas.microsoft.com/office/drawing/2016/5/13/chartex" xmlns:cx8="http://schemas.microsoft.com/office/drawing/2016/5/14/chartex" xmlns:mc="http://schemas.openxmlformats.org/markup-compatibility/2006" xmlns:m="http://schemas.openxmlformats.org/officeDocument/2006/math" xmlns:aink="http://schemas.microsoft.com/office/drawing/2016/ink" xmlns:am3d="http://schemas.microsoft.com/office/drawing/2017/model3d" xmlns:oel="http://schemas.microsoft.com/office/2019/extlst" xmlns:r="http://schemas.openxmlformats.org/officeDocument/2006/relationships" xmlns:wp14="http://schemas.microsoft.com/office/word/2010/wordprocessingDrawing" xmlns:wp="http://schemas.openxmlformats.org/drawingml/2006/wordprocessingDrawing" xmlns:wpg="http://schemas.microsoft.com/office/word/2010/wordprocessingGroup" xmlns:wpi="http://schemas.microsoft.com/office/word/2010/wordprocessingInk" xmlns:wps="http://schemas.microsoft.com/office/word/2010/wordprocessingShape" xmlns:o="urn:schemas-microsoft-com:office:office" xmlns:v="urn:schemas-microsoft-com:vml" xmlns:w10="urn:schemas-microsoft-com:office:word" xmlns:w="http://schemas.openxmlformats.org/wordprocessingml/2006/main" xmlns:w14="http://schemas.microsoft.com/office/word/2010/wordml" xmlns:w15="http://schemas.microsoft.com/office/word/2012/wordml" xmlns:w16cei="http://schemas.microsoft.com/office/word/2026/wordml/cei" xmlns:w16cex="http://schemas.microsoft.com/office/word/2018/wordml/cex" xmlns:w16cid="http://schemas.microsoft.com/office/word/2016/wordml/cid" xmlns:w16="http://schemas.microsoft.com/office/word/2018/wordml" xmlns:w16sdtdh="http://schemas.microsoft.com/office/word/2020/wordml/sdtdatahash" xmlns:w16sdtfl="http://schemas.microsoft.com/office/word/2024/wordml/sdtformatlock" xmlns:w16se="http://schemas.microsoft.com/office/word/2015/wordml/symex" xmlns:w16du="http://schemas.microsoft.com/office/word/2023/wordml/word16du" xmlns:wne="http://schemas.microsoft.com/office/word/2006/wordml" mc:Ignorable="w14 w15 w16se w16cid w16 w16cex w16sdtdh w16sdtfl w16du wp14">
+<w:hdr xmlns:wpc="http://schemas.microsoft.com/office/word/2010/wordprocessingCanvas" xmlns:cx="http://schemas.microsoft.com/office/drawing/2014/chartex" xmlns:cx1="http://schemas.microsoft.com/office/drawing/2015/9/8/chartex" xmlns:cx2="http://schemas.microsoft.com/office/drawing/2015/10/21/chartex" xmlns:cx3="http://schemas.microsoft.com/office/drawing/2016/5/9/chartex" xmlns:cx4="http://schemas.microsoft.com/office/drawing/2016/5/10/chartex" xmlns:cx5="http://schemas.microsoft.com/office/drawing/2016/5/11/chartex" xmlns:cx6="http://schemas.microsoft.com/office/drawing/2016/5/12/chartex" xmlns:cx7="http://schemas.microsoft.com/office/drawing/2016/5/13/chartex" xmlns:cx8="http://schemas.microsoft.com/office/drawing/2016/5/14/chartex" xmlns:mc="http://schemas.openxmlformats.org/markup-compatibility/2006" xmlns:aink="http://schemas.microsoft.com/office/drawing/2016/ink" xmlns:am3d="http://schemas.microsoft.com/office/drawing/2017/model3d" xmlns:o="urn:schemas-microsoft-com:office:office" xmlns:oel="http://schemas.microsoft.com/office/2019/extlst" xmlns:r="http://schemas.openxmlformats.org/officeDocument/2006/relationships" xmlns:m="http://schemas.openxmlformats.org/officeDocument/2006/math" xmlns:v="urn:schemas-microsoft-com:vml" xmlns:wp14="http://schemas.microsoft.com/office/word/2010/wordprocessingDrawing" xmlns:wp="http://schemas.openxmlformats.org/drawingml/2006/wordprocessingDrawing" xmlns:w10="urn:schemas-microsoft-com:office:word" xmlns:w="http://schemas.openxmlformats.org/wordprocessingml/2006/main" xmlns:w14="http://schemas.microsoft.com/office/word/2010/wordml" xmlns:w15="http://schemas.microsoft.com/office/word/2012/wordml" xmlns:w16cex="http://schemas.microsoft.com/office/word/2018/wordml/cex" xmlns:w16cid="http://schemas.microsoft.com/office/word/2016/wordml/cid" xmlns:w16="http://schemas.microsoft.com/office/word/2018/wordml" xmlns:w16du="http://schemas.microsoft.com/office/word/2023/wordml/word16du" xmlns:w16sdtdh="http://schemas.microsoft.com/office/word/2020/wordml/sdtdatahash" xmlns:w16sdtfl="http://schemas.microsoft.com/office/word/2024/wordml/sdtformatlock" xmlns:w16se="http://schemas.microsoft.com/office/word/2015/wordml/symex" xmlns:wpg="http://schemas.microsoft.com/office/word/2010/wordprocessingGroup" xmlns:wpi="http://schemas.microsoft.com/office/word/2010/wordprocessingInk" xmlns:wne="http://schemas.microsoft.com/office/word/2006/wordml" xmlns:wps="http://schemas.microsoft.com/office/word/2010/wordprocessingShape" mc:Ignorable="w14 w15 w16se w16cid w16 w16cex w16sdtdh w16sdtfl w16du wp14">
   <w:tbl>
     <w:tblPr>
       <w:tblW w:w="6410" w:type="pct"/>
@@ -7346,7 +7537,7 @@
             <w:rPr>
               <w:noProof/>
             </w:rPr>
-            <w:instrText>Task 4</w:instrText>
+            <w:instrText>Task 3</w:instrText>
           </w:r>
           <w:r>
             <w:rPr>
@@ -7379,7 +7570,7 @@
             <w:rPr>
               <w:noProof/>
             </w:rPr>
-            <w:instrText>Task 4</w:instrText>
+            <w:instrText>Task 3</w:instrText>
           </w:r>
           <w:r>
             <w:rPr>
@@ -7397,7 +7588,7 @@
             <w:rPr>
               <w:noProof/>
             </w:rPr>
-            <w:t xml:space="preserve">Task 4 </w:t>
+            <w:t xml:space="preserve">Task 3 </w:t>
           </w:r>
           <w:r>
             <w:fldChar w:fldCharType="end"/>
@@ -7455,7 +7646,7 @@
 </file>
 
 <file path=word/numbering.xml><?xml version="1.0" encoding="utf-8"?>
-<w:numbering xmlns:wpc="http://schemas.microsoft.com/office/word/2010/wordprocessingCanvas" xmlns:cx="http://schemas.microsoft.com/office/drawing/2014/chartex" xmlns:cx1="http://schemas.microsoft.com/office/drawing/2015/9/8/chartex" xmlns:cx2="http://schemas.microsoft.com/office/drawing/2015/10/21/chartex" xmlns:cx3="http://schemas.microsoft.com/office/drawing/2016/5/9/chartex" xmlns:cx4="http://schemas.microsoft.com/office/drawing/2016/5/10/chartex" xmlns:cx5="http://schemas.microsoft.com/office/drawing/2016/5/11/chartex" xmlns:cx6="http://schemas.microsoft.com/office/drawing/2016/5/12/chartex" xmlns:cx7="http://schemas.microsoft.com/office/drawing/2016/5/13/chartex" xmlns:cx8="http://schemas.microsoft.com/office/drawing/2016/5/14/chartex" xmlns:mc="http://schemas.openxmlformats.org/markup-compatibility/2006" xmlns:m="http://schemas.openxmlformats.org/officeDocument/2006/math" xmlns:aink="http://schemas.microsoft.com/office/drawing/2016/ink" xmlns:am3d="http://schemas.microsoft.com/office/drawing/2017/model3d" xmlns:oel="http://schemas.microsoft.com/office/2019/extlst" xmlns:r="http://schemas.openxmlformats.org/officeDocument/2006/relationships" xmlns:wp14="http://schemas.microsoft.com/office/word/2010/wordprocessingDrawing" xmlns:wp="http://schemas.openxmlformats.org/drawingml/2006/wordprocessingDrawing" xmlns:wpg="http://schemas.microsoft.com/office/word/2010/wordprocessingGroup" xmlns:wpi="http://schemas.microsoft.com/office/word/2010/wordprocessingInk" xmlns:wps="http://schemas.microsoft.com/office/word/2010/wordprocessingShape" xmlns:o="urn:schemas-microsoft-com:office:office" xmlns:v="urn:schemas-microsoft-com:vml" xmlns:w10="urn:schemas-microsoft-com:office:word" xmlns:w="http://schemas.openxmlformats.org/wordprocessingml/2006/main" xmlns:w14="http://schemas.microsoft.com/office/word/2010/wordml" xmlns:w15="http://schemas.microsoft.com/office/word/2012/wordml" xmlns:w16cei="http://schemas.microsoft.com/office/word/2026/wordml/cei" xmlns:w16cex="http://schemas.microsoft.com/office/word/2018/wordml/cex" xmlns:w16cid="http://schemas.microsoft.com/office/word/2016/wordml/cid" xmlns:w16="http://schemas.microsoft.com/office/word/2018/wordml" xmlns:w16sdtdh="http://schemas.microsoft.com/office/word/2020/wordml/sdtdatahash" xmlns:w16sdtfl="http://schemas.microsoft.com/office/word/2024/wordml/sdtformatlock" xmlns:w16se="http://schemas.microsoft.com/office/word/2015/wordml/symex" xmlns:w16du="http://schemas.microsoft.com/office/word/2023/wordml/word16du" xmlns:wne="http://schemas.microsoft.com/office/word/2006/wordml" mc:Ignorable="w14 w15 w16se w16cid w16 w16cex w16sdtdh w16sdtfl w16du wp14">
+<w:numbering xmlns:wpc="http://schemas.microsoft.com/office/word/2010/wordprocessingCanvas" xmlns:cx="http://schemas.microsoft.com/office/drawing/2014/chartex" xmlns:cx1="http://schemas.microsoft.com/office/drawing/2015/9/8/chartex" xmlns:cx2="http://schemas.microsoft.com/office/drawing/2015/10/21/chartex" xmlns:cx3="http://schemas.microsoft.com/office/drawing/2016/5/9/chartex" xmlns:cx4="http://schemas.microsoft.com/office/drawing/2016/5/10/chartex" xmlns:cx5="http://schemas.microsoft.com/office/drawing/2016/5/11/chartex" xmlns:cx6="http://schemas.microsoft.com/office/drawing/2016/5/12/chartex" xmlns:cx7="http://schemas.microsoft.com/office/drawing/2016/5/13/chartex" xmlns:cx8="http://schemas.microsoft.com/office/drawing/2016/5/14/chartex" xmlns:mc="http://schemas.openxmlformats.org/markup-compatibility/2006" xmlns:aink="http://schemas.microsoft.com/office/drawing/2016/ink" xmlns:am3d="http://schemas.microsoft.com/office/drawing/2017/model3d" xmlns:o="urn:schemas-microsoft-com:office:office" xmlns:oel="http://schemas.microsoft.com/office/2019/extlst" xmlns:r="http://schemas.openxmlformats.org/officeDocument/2006/relationships" xmlns:m="http://schemas.openxmlformats.org/officeDocument/2006/math" xmlns:v="urn:schemas-microsoft-com:vml" xmlns:wp14="http://schemas.microsoft.com/office/word/2010/wordprocessingDrawing" xmlns:wp="http://schemas.openxmlformats.org/drawingml/2006/wordprocessingDrawing" xmlns:w10="urn:schemas-microsoft-com:office:word" xmlns:w="http://schemas.openxmlformats.org/wordprocessingml/2006/main" xmlns:w14="http://schemas.microsoft.com/office/word/2010/wordml" xmlns:w15="http://schemas.microsoft.com/office/word/2012/wordml" xmlns:w16cex="http://schemas.microsoft.com/office/word/2018/wordml/cex" xmlns:w16cid="http://schemas.microsoft.com/office/word/2016/wordml/cid" xmlns:w16="http://schemas.microsoft.com/office/word/2018/wordml" xmlns:w16du="http://schemas.microsoft.com/office/word/2023/wordml/word16du" xmlns:w16sdtdh="http://schemas.microsoft.com/office/word/2020/wordml/sdtdatahash" xmlns:w16sdtfl="http://schemas.microsoft.com/office/word/2024/wordml/sdtformatlock" xmlns:w16se="http://schemas.microsoft.com/office/word/2015/wordml/symex" xmlns:wpg="http://schemas.microsoft.com/office/word/2010/wordprocessingGroup" xmlns:wpi="http://schemas.microsoft.com/office/word/2010/wordprocessingInk" xmlns:wne="http://schemas.microsoft.com/office/word/2006/wordml" xmlns:wps="http://schemas.microsoft.com/office/word/2010/wordprocessingShape" mc:Ignorable="w14 w15 w16se w16cid w16 w16cex w16sdtdh w16sdtfl w16du wp14">
   <w:abstractNum w:abstractNumId="0" w15:restartNumberingAfterBreak="0">
     <w:nsid w:val="FFFFFF89"/>
     <w:multiLevelType w:val="singleLevel"/>
@@ -9775,7 +9966,7 @@
 </file>
 
 <file path=word/styles.xml><?xml version="1.0" encoding="utf-8"?>
-<w:styles xmlns:mc="http://schemas.openxmlformats.org/markup-compatibility/2006" xmlns:r="http://schemas.openxmlformats.org/officeDocument/2006/relationships" xmlns:w="http://schemas.openxmlformats.org/wordprocessingml/2006/main" xmlns:w14="http://schemas.microsoft.com/office/word/2010/wordml" xmlns:w15="http://schemas.microsoft.com/office/word/2012/wordml" xmlns:w16cex="http://schemas.microsoft.com/office/word/2018/wordml/cex" xmlns:w16cid="http://schemas.microsoft.com/office/word/2016/wordml/cid" xmlns:w16="http://schemas.microsoft.com/office/word/2018/wordml" xmlns:w16sdtdh="http://schemas.microsoft.com/office/word/2020/wordml/sdtdatahash" xmlns:w16sdtfl="http://schemas.microsoft.com/office/word/2024/wordml/sdtformatlock" xmlns:w16se="http://schemas.microsoft.com/office/word/2015/wordml/symex" xmlns:w16du="http://schemas.microsoft.com/office/word/2023/wordml/word16du" mc:Ignorable="w14 w15 w16se w16cid w16 w16cex w16sdtdh w16sdtfl w16du">
+<w:styles xmlns:mc="http://schemas.openxmlformats.org/markup-compatibility/2006" xmlns:r="http://schemas.openxmlformats.org/officeDocument/2006/relationships" xmlns:w="http://schemas.openxmlformats.org/wordprocessingml/2006/main" xmlns:w14="http://schemas.microsoft.com/office/word/2010/wordml" xmlns:w15="http://schemas.microsoft.com/office/word/2012/wordml" xmlns:w16cex="http://schemas.microsoft.com/office/word/2018/wordml/cex" xmlns:w16cid="http://schemas.microsoft.com/office/word/2016/wordml/cid" xmlns:w16="http://schemas.microsoft.com/office/word/2018/wordml" xmlns:w16du="http://schemas.microsoft.com/office/word/2023/wordml/word16du" xmlns:w16sdtdh="http://schemas.microsoft.com/office/word/2020/wordml/sdtdatahash" xmlns:w16sdtfl="http://schemas.microsoft.com/office/word/2024/wordml/sdtformatlock" xmlns:w16se="http://schemas.microsoft.com/office/word/2015/wordml/symex" mc:Ignorable="w14 w15 w16se w16cid w16 w16cex w16sdtdh w16sdtfl w16du">
   <w:docDefaults>
     <w:rPrDefault>
       <w:rPr>
@@ -10180,7 +10371,7 @@
       <w:color w:val="auto"/>
       <w:sz w:val="24"/>
       <w:szCs w:val="24"/>
-      <w:lang w:val="en-SA" w:eastAsia="en-US"/>
+      <w:lang w:eastAsia="en-US"/>
     </w:rPr>
   </w:style>
   <w:style w:type="paragraph" w:styleId="Heading1">
@@ -11191,7 +11382,7 @@
 </file>
 
 <file path=word/glossary/document.xml><?xml version="1.0" encoding="utf-8"?>
-<w:glossaryDocument xmlns:wpc="http://schemas.microsoft.com/office/word/2010/wordprocessingCanvas" xmlns:cx="http://schemas.microsoft.com/office/drawing/2014/chartex" xmlns:cx1="http://schemas.microsoft.com/office/drawing/2015/9/8/chartex" xmlns:cx2="http://schemas.microsoft.com/office/drawing/2015/10/21/chartex" xmlns:cx3="http://schemas.microsoft.com/office/drawing/2016/5/9/chartex" xmlns:cx4="http://schemas.microsoft.com/office/drawing/2016/5/10/chartex" xmlns:cx5="http://schemas.microsoft.com/office/drawing/2016/5/11/chartex" xmlns:cx6="http://schemas.microsoft.com/office/drawing/2016/5/12/chartex" xmlns:cx7="http://schemas.microsoft.com/office/drawing/2016/5/13/chartex" xmlns:cx8="http://schemas.microsoft.com/office/drawing/2016/5/14/chartex" xmlns:mc="http://schemas.openxmlformats.org/markup-compatibility/2006" xmlns:m="http://schemas.openxmlformats.org/officeDocument/2006/math" xmlns:aink="http://schemas.microsoft.com/office/drawing/2016/ink" xmlns:am3d="http://schemas.microsoft.com/office/drawing/2017/model3d" xmlns:oel="http://schemas.microsoft.com/office/2019/extlst" xmlns:r="http://schemas.openxmlformats.org/officeDocument/2006/relationships" xmlns:wp14="http://schemas.microsoft.com/office/word/2010/wordprocessingDrawing" xmlns:wp="http://schemas.openxmlformats.org/drawingml/2006/wordprocessingDrawing" xmlns:wpg="http://schemas.microsoft.com/office/word/2010/wordprocessingGroup" xmlns:wpi="http://schemas.microsoft.com/office/word/2010/wordprocessingInk" xmlns:wps="http://schemas.microsoft.com/office/word/2010/wordprocessingShape" xmlns:o="urn:schemas-microsoft-com:office:office" xmlns:v="urn:schemas-microsoft-com:vml" xmlns:w10="urn:schemas-microsoft-com:office:word" xmlns:w="http://schemas.openxmlformats.org/wordprocessingml/2006/main" xmlns:w14="http://schemas.microsoft.com/office/word/2010/wordml" xmlns:w15="http://schemas.microsoft.com/office/word/2012/wordml" xmlns:w16cei="http://schemas.microsoft.com/office/word/2026/wordml/cei" xmlns:w16cex="http://schemas.microsoft.com/office/word/2018/wordml/cex" xmlns:w16cid="http://schemas.microsoft.com/office/word/2016/wordml/cid" xmlns:w16="http://schemas.microsoft.com/office/word/2018/wordml" xmlns:w16sdtdh="http://schemas.microsoft.com/office/word/2020/wordml/sdtdatahash" xmlns:w16sdtfl="http://schemas.microsoft.com/office/word/2024/wordml/sdtformatlock" xmlns:w16se="http://schemas.microsoft.com/office/word/2015/wordml/symex" xmlns:w16du="http://schemas.microsoft.com/office/word/2023/wordml/word16du" xmlns:wne="http://schemas.microsoft.com/office/word/2006/wordml" mc:Ignorable="w14 w15 w16se w16cid w16 w16cex w16sdtdh w16sdtfl w16du wp14">
+<w:glossaryDocument xmlns:wpc="http://schemas.microsoft.com/office/word/2010/wordprocessingCanvas" xmlns:cx="http://schemas.microsoft.com/office/drawing/2014/chartex" xmlns:cx1="http://schemas.microsoft.com/office/drawing/2015/9/8/chartex" xmlns:cx2="http://schemas.microsoft.com/office/drawing/2015/10/21/chartex" xmlns:cx3="http://schemas.microsoft.com/office/drawing/2016/5/9/chartex" xmlns:cx4="http://schemas.microsoft.com/office/drawing/2016/5/10/chartex" xmlns:cx5="http://schemas.microsoft.com/office/drawing/2016/5/11/chartex" xmlns:cx6="http://schemas.microsoft.com/office/drawing/2016/5/12/chartex" xmlns:cx7="http://schemas.microsoft.com/office/drawing/2016/5/13/chartex" xmlns:cx8="http://schemas.microsoft.com/office/drawing/2016/5/14/chartex" xmlns:mc="http://schemas.openxmlformats.org/markup-compatibility/2006" xmlns:aink="http://schemas.microsoft.com/office/drawing/2016/ink" xmlns:am3d="http://schemas.microsoft.com/office/drawing/2017/model3d" xmlns:o="urn:schemas-microsoft-com:office:office" xmlns:oel="http://schemas.microsoft.com/office/2019/extlst" xmlns:r="http://schemas.openxmlformats.org/officeDocument/2006/relationships" xmlns:m="http://schemas.openxmlformats.org/officeDocument/2006/math" xmlns:v="urn:schemas-microsoft-com:vml" xmlns:wp14="http://schemas.microsoft.com/office/word/2010/wordprocessingDrawing" xmlns:wp="http://schemas.openxmlformats.org/drawingml/2006/wordprocessingDrawing" xmlns:w10="urn:schemas-microsoft-com:office:word" xmlns:w="http://schemas.openxmlformats.org/wordprocessingml/2006/main" xmlns:w14="http://schemas.microsoft.com/office/word/2010/wordml" xmlns:w15="http://schemas.microsoft.com/office/word/2012/wordml" xmlns:w16cex="http://schemas.microsoft.com/office/word/2018/wordml/cex" xmlns:w16cid="http://schemas.microsoft.com/office/word/2016/wordml/cid" xmlns:w16="http://schemas.microsoft.com/office/word/2018/wordml" xmlns:w16du="http://schemas.microsoft.com/office/word/2023/wordml/word16du" xmlns:w16sdtdh="http://schemas.microsoft.com/office/word/2020/wordml/sdtdatahash" xmlns:w16sdtfl="http://schemas.microsoft.com/office/word/2024/wordml/sdtformatlock" xmlns:w16se="http://schemas.microsoft.com/office/word/2015/wordml/symex" xmlns:wpg="http://schemas.microsoft.com/office/word/2010/wordprocessingGroup" xmlns:wpi="http://schemas.microsoft.com/office/word/2010/wordprocessingInk" xmlns:wne="http://schemas.microsoft.com/office/word/2006/wordml" xmlns:wps="http://schemas.microsoft.com/office/word/2010/wordprocessingShape" mc:Ignorable="w14 w15 w16se w16cid w16 w16cex w16sdtdh w16sdtfl w16du wp14">
   <w:docParts>
     <w:docPart>
       <w:docPartPr>
@@ -11276,7 +11467,7 @@
 </file>
 
 <file path=word/glossary/fontTable.xml><?xml version="1.0" encoding="utf-8"?>
-<w:fonts xmlns:mc="http://schemas.openxmlformats.org/markup-compatibility/2006" xmlns:r="http://schemas.openxmlformats.org/officeDocument/2006/relationships" xmlns:w="http://schemas.openxmlformats.org/wordprocessingml/2006/main" xmlns:w14="http://schemas.microsoft.com/office/word/2010/wordml" xmlns:w15="http://schemas.microsoft.com/office/word/2012/wordml" xmlns:w16cex="http://schemas.microsoft.com/office/word/2018/wordml/cex" xmlns:w16cid="http://schemas.microsoft.com/office/word/2016/wordml/cid" xmlns:w16="http://schemas.microsoft.com/office/word/2018/wordml" xmlns:w16sdtdh="http://schemas.microsoft.com/office/word/2020/wordml/sdtdatahash" xmlns:w16sdtfl="http://schemas.microsoft.com/office/word/2024/wordml/sdtformatlock" xmlns:w16se="http://schemas.microsoft.com/office/word/2015/wordml/symex" xmlns:w16du="http://schemas.microsoft.com/office/word/2023/wordml/word16du" mc:Ignorable="w14 w15 w16se w16cid w16 w16cex w16sdtdh w16sdtfl w16du">
+<w:fonts xmlns:mc="http://schemas.openxmlformats.org/markup-compatibility/2006" xmlns:r="http://schemas.openxmlformats.org/officeDocument/2006/relationships" xmlns:w="http://schemas.openxmlformats.org/wordprocessingml/2006/main" xmlns:w14="http://schemas.microsoft.com/office/word/2010/wordml" xmlns:w15="http://schemas.microsoft.com/office/word/2012/wordml" xmlns:w16cex="http://schemas.microsoft.com/office/word/2018/wordml/cex" xmlns:w16cid="http://schemas.microsoft.com/office/word/2016/wordml/cid" xmlns:w16="http://schemas.microsoft.com/office/word/2018/wordml" xmlns:w16du="http://schemas.microsoft.com/office/word/2023/wordml/word16du" xmlns:w16sdtdh="http://schemas.microsoft.com/office/word/2020/wordml/sdtdatahash" xmlns:w16sdtfl="http://schemas.microsoft.com/office/word/2024/wordml/sdtformatlock" xmlns:w16se="http://schemas.microsoft.com/office/word/2015/wordml/symex" mc:Ignorable="w14 w15 w16se w16cid w16 w16cex w16sdtdh w16sdtfl w16du">
   <w:font w:name="Cambria">
     <w:panose1 w:val="02040503050406030204"/>
     <w:charset w:val="00"/>
@@ -11294,7 +11485,7 @@
   <w:font w:name="Symbol">
     <w:panose1 w:val="05050102010706020507"/>
     <w:charset w:val="02"/>
-    <w:family w:val="decorative"/>
+    <w:family w:val="roman"/>
     <w:pitch w:val="variable"/>
     <w:sig w:usb0="00000000" w:usb1="10000000" w:usb2="00000000" w:usb3="00000000" w:csb0="80000000" w:csb1="00000000"/>
   </w:font>
@@ -11307,10 +11498,10 @@
   </w:font>
   <w:font w:name="Wingdings">
     <w:panose1 w:val="05000000000000000000"/>
-    <w:charset w:val="4D"/>
-    <w:family w:val="decorative"/>
+    <w:charset w:val="02"/>
+    <w:family w:val="auto"/>
     <w:pitch w:val="variable"/>
-    <w:sig w:usb0="00000003" w:usb1="00000000" w:usb2="00000000" w:usb3="00000000" w:csb0="80000001" w:csb1="00000000"/>
+    <w:sig w:usb0="00000000" w:usb1="10000000" w:usb2="00000000" w:usb3="00000000" w:csb0="80000000" w:csb1="00000000"/>
   </w:font>
   <w:font w:name="Arial">
     <w:panose1 w:val="020B0604020202020204"/>
@@ -11334,7 +11525,6 @@
     <w:sig w:usb0="E1002EFF" w:usb1="C000605B" w:usb2="00000029" w:usb3="00000000" w:csb0="000101FF" w:csb1="00000000"/>
   </w:font>
   <w:font w:name="Aptos">
-    <w:panose1 w:val="020B0004020202020204"/>
     <w:charset w:val="00"/>
     <w:family w:val="swiss"/>
     <w:pitch w:val="variable"/>
@@ -11342,14 +11532,12 @@
   </w:font>
   <w:font w:name="Frutiger LT Arabic 45 Light">
     <w:altName w:val="Arial"/>
-    <w:panose1 w:val="020B0604020202020204"/>
     <w:charset w:val="00"/>
     <w:family w:val="auto"/>
     <w:pitch w:val="variable"/>
     <w:sig w:usb0="800020AF" w:usb1="C000A04A" w:usb2="00000008" w:usb3="00000000" w:csb0="00000041" w:csb1="00000000"/>
   </w:font>
   <w:font w:name="Yu Mincho">
-    <w:panose1 w:val="02020400000000000000"/>
     <w:charset w:val="80"/>
     <w:family w:val="roman"/>
     <w:pitch w:val="variable"/>
@@ -11363,7 +11551,6 @@
     <w:sig w:usb0="E00002FF" w:usb1="2AC7FDFF" w:usb2="00000016" w:usb3="00000000" w:csb0="0002009F" w:csb1="00000000"/>
   </w:font>
   <w:font w:name="Aptos Display">
-    <w:panose1 w:val="020B0004020202020204"/>
     <w:charset w:val="00"/>
     <w:family w:val="swiss"/>
     <w:pitch w:val="variable"/>
@@ -11373,7 +11560,7 @@
 </file>
 
 <file path=word/glossary/numbering.xml><?xml version="1.0" encoding="utf-8"?>
-<w:numbering xmlns:wpc="http://schemas.microsoft.com/office/word/2010/wordprocessingCanvas" xmlns:cx="http://schemas.microsoft.com/office/drawing/2014/chartex" xmlns:cx1="http://schemas.microsoft.com/office/drawing/2015/9/8/chartex" xmlns:cx2="http://schemas.microsoft.com/office/drawing/2015/10/21/chartex" xmlns:cx3="http://schemas.microsoft.com/office/drawing/2016/5/9/chartex" xmlns:cx4="http://schemas.microsoft.com/office/drawing/2016/5/10/chartex" xmlns:cx5="http://schemas.microsoft.com/office/drawing/2016/5/11/chartex" xmlns:cx6="http://schemas.microsoft.com/office/drawing/2016/5/12/chartex" xmlns:cx7="http://schemas.microsoft.com/office/drawing/2016/5/13/chartex" xmlns:cx8="http://schemas.microsoft.com/office/drawing/2016/5/14/chartex" xmlns:mc="http://schemas.openxmlformats.org/markup-compatibility/2006" xmlns:m="http://schemas.openxmlformats.org/officeDocument/2006/math" xmlns:aink="http://schemas.microsoft.com/office/drawing/2016/ink" xmlns:am3d="http://schemas.microsoft.com/office/drawing/2017/model3d" xmlns:oel="http://schemas.microsoft.com/office/2019/extlst" xmlns:r="http://schemas.openxmlformats.org/officeDocument/2006/relationships" xmlns:wp14="http://schemas.microsoft.com/office/word/2010/wordprocessingDrawing" xmlns:wp="http://schemas.openxmlformats.org/drawingml/2006/wordprocessingDrawing" xmlns:wpg="http://schemas.microsoft.com/office/word/2010/wordprocessingGroup" xmlns:wpi="http://schemas.microsoft.com/office/word/2010/wordprocessingInk" xmlns:wps="http://schemas.microsoft.com/office/word/2010/wordprocessingShape" xmlns:o="urn:schemas-microsoft-com:office:office" xmlns:v="urn:schemas-microsoft-com:vml" xmlns:w10="urn:schemas-microsoft-com:office:word" xmlns:w="http://schemas.openxmlformats.org/wordprocessingml/2006/main" xmlns:w14="http://schemas.microsoft.com/office/word/2010/wordml" xmlns:w15="http://schemas.microsoft.com/office/word/2012/wordml" xmlns:w16cei="http://schemas.microsoft.com/office/word/2026/wordml/cei" xmlns:w16cex="http://schemas.microsoft.com/office/word/2018/wordml/cex" xmlns:w16cid="http://schemas.microsoft.com/office/word/2016/wordml/cid" xmlns:w16="http://schemas.microsoft.com/office/word/2018/wordml" xmlns:w16sdtdh="http://schemas.microsoft.com/office/word/2020/wordml/sdtdatahash" xmlns:w16sdtfl="http://schemas.microsoft.com/office/word/2024/wordml/sdtformatlock" xmlns:w16se="http://schemas.microsoft.com/office/word/2015/wordml/symex" xmlns:w16du="http://schemas.microsoft.com/office/word/2023/wordml/word16du" xmlns:wne="http://schemas.microsoft.com/office/word/2006/wordml" mc:Ignorable="w14 w15 w16se w16cid w16 w16cex w16sdtdh w16sdtfl w16du wp14">
+<w:numbering xmlns:wpc="http://schemas.microsoft.com/office/word/2010/wordprocessingCanvas" xmlns:cx="http://schemas.microsoft.com/office/drawing/2014/chartex" xmlns:cx1="http://schemas.microsoft.com/office/drawing/2015/9/8/chartex" xmlns:cx2="http://schemas.microsoft.com/office/drawing/2015/10/21/chartex" xmlns:cx3="http://schemas.microsoft.com/office/drawing/2016/5/9/chartex" xmlns:cx4="http://schemas.microsoft.com/office/drawing/2016/5/10/chartex" xmlns:cx5="http://schemas.microsoft.com/office/drawing/2016/5/11/chartex" xmlns:cx6="http://schemas.microsoft.com/office/drawing/2016/5/12/chartex" xmlns:cx7="http://schemas.microsoft.com/office/drawing/2016/5/13/chartex" xmlns:cx8="http://schemas.microsoft.com/office/drawing/2016/5/14/chartex" xmlns:mc="http://schemas.openxmlformats.org/markup-compatibility/2006" xmlns:aink="http://schemas.microsoft.com/office/drawing/2016/ink" xmlns:am3d="http://schemas.microsoft.com/office/drawing/2017/model3d" xmlns:o="urn:schemas-microsoft-com:office:office" xmlns:oel="http://schemas.microsoft.com/office/2019/extlst" xmlns:r="http://schemas.openxmlformats.org/officeDocument/2006/relationships" xmlns:m="http://schemas.openxmlformats.org/officeDocument/2006/math" xmlns:v="urn:schemas-microsoft-com:vml" xmlns:wp14="http://schemas.microsoft.com/office/word/2010/wordprocessingDrawing" xmlns:wp="http://schemas.openxmlformats.org/drawingml/2006/wordprocessingDrawing" xmlns:w10="urn:schemas-microsoft-com:office:word" xmlns:w="http://schemas.openxmlformats.org/wordprocessingml/2006/main" xmlns:w14="http://schemas.microsoft.com/office/word/2010/wordml" xmlns:w15="http://schemas.microsoft.com/office/word/2012/wordml" xmlns:w16cex="http://schemas.microsoft.com/office/word/2018/wordml/cex" xmlns:w16cid="http://schemas.microsoft.com/office/word/2016/wordml/cid" xmlns:w16="http://schemas.microsoft.com/office/word/2018/wordml" xmlns:w16du="http://schemas.microsoft.com/office/word/2023/wordml/word16du" xmlns:w16sdtdh="http://schemas.microsoft.com/office/word/2020/wordml/sdtdatahash" xmlns:w16sdtfl="http://schemas.microsoft.com/office/word/2024/wordml/sdtformatlock" xmlns:w16se="http://schemas.microsoft.com/office/word/2015/wordml/symex" xmlns:wpg="http://schemas.microsoft.com/office/word/2010/wordprocessingGroup" xmlns:wpi="http://schemas.microsoft.com/office/word/2010/wordprocessingInk" xmlns:wne="http://schemas.microsoft.com/office/word/2006/wordml" xmlns:wps="http://schemas.microsoft.com/office/word/2010/wordprocessingShape" mc:Ignorable="w14 w15 w16se w16cid w16 w16cex w16sdtdh w16sdtfl w16du wp14">
   <w:abstractNum w:abstractNumId="0" w15:restartNumberingAfterBreak="0">
     <w:nsid w:val="FFFFFF89"/>
     <w:multiLevelType w:val="singleLevel"/>
@@ -11400,7 +11587,7 @@
 </file>
 
 <file path=word/glossary/settings.xml><?xml version="1.0" encoding="utf-8"?>
-<w:settings xmlns:mc="http://schemas.openxmlformats.org/markup-compatibility/2006" xmlns:m="http://schemas.openxmlformats.org/officeDocument/2006/math" xmlns:r="http://schemas.openxmlformats.org/officeDocument/2006/relationships" xmlns:sl="http://schemas.openxmlformats.org/schemaLibrary/2006/main" xmlns:o="urn:schemas-microsoft-com:office:office" xmlns:v="urn:schemas-microsoft-com:vml" xmlns:w10="urn:schemas-microsoft-com:office:word" xmlns:w="http://schemas.openxmlformats.org/wordprocessingml/2006/main" xmlns:w14="http://schemas.microsoft.com/office/word/2010/wordml" xmlns:w15="http://schemas.microsoft.com/office/word/2012/wordml" xmlns:w16cex="http://schemas.microsoft.com/office/word/2018/wordml/cex" xmlns:w16cid="http://schemas.microsoft.com/office/word/2016/wordml/cid" xmlns:w16="http://schemas.microsoft.com/office/word/2018/wordml" xmlns:w16sdtdh="http://schemas.microsoft.com/office/word/2020/wordml/sdtdatahash" xmlns:w16sdtfl="http://schemas.microsoft.com/office/word/2024/wordml/sdtformatlock" xmlns:w16se="http://schemas.microsoft.com/office/word/2015/wordml/symex" xmlns:w16du="http://schemas.microsoft.com/office/word/2023/wordml/word16du" mc:Ignorable="w14 w15 w16se w16cid w16 w16cex w16sdtdh w16sdtfl w16du">
+<w:settings xmlns:mc="http://schemas.openxmlformats.org/markup-compatibility/2006" xmlns:o="urn:schemas-microsoft-com:office:office" xmlns:r="http://schemas.openxmlformats.org/officeDocument/2006/relationships" xmlns:m="http://schemas.openxmlformats.org/officeDocument/2006/math" xmlns:v="urn:schemas-microsoft-com:vml" xmlns:w10="urn:schemas-microsoft-com:office:word" xmlns:w="http://schemas.openxmlformats.org/wordprocessingml/2006/main" xmlns:w14="http://schemas.microsoft.com/office/word/2010/wordml" xmlns:w15="http://schemas.microsoft.com/office/word/2012/wordml" xmlns:w16cex="http://schemas.microsoft.com/office/word/2018/wordml/cex" xmlns:w16cid="http://schemas.microsoft.com/office/word/2016/wordml/cid" xmlns:w16="http://schemas.microsoft.com/office/word/2018/wordml" xmlns:w16du="http://schemas.microsoft.com/office/word/2023/wordml/word16du" xmlns:w16sdtdh="http://schemas.microsoft.com/office/word/2020/wordml/sdtdatahash" xmlns:w16sdtfl="http://schemas.microsoft.com/office/word/2024/wordml/sdtformatlock" xmlns:w16se="http://schemas.microsoft.com/office/word/2015/wordml/symex" xmlns:sl="http://schemas.openxmlformats.org/schemaLibrary/2006/main" mc:Ignorable="w14 w15 w16se w16cid w16 w16cex w16sdtdh w16sdtfl w16du">
   <w:view w:val="normal"/>
   <w:defaultTabStop w:val="720"/>
   <w:characterSpacingControl w:val="doNotCompress"/>
@@ -11459,11 +11646,13 @@
     <w:rsid w:val="00D248BA"/>
     <w:rsid w:val="00D36B88"/>
     <w:rsid w:val="00D56FB7"/>
+    <w:rsid w:val="00D91447"/>
     <w:rsid w:val="00DD75D6"/>
     <w:rsid w:val="00E35677"/>
     <w:rsid w:val="00E552F8"/>
     <w:rsid w:val="00E575CD"/>
     <w:rsid w:val="00E770AC"/>
+    <w:rsid w:val="00EC4ADB"/>
     <w:rsid w:val="00F42A55"/>
     <w:rsid w:val="00F55C51"/>
     <w:rsid w:val="00F6554B"/>
@@ -11490,7 +11679,7 @@
 </file>
 
 <file path=word/glossary/styles.xml><?xml version="1.0" encoding="utf-8"?>
-<w:styles xmlns:mc="http://schemas.openxmlformats.org/markup-compatibility/2006" xmlns:r="http://schemas.openxmlformats.org/officeDocument/2006/relationships" xmlns:w="http://schemas.openxmlformats.org/wordprocessingml/2006/main" xmlns:w14="http://schemas.microsoft.com/office/word/2010/wordml" xmlns:w15="http://schemas.microsoft.com/office/word/2012/wordml" xmlns:w16cex="http://schemas.microsoft.com/office/word/2018/wordml/cex" xmlns:w16cid="http://schemas.microsoft.com/office/word/2016/wordml/cid" xmlns:w16="http://schemas.microsoft.com/office/word/2018/wordml" xmlns:w16sdtdh="http://schemas.microsoft.com/office/word/2020/wordml/sdtdatahash" xmlns:w16sdtfl="http://schemas.microsoft.com/office/word/2024/wordml/sdtformatlock" xmlns:w16se="http://schemas.microsoft.com/office/word/2015/wordml/symex" xmlns:w16du="http://schemas.microsoft.com/office/word/2023/wordml/word16du" mc:Ignorable="w14 w15 w16se w16cid w16 w16cex w16sdtdh w16sdtfl w16du">
+<w:styles xmlns:mc="http://schemas.openxmlformats.org/markup-compatibility/2006" xmlns:r="http://schemas.openxmlformats.org/officeDocument/2006/relationships" xmlns:w="http://schemas.openxmlformats.org/wordprocessingml/2006/main" xmlns:w14="http://schemas.microsoft.com/office/word/2010/wordml" xmlns:w15="http://schemas.microsoft.com/office/word/2012/wordml" xmlns:w16cex="http://schemas.microsoft.com/office/word/2018/wordml/cex" xmlns:w16cid="http://schemas.microsoft.com/office/word/2016/wordml/cid" xmlns:w16="http://schemas.microsoft.com/office/word/2018/wordml" xmlns:w16du="http://schemas.microsoft.com/office/word/2023/wordml/word16du" xmlns:w16sdtdh="http://schemas.microsoft.com/office/word/2020/wordml/sdtdatahash" xmlns:w16sdtfl="http://schemas.microsoft.com/office/word/2024/wordml/sdtformatlock" xmlns:w16se="http://schemas.microsoft.com/office/word/2015/wordml/symex" mc:Ignorable="w14 w15 w16se w16cid w16 w16cex w16sdtdh w16sdtfl w16du">
   <w:docDefaults>
     <w:rPrDefault>
       <w:rPr>
@@ -11957,7 +12146,7 @@
 </file>
 
 <file path=word/glossary/webSettings.xml><?xml version="1.0" encoding="utf-8"?>
-<w:webSettings xmlns:mc="http://schemas.openxmlformats.org/markup-compatibility/2006" xmlns:r="http://schemas.openxmlformats.org/officeDocument/2006/relationships" xmlns:w="http://schemas.openxmlformats.org/wordprocessingml/2006/main" xmlns:w14="http://schemas.microsoft.com/office/word/2010/wordml" xmlns:w15="http://schemas.microsoft.com/office/word/2012/wordml" xmlns:w16cex="http://schemas.microsoft.com/office/word/2018/wordml/cex" xmlns:w16cid="http://schemas.microsoft.com/office/word/2016/wordml/cid" xmlns:w16="http://schemas.microsoft.com/office/word/2018/wordml" xmlns:w16sdtdh="http://schemas.microsoft.com/office/word/2020/wordml/sdtdatahash" xmlns:w16sdtfl="http://schemas.microsoft.com/office/word/2024/wordml/sdtformatlock" xmlns:w16se="http://schemas.microsoft.com/office/word/2015/wordml/symex" xmlns:w16du="http://schemas.microsoft.com/office/word/2023/wordml/word16du" mc:Ignorable="w14 w15 w16se w16cid w16 w16cex w16sdtdh w16sdtfl w16du">
+<w:webSettings xmlns:mc="http://schemas.openxmlformats.org/markup-compatibility/2006" xmlns:r="http://schemas.openxmlformats.org/officeDocument/2006/relationships" xmlns:w="http://schemas.openxmlformats.org/wordprocessingml/2006/main" xmlns:w14="http://schemas.microsoft.com/office/word/2010/wordml" xmlns:w15="http://schemas.microsoft.com/office/word/2012/wordml" xmlns:w16cex="http://schemas.microsoft.com/office/word/2018/wordml/cex" xmlns:w16cid="http://schemas.microsoft.com/office/word/2016/wordml/cid" xmlns:w16="http://schemas.microsoft.com/office/word/2018/wordml" xmlns:w16du="http://schemas.microsoft.com/office/word/2023/wordml/word16du" xmlns:w16sdtdh="http://schemas.microsoft.com/office/word/2020/wordml/sdtdatahash" xmlns:w16sdtfl="http://schemas.microsoft.com/office/word/2024/wordml/sdtformatlock" xmlns:w16se="http://schemas.microsoft.com/office/word/2015/wordml/symex" mc:Ignorable="w14 w15 w16se w16cid w16 w16cex w16sdtdh w16sdtfl w16du">
   <w:optimizeForBrowser/>
   <w:allowPNG/>
 </w:webSettings>
@@ -12291,16 +12480,16 @@
 </file>
 
 <file path=customXml/item2.xml><?xml version="1.0" encoding="utf-8"?>
-<b:Sources xmlns:b="http://schemas.openxmlformats.org/officeDocument/2006/bibliography" SelectedStyle="\APA.XSL" StyleName="APA"/>
-</file>
-
-<file path=customXml/item3.xml><?xml version="1.0" encoding="utf-8"?>
 <?mso-contentType ?>
 <FormTemplates xmlns="http://schemas.microsoft.com/sharepoint/v3/contenttype/forms">
   <Display>DocumentLibraryForm</Display>
   <Edit>AssetEditForm</Edit>
   <New>DocumentLibraryForm</New>
 </FormTemplates>
+</file>
+
+<file path=customXml/item3.xml><?xml version="1.0" encoding="utf-8"?>
+<b:Sources xmlns:b="http://schemas.openxmlformats.org/officeDocument/2006/bibliography" SelectedStyle="\APA.XSL" StyleName="APA"/>
 </file>
 
 <file path=customXml/itemProps1.xml><?xml version="1.0" encoding="utf-8"?>
@@ -12312,17 +12501,17 @@
 </file>
 
 <file path=customXml/itemProps2.xml><?xml version="1.0" encoding="utf-8"?>
+<ds:datastoreItem xmlns:ds="http://schemas.openxmlformats.org/officeDocument/2006/customXml" ds:itemID="{E34C63B7-A026-4A37-9535-4FBB4C03A11D}">
+  <ds:schemaRefs>
+    <ds:schemaRef ds:uri="http://schemas.microsoft.com/sharepoint/v3/contenttype/forms"/>
+  </ds:schemaRefs>
+</ds:datastoreItem>
+</file>
+
+<file path=customXml/itemProps3.xml><?xml version="1.0" encoding="utf-8"?>
 <ds:datastoreItem xmlns:ds="http://schemas.openxmlformats.org/officeDocument/2006/customXml" ds:itemID="{355C5113-D031-41DB-A6D8-43CE1A0E6695}">
   <ds:schemaRefs>
     <ds:schemaRef ds:uri="http://schemas.openxmlformats.org/officeDocument/2006/bibliography"/>
   </ds:schemaRefs>
 </ds:datastoreItem>
-</file>
-
-<file path=customXml/itemProps3.xml><?xml version="1.0" encoding="utf-8"?>
-<ds:datastoreItem xmlns:ds="http://schemas.openxmlformats.org/officeDocument/2006/customXml" ds:itemID="{E34C63B7-A026-4A37-9535-4FBB4C03A11D}">
-  <ds:schemaRefs>
-    <ds:schemaRef ds:uri="http://schemas.microsoft.com/sharepoint/v3/contenttype/forms"/>
-  </ds:schemaRefs>
-</ds:datastoreItem>
 </file>
</xml_diff>

<commit_message>
Add Screen 3 and Reflection
</commit_message>
<xml_diff>
--- a/_ IT353 Project_.docx
+++ b/_ IT353 Project_.docx
@@ -562,13 +562,13 @@
               </wp:anchor>
             </w:drawing>
           </mc:Choice>
-          <mc:Fallback xmlns:w16cei="http://schemas.microsoft.com/office/word/2026/wordml/cei">
+          <mc:Fallback>
             <w:pict>
               <v:shapetype w14:anchorId="31BDEDF3" id="_x0000_t202" coordsize="21600,21600" o:spt="202" path="m,l,21600r21600,l21600,xe">
                 <v:stroke joinstyle="miter"/>
                 <v:path gradientshapeok="t" o:connecttype="rect"/>
               </v:shapetype>
-              <v:shape id="Text Box 14" o:spid="_x0000_s1026" type="#_x0000_t202" alt="Report title" style="position:absolute;margin-left:36.5pt;margin-top:90.15pt;width:540pt;height:141.5pt;z-index:-251641856;visibility:visible;mso-wrap-style:square;mso-width-percent:0;mso-height-percent:0;mso-wrap-distance-left:9pt;mso-wrap-distance-top:0;mso-wrap-distance-right:9pt;mso-wrap-distance-bottom:0;mso-position-horizontal:absolute;mso-position-horizontal-relative:page;mso-position-vertical:absolute;mso-position-vertical-relative:margin;mso-width-percent:0;mso-height-percent:0;mso-width-relative:margin;mso-height-relative:margin;v-text-anchor:bottom" o:gfxdata="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" o:allowoverlap="f" filled="f" stroked="f">
+              <v:shape id="Text Box 14" o:spid="_x0000_s1026" type="#_x0000_t202" alt="Report title" style="position:absolute;margin-left:36.5pt;margin-top:90.15pt;width:540pt;height:141.5pt;z-index:-251641856;visibility:visible;mso-wrap-style:square;mso-width-percent:0;mso-height-percent:0;mso-wrap-distance-left:9pt;mso-wrap-distance-top:0;mso-wrap-distance-right:9pt;mso-wrap-distance-bottom:0;mso-position-horizontal:absolute;mso-position-horizontal-relative:page;mso-position-vertical:absolute;mso-position-vertical-relative:margin;mso-width-percent:0;mso-height-percent:0;mso-width-relative:margin;mso-height-relative:margin;v-text-anchor:bottom" o:gfxdata="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" o:allowoverlap="f" filled="f" stroked="f">
                 <v:textbox inset="0,0,0,0">
                   <w:txbxContent>
                     <w:sdt>
@@ -586,7 +586,6 @@
                         <w:dataBinding w:prefixMappings="xmlns:ns0='http://purl.org/dc/elements/1.1/' xmlns:ns1='http://schemas.openxmlformats.org/package/2006/metadata/core-properties' " w:xpath="/ns1:coreProperties[1]/ns0:title[1]" w:storeItemID="{6C3C8BC8-F283-45AE-878A-BAB7291924A1}"/>
                         <w:text/>
                       </w:sdtPr>
-                      <w:sdtEndPr/>
                       <w:sdtContent>
                         <w:p>
                           <w:pPr>
@@ -645,7 +644,6 @@
                           <w:dataBinding w:prefixMappings="xmlns:ns0='http://purl.org/dc/elements/1.1/' xmlns:ns1='http://schemas.openxmlformats.org/package/2006/metadata/core-properties' " w:xpath="/ns1:coreProperties[1]/ns0:subject[1]" w:storeItemID="{6C3C8BC8-F283-45AE-878A-BAB7291924A1}"/>
                           <w:text/>
                         </w:sdtPr>
-                        <w:sdtEndPr/>
                         <w:sdtContent>
                           <w:r>
                             <w:rPr>
@@ -886,49 +884,7 @@
                                 <w14:round/>
                               </w14:textOutline>
                             </w:rPr>
-                            <w:t xml:space="preserve">Phase 2 (Final </w:t>
-                          </w:r>
-                          <w:proofErr w:type="gramStart"/>
-                          <w:r>
-                            <w:rPr>
-                              <w:b w:val="0"/>
-                              <w:bCs w:val="0"/>
-                              <w:color w:val="0070C0"/>
-                              <w:sz w:val="28"/>
-                              <w:szCs w:val="28"/>
-                              <w14:shadow w14:blurRad="38100" w14:dist="19050" w14:dir="2700000" w14:sx="100000" w14:sy="100000" w14:kx="0" w14:ky="0" w14:algn="tl">
-                                <w14:schemeClr w14:val="dk1">
-                                  <w14:alpha w14:val="60000"/>
-                                </w14:schemeClr>
-                              </w14:shadow>
-                              <w14:textOutline w14:w="0" w14:cap="flat" w14:cmpd="sng" w14:algn="ctr">
-                                <w14:noFill/>
-                                <w14:prstDash w14:val="solid"/>
-                                <w14:round/>
-                              </w14:textOutline>
-                            </w:rPr>
-                            <w:t>project  Report</w:t>
-                          </w:r>
-                          <w:proofErr w:type="gramEnd"/>
-                          <w:r>
-                            <w:rPr>
-                              <w:b w:val="0"/>
-                              <w:bCs w:val="0"/>
-                              <w:color w:val="0070C0"/>
-                              <w:sz w:val="28"/>
-                              <w:szCs w:val="28"/>
-                              <w14:shadow w14:blurRad="38100" w14:dist="19050" w14:dir="2700000" w14:sx="100000" w14:sy="100000" w14:kx="0" w14:ky="0" w14:algn="tl">
-                                <w14:schemeClr w14:val="dk1">
-                                  <w14:alpha w14:val="60000"/>
-                                </w14:schemeClr>
-                              </w14:shadow>
-                              <w14:textOutline w14:w="0" w14:cap="flat" w14:cmpd="sng" w14:algn="ctr">
-                                <w14:noFill/>
-                                <w14:prstDash w14:val="solid"/>
-                                <w14:round/>
-                              </w14:textOutline>
-                            </w:rPr>
-                            <w:t>)</w:t>
+                            <w:t>Phase 2 (Final project  Report)</w:t>
                           </w:r>
                           <w:r>
                             <w:rPr>
@@ -1051,7 +1007,6 @@
                         <w:dataBinding w:prefixMappings="xmlns:ns0='http://schemas.microsoft.com/office/2006/coverPageProps'" w:xpath="/ns0:CoverPageProperties[1]/ns0:Abstract[1]" w:storeItemID="{55AF091B-3C7A-41E3-B477-F2FDAA23CFDA}"/>
                         <w:text/>
                       </w:sdtPr>
-                      <w:sdtEndPr/>
                       <w:sdtContent>
                         <w:p>
                           <w:pPr>
@@ -1267,9 +1222,9 @@
               </wp:anchor>
             </w:drawing>
           </mc:Choice>
-          <mc:Fallback xmlns:w16cei="http://schemas.microsoft.com/office/word/2026/wordml/cei">
+          <mc:Fallback>
             <w:pict>
-              <v:shape w14:anchorId="6466823C" id="Text Box 2" o:spid="_x0000_s1027" type="#_x0000_t202" style="position:absolute;margin-left:40.3pt;margin-top:4.65pt;width:545.45pt;height:87.55pt;z-index:251679744;visibility:visible;mso-wrap-style:square;mso-width-percent:0;mso-height-percent:0;mso-wrap-distance-left:9pt;mso-wrap-distance-top:7.2pt;mso-wrap-distance-right:9pt;mso-wrap-distance-bottom:7.2pt;mso-position-horizontal:absolute;mso-position-horizontal-relative:page;mso-position-vertical:absolute;mso-position-vertical-relative:text;mso-width-percent:0;mso-height-percent:0;mso-width-relative:margin;mso-height-relative:margin;v-text-anchor:top" o:gfxdata="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" filled="f" stroked="f">
+              <v:shape w14:anchorId="6466823C" id="Text Box 2" o:spid="_x0000_s1027" type="#_x0000_t202" style="position:absolute;margin-left:40.3pt;margin-top:4.65pt;width:545.45pt;height:87.55pt;z-index:251679744;visibility:visible;mso-wrap-style:square;mso-width-percent:0;mso-height-percent:0;mso-wrap-distance-left:9pt;mso-wrap-distance-top:7.2pt;mso-wrap-distance-right:9pt;mso-wrap-distance-bottom:7.2pt;mso-position-horizontal:absolute;mso-position-horizontal-relative:page;mso-position-vertical:absolute;mso-position-vertical-relative:text;mso-width-percent:0;mso-height-percent:0;mso-width-relative:margin;mso-height-relative:margin;v-text-anchor:top" o:gfxdata="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" filled="f" stroked="f">
                 <v:textbox>
                   <w:txbxContent>
                     <w:p>
@@ -1972,10 +1927,10 @@
                   </wp:anchor>
                 </w:drawing>
               </mc:Choice>
-              <mc:Fallback xmlns:w16cei="http://schemas.microsoft.com/office/word/2026/wordml/cei">
+              <mc:Fallback>
                 <w:pict>
-                  <v:group w14:anchorId="31857F9A" id="Group 198" o:spid="_x0000_s1028" style="position:absolute;margin-left:-101.8pt;margin-top:331.65pt;width:518.25pt;height:308.6pt;z-index:251677696;mso-wrap-distance-left:14.4pt;mso-wrap-distance-top:3.6pt;mso-wrap-distance-right:14.4pt;mso-wrap-distance-bottom:3.6pt;mso-position-horizontal-relative:margin;mso-position-vertical-relative:margin;mso-width-relative:margin;mso-height-relative:margin" coordorigin=",228" coordsize="35784,21867" o:gfxdata="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">
-                    <v:rect id="Rectangle 199" o:spid="_x0000_s1029" style="position:absolute;top:228;width:35674;height:1949;visibility:visible;mso-wrap-style:square;v-text-anchor:middle" o:gfxdata="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" fillcolor="#ef4623 [3204]" stroked="f" strokeweight="2pt">
+                  <v:group w14:anchorId="31857F9A" id="Group 198" o:spid="_x0000_s1028" style="position:absolute;margin-left:-101.8pt;margin-top:331.65pt;width:518.25pt;height:308.6pt;z-index:251677696;mso-wrap-distance-left:14.4pt;mso-wrap-distance-top:3.6pt;mso-wrap-distance-right:14.4pt;mso-wrap-distance-bottom:3.6pt;mso-position-horizontal-relative:margin;mso-position-vertical-relative:margin;mso-width-relative:margin;mso-height-relative:margin" coordorigin=",228" coordsize="35784,21867" o:gfxdata="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">
+                    <v:rect id="Rectangle 199" o:spid="_x0000_s1029" style="position:absolute;top:228;width:35674;height:1949;visibility:visible;mso-wrap-style:square;v-text-anchor:middle" o:gfxdata="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" fillcolor="#ef4623 [3204]" stroked="f" strokeweight="2pt">
                       <v:textbox>
                         <w:txbxContent>
                           <w:p>
@@ -2004,7 +1959,7 @@
                         </w:txbxContent>
                       </v:textbox>
                     </v:rect>
-                    <v:shape id="Text Box 200" o:spid="_x0000_s1030" type="#_x0000_t202" style="position:absolute;top:2187;width:35784;height:19908;visibility:visible;mso-wrap-style:square;v-text-anchor:top" o:gfxdata="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" filled="f" stroked="f" strokeweight=".5pt">
+                    <v:shape id="Text Box 200" o:spid="_x0000_s1030" type="#_x0000_t202" style="position:absolute;top:2187;width:35784;height:19908;visibility:visible;mso-wrap-style:square;v-text-anchor:top" o:gfxdata="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" filled="f" stroked="f" strokeweight=".5pt">
                       <v:textbox inset=",7.2pt,,0">
                         <w:txbxContent>
                           <w:p>
@@ -3005,11 +2960,7 @@
               </mc:Choice>
               <mc:Fallback>
                 <w:pict>
-                  <v:shapetype w14:anchorId="7CBAAF0B" id="_x0000_t202" coordsize="21600,21600" o:spt="202" path="m,l,21600r21600,l21600,xe">
-                    <v:stroke joinstyle="miter"/>
-                    <v:path gradientshapeok="t" o:connecttype="rect"/>
-                  </v:shapetype>
-                  <v:shape id="Text Box 15" o:spid="_x0000_s1031" type="#_x0000_t202" alt="contact info" style="position:absolute;margin-left:36.5pt;margin-top:226.65pt;width:540pt;height:114pt;z-index:251675648;visibility:visible;mso-wrap-style:square;mso-width-percent:1282;mso-height-percent:0;mso-wrap-distance-left:9pt;mso-wrap-distance-top:0;mso-wrap-distance-right:9pt;mso-wrap-distance-bottom:0;mso-position-horizontal:absolute;mso-position-horizontal-relative:page;mso-position-vertical:absolute;mso-position-vertical-relative:margin;mso-width-percent:1282;mso-height-percent:0;mso-width-relative:margin;mso-height-relative:margin;v-text-anchor:bottom" o:gfxdata="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" o:allowoverlap="f" filled="f" stroked="f" strokeweight=".5pt">
+                  <v:shape w14:anchorId="7CBAAF0B" id="Text Box 15" o:spid="_x0000_s1031" type="#_x0000_t202" alt="contact info" style="position:absolute;margin-left:36.5pt;margin-top:226.65pt;width:540pt;height:114pt;z-index:251675648;visibility:visible;mso-wrap-style:square;mso-width-percent:1282;mso-height-percent:0;mso-wrap-distance-left:9pt;mso-wrap-distance-top:0;mso-wrap-distance-right:9pt;mso-wrap-distance-bottom:0;mso-position-horizontal:absolute;mso-position-horizontal-relative:page;mso-position-vertical:absolute;mso-position-vertical-relative:margin;mso-width-percent:1282;mso-height-percent:0;mso-width-relative:margin;mso-height-relative:margin;v-text-anchor:bottom" o:gfxdata="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" o:allowoverlap="f" filled="f" stroked="f" strokeweight=".5pt">
                     <v:textbox inset="0,0,0,0">
                       <w:txbxContent>
                         <w:p>
@@ -4842,9 +4793,9 @@
               </wp:anchor>
             </w:drawing>
           </mc:Choice>
-          <mc:Fallback xmlns:w16cei="http://schemas.microsoft.com/office/word/2026/wordml/cei">
+          <mc:Fallback>
             <w:pict>
-              <v:shape w14:anchorId="54D30FE5" id="Text Box 5" o:spid="_x0000_s1032" type="#_x0000_t202" alt="Sidebar" style="position:absolute;margin-left:35.8pt;margin-top:-4.85pt;width:98.25pt;height:181.45pt;z-index:251681792;visibility:visible;mso-wrap-style:square;mso-width-percent:250;mso-height-percent:950;mso-wrap-distance-left:14.4pt;mso-wrap-distance-top:0;mso-wrap-distance-right:14.4pt;mso-wrap-distance-bottom:3in;mso-position-horizontal:absolute;mso-position-horizontal-relative:page;mso-position-vertical:absolute;mso-position-vertical-relative:margin;mso-width-percent:250;mso-height-percent:950;mso-width-relative:margin;mso-height-relative:margin;v-text-anchor:top" o:gfxdata="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" filled="f" stroked="f" strokeweight=".5pt">
+              <v:shape w14:anchorId="54D30FE5" id="Text Box 5" o:spid="_x0000_s1032" type="#_x0000_t202" alt="Sidebar" style="position:absolute;margin-left:35.8pt;margin-top:-4.85pt;width:98.25pt;height:181.45pt;z-index:251681792;visibility:visible;mso-wrap-style:square;mso-width-percent:250;mso-height-percent:950;mso-wrap-distance-left:14.4pt;mso-wrap-distance-top:0;mso-wrap-distance-right:14.4pt;mso-wrap-distance-bottom:3in;mso-position-horizontal:absolute;mso-position-horizontal-relative:page;mso-position-vertical:absolute;mso-position-vertical-relative:margin;mso-width-percent:250;mso-height-percent:950;mso-width-relative:margin;mso-height-relative:margin;v-text-anchor:top" o:gfxdata="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" filled="f" stroked="f" strokeweight=".5pt">
                 <v:textbox inset="3.6pt,0,3.6pt,0">
                   <w:txbxContent>
                     <w:p/>
@@ -5005,9 +4956,9 @@
               </wp:anchor>
             </w:drawing>
           </mc:Choice>
-          <mc:Fallback xmlns:w16cei="http://schemas.microsoft.com/office/word/2026/wordml/cei">
+          <mc:Fallback>
             <w:pict>
-              <v:shape w14:anchorId="1D5252A4" id="Text Box 574844441" o:spid="_x0000_s1033" type="#_x0000_t202" alt="Sidebar" style="position:absolute;margin-left:47.8pt;margin-top:7.15pt;width:98.25pt;height:181.45pt;z-index:251689984;visibility:visible;mso-wrap-style:square;mso-width-percent:250;mso-height-percent:950;mso-wrap-distance-left:14.4pt;mso-wrap-distance-top:0;mso-wrap-distance-right:14.4pt;mso-wrap-distance-bottom:3in;mso-position-horizontal:absolute;mso-position-horizontal-relative:page;mso-position-vertical:absolute;mso-position-vertical-relative:margin;mso-width-percent:250;mso-height-percent:950;mso-width-relative:margin;mso-height-relative:margin;v-text-anchor:top" o:gfxdata="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" filled="f" stroked="f" strokeweight=".5pt">
+              <v:shape w14:anchorId="1D5252A4" id="Text Box 574844441" o:spid="_x0000_s1033" type="#_x0000_t202" alt="Sidebar" style="position:absolute;margin-left:47.8pt;margin-top:7.15pt;width:98.25pt;height:181.45pt;z-index:251689984;visibility:visible;mso-wrap-style:square;mso-width-percent:250;mso-height-percent:950;mso-wrap-distance-left:14.4pt;mso-wrap-distance-top:0;mso-wrap-distance-right:14.4pt;mso-wrap-distance-bottom:3in;mso-position-horizontal:absolute;mso-position-horizontal-relative:page;mso-position-vertical:absolute;mso-position-vertical-relative:margin;mso-width-percent:250;mso-height-percent:950;mso-width-relative:margin;mso-height-relative:margin;v-text-anchor:top" o:gfxdata="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" filled="f" stroked="f" strokeweight=".5pt">
                 <v:textbox inset="3.6pt,0,3.6pt,0">
                   <w:txbxContent>
                     <w:p>
@@ -5129,6 +5080,12 @@
       </w:r>
     </w:p>
     <w:p>
+      <w:pPr>
+        <w:rPr>
+          <w:color w:val="EE0000"/>
+          <w:rtl/>
+        </w:rPr>
+      </w:pPr>
       <w:r>
         <w:t>Develop a Gantt Chart for the project, including major development activities, durations, and dependencies.</w:t>
       </w:r>
@@ -5153,16 +5110,66 @@
         </w:rPr>
         <w:t xml:space="preserve"> marks]</w:t>
       </w:r>
+    </w:p>
+    <w:p>
+      <w:pPr>
+        <w:rPr>
+          <w:color w:val="EE0000"/>
+          <w:rtl/>
+        </w:rPr>
+      </w:pPr>
+    </w:p>
+    <w:p>
+      <w:pPr>
+        <w:rPr>
+          <w:rtl/>
+        </w:rPr>
+      </w:pPr>
       <w:r>
         <w:br/>
       </w:r>
+    </w:p>
+    <w:p>
+      <w:pPr>
+        <w:rPr>
+          <w:rtl/>
+        </w:rPr>
+      </w:pPr>
+    </w:p>
+    <w:p>
+      <w:pPr>
+        <w:rPr>
+          <w:rtl/>
+        </w:rPr>
+      </w:pPr>
     </w:p>
     <w:p>
       <w:pPr>
         <w:rPr>
           <w:b/>
           <w:bCs/>
-          <w:lang w:val="en-GB"/>
+          <w:sz w:val="28"/>
+          <w:szCs w:val="28"/>
+          <w:rtl/>
+        </w:rPr>
+      </w:pPr>
+      <w:r>
+        <w:rPr>
+          <w:b/>
+          <w:bCs/>
+          <w:sz w:val="28"/>
+          <w:szCs w:val="28"/>
+        </w:rPr>
+        <w:t>Gantt Chart</w:t>
+      </w:r>
+    </w:p>
+    <w:p/>
+    <w:p>
+      <w:pPr>
+        <w:rPr>
+          <w:rFonts w:eastAsiaTheme="minorEastAsia"/>
+          <w:color w:val="000000"/>
+          <w:rtl/>
         </w:rPr>
       </w:pPr>
       <w:r>
@@ -5225,164 +5232,125 @@
       <w:r>
         <w:br/>
       </w:r>
-      <w:r>
+    </w:p>
+    <w:p>
+      <w:pPr>
+        <w:spacing w:after="240"/>
+        <w:rPr>
+          <w:rtl/>
+        </w:rPr>
+      </w:pPr>
+    </w:p>
+    <w:p>
+      <w:pPr>
+        <w:rPr>
+          <w:rFonts w:eastAsiaTheme="minorEastAsia"/>
+        </w:rPr>
+      </w:pPr>
+    </w:p>
+    <w:p>
+      <w:pPr>
+        <w:rPr>
+          <w:rtl/>
+          <w:lang w:val="en-GB"/>
+        </w:rPr>
+      </w:pPr>
+    </w:p>
+    <w:p>
+      <w:pPr>
+        <w:rPr>
+          <w:rtl/>
+          <w:lang w:val="en-GB"/>
+        </w:rPr>
+      </w:pPr>
+    </w:p>
+    <w:p>
+      <w:pPr>
+        <w:rPr>
+          <w:rtl/>
+          <w:lang w:val="en-GB"/>
+        </w:rPr>
+      </w:pPr>
+    </w:p>
+    <w:p>
+      <w:pPr>
+        <w:rPr>
+          <w:rtl/>
+          <w:lang w:val="en-GB"/>
+        </w:rPr>
+      </w:pPr>
+    </w:p>
+    <w:p>
+      <w:pPr>
+        <w:rPr>
+          <w:rtl/>
+          <w:lang w:val="en-GB"/>
+        </w:rPr>
+      </w:pPr>
+    </w:p>
+    <w:p>
+      <w:pPr>
         <w:rPr>
           <w:b/>
           <w:bCs/>
-          <w:lang w:val="en-GB"/>
-        </w:rPr>
-        <w:t xml:space="preserve">Reflection </w:t>
-      </w:r>
-    </w:p>
-    <w:p>
-      <w:pPr>
-        <w:rPr>
-          <w:rFonts w:eastAsiaTheme="minorEastAsia"/>
-          <w:color w:val="000000"/>
+          <w:sz w:val="32"/>
+          <w:szCs w:val="32"/>
           <w:rtl/>
         </w:rPr>
       </w:pPr>
       <w:r>
         <w:rPr>
-          <w:rFonts w:ascii="Arial" w:eastAsiaTheme="minorEastAsia" w:hAnsi="Arial" w:cs="Arial"/>
-          <w:color w:val="000000"/>
-          <w:sz w:val="22"/>
-          <w:szCs w:val="22"/>
-        </w:rPr>
-        <w:t>When I first started this project , I thought creating a Gantt chart would be simple. I expected it to involve just adding tasks with dates, but once I began using TeamGantt, I realised there was much more to it. I had to think carefully about the order of each task, estimate realistic durations, and connect the activities using dependencies. At the beginning, I made several mistakes with the dates and task relationships, which made the schedule look confusing. Instead of giving up, I went back, reviewed everything, and kept improving it until it made sense</w:t>
-      </w:r>
-      <w:r>
-        <w:rPr>
-          <w:rFonts w:ascii="Arial" w:eastAsiaTheme="minorEastAsia" w:hAnsi="Arial" w:cs="Arial"/>
-          <w:color w:val="000000"/>
-          <w:sz w:val="22"/>
-          <w:szCs w:val="22"/>
+          <w:b/>
+          <w:bCs/>
+          <w:sz w:val="32"/>
+          <w:szCs w:val="32"/>
+        </w:rPr>
+        <w:t>Reflection</w:t>
+      </w:r>
+      <w:r>
+        <w:rPr>
+          <w:rFonts w:hint="cs"/>
+          <w:b/>
+          <w:bCs/>
+          <w:sz w:val="32"/>
+          <w:szCs w:val="32"/>
           <w:rtl/>
         </w:rPr>
-        <w:t>.</w:t>
-      </w:r>
-    </w:p>
-    <w:p>
-      <w:pPr>
-        <w:rPr>
-          <w:color w:val="000000"/>
-          <w:rtl/>
-        </w:rPr>
-      </w:pPr>
-    </w:p>
-    <w:p>
-      <w:pPr>
-        <w:rPr>
-          <w:rFonts w:eastAsiaTheme="minorEastAsia"/>
-          <w:color w:val="000000"/>
-        </w:rPr>
-      </w:pPr>
-      <w:r>
-        <w:rPr>
-          <w:rFonts w:ascii="Arial" w:eastAsiaTheme="minorEastAsia" w:hAnsi="Arial" w:cs="Arial"/>
-          <w:color w:val="000000"/>
-          <w:sz w:val="22"/>
-          <w:szCs w:val="22"/>
-        </w:rPr>
-        <w:t>Another challenge was working with the project deadline. I had to adjust the schedule several times because I wanted all the tasks to finish before the submission date while also taking weekends into account. This taught me that effective planning is flexible and sometimes requires making changes until everything fits together logically, and that small adjustments can prevent bigger problems</w:t>
-      </w:r>
-      <w:r>
-        <w:rPr>
-          <w:rFonts w:ascii="Arial" w:eastAsiaTheme="minorEastAsia" w:hAnsi="Arial" w:cs="Arial"/>
-          <w:color w:val="000000"/>
-          <w:sz w:val="22"/>
-          <w:szCs w:val="22"/>
-          <w:rtl/>
-        </w:rPr>
-        <w:t>.</w:t>
-      </w:r>
-    </w:p>
-    <w:p>
-      <w:pPr>
-        <w:rPr>
-          <w:color w:val="000000"/>
-          <w:rtl/>
-        </w:rPr>
-      </w:pPr>
-    </w:p>
-    <w:p>
-      <w:pPr>
-        <w:rPr>
-          <w:rFonts w:eastAsiaTheme="minorEastAsia"/>
-          <w:color w:val="000000"/>
-        </w:rPr>
-      </w:pPr>
-      <w:r>
-        <w:rPr>
-          <w:rFonts w:ascii="Arial" w:eastAsiaTheme="minorEastAsia" w:hAnsi="Arial" w:cs="Arial"/>
-          <w:color w:val="000000"/>
-          <w:sz w:val="22"/>
-          <w:szCs w:val="22"/>
-        </w:rPr>
-        <w:lastRenderedPageBreak/>
-        <w:t>Using TeamGantt was a new experience for me. At first, I found the interface confusing, especially when adding dependencies and adjusting task durations. However, after spending more time practising, I became more comfortable with it. By the end of the assignment, I felt much more confident and understood how project management tools help organise work and track progress</w:t>
-      </w:r>
-      <w:r>
-        <w:rPr>
-          <w:rFonts w:ascii="Arial" w:eastAsiaTheme="minorEastAsia" w:hAnsi="Arial" w:cs="Arial"/>
-          <w:color w:val="000000"/>
-          <w:sz w:val="22"/>
-          <w:szCs w:val="22"/>
-          <w:rtl/>
-        </w:rPr>
-        <w:t>.</w:t>
-      </w:r>
-    </w:p>
-    <w:p>
-      <w:pPr>
-        <w:rPr>
-          <w:rFonts w:eastAsiaTheme="minorEastAsia"/>
-          <w:color w:val="000000"/>
-          <w:rtl/>
-        </w:rPr>
-      </w:pPr>
-      <w:r>
-        <w:rPr>
-          <w:rFonts w:ascii="Arial" w:eastAsiaTheme="minorEastAsia" w:hAnsi="Arial" w:cs="Arial"/>
-          <w:color w:val="000000"/>
-          <w:sz w:val="22"/>
-          <w:szCs w:val="22"/>
-        </w:rPr>
-        <w:t>Overall, this assignment taught me more than how to create a Gantt chart. It showed me the importance of planning before starting any project, thinking logically about task sequences, and paying attention to detail. I believe these are practical skills that I can use not only in my university projects but also in my future career, especially when managing teams and deadlines. Looking back, I am satisfied with the final result because I learned something new and improved my problem-solving and planning skills throughout the process</w:t>
-      </w:r>
-      <w:r>
-        <w:rPr>
-          <w:rFonts w:ascii="Arial" w:eastAsiaTheme="minorEastAsia" w:hAnsi="Arial" w:cs="Arial"/>
-          <w:color w:val="000000"/>
-          <w:sz w:val="22"/>
-          <w:szCs w:val="22"/>
-          <w:rtl/>
-        </w:rPr>
-        <w:t>.</w:t>
-      </w:r>
-    </w:p>
-    <w:p>
-      <w:pPr>
-        <w:spacing w:after="240"/>
-        <w:rPr>
-          <w:rtl/>
-        </w:rPr>
-      </w:pPr>
-    </w:p>
-    <w:p>
-      <w:pPr>
-        <w:rPr>
-          <w:rFonts w:eastAsiaTheme="minorEastAsia"/>
-        </w:rPr>
-      </w:pPr>
-    </w:p>
-    <w:p>
-      <w:pPr>
-        <w:rPr>
-          <w:lang w:val="en-GB"/>
-        </w:rPr>
-      </w:pPr>
-    </w:p>
+        <w:t>:</w:t>
+      </w:r>
+    </w:p>
+    <w:p/>
+    <w:p>
+      <w:r>
+        <w:t>When I first started this project , I thought creating a Gantt chart would be simple. I expected it to involve just adding tasks with dates, but once I began using TeamGantt, I realised there was much more to it. I had to think carefully about the order of each task, estimate realistic durations, and connect the activities using dependencies. At the beginning, I made several mistakes with the dates and task relationships, which made the schedule look confusing. Instead of giving up, I went back, reviewed everything, and kept improving it until it made sense.</w:t>
+      </w:r>
+    </w:p>
+    <w:p>
+      <w:r>
+        <w:t> </w:t>
+      </w:r>
+    </w:p>
+    <w:p>
+      <w:r>
+        <w:t>Another challenge was working with the project deadline. I had to adjust the schedule several times because I wanted all the tasks to finish before the submission date while also taking weekends into account. This taught me that effective planning is flexible and sometimes requires making changes until everything fits together logically, and that small adjustments can prevent bigger problems.</w:t>
+      </w:r>
+    </w:p>
+    <w:p>
+      <w:r>
+        <w:t> </w:t>
+      </w:r>
+    </w:p>
+    <w:p>
+      <w:r>
+        <w:t>Using TeamGantt was a new experience for me. At first, I found the interface confusing, especially when adding dependencies and adjusting task durations. However, after spending more time practising, I became more comfortable with it. By the end of the assignment, I felt much more confident and understood how project management tools help organise work and track progress.</w:t>
+      </w:r>
+    </w:p>
+    <w:p>
+      <w:r>
+        <w:t>Overall, this assignment taught me more than how to create a Gantt chart. It showed me the importance of planning before starting any project, thinking logically about task sequences, and paying attention to detail. I believe these are practical skills that I can use not only in my university projects but also in my future career, especially when managing teams and deadlines. Looking back, I am satisfied with the final result because I learned something new and improved my problem-solving and planning skills throughout the process.</w:t>
+      </w:r>
+    </w:p>
+    <w:p/>
     <w:p>
       <w:pPr>
         <w:pStyle w:val="Heading1"/>
@@ -5492,6 +5460,10 @@
         </w:rPr>
       </w:pPr>
       <w:r>
+        <w:rPr>
+          <w:sz w:val="32"/>
+          <w:szCs w:val="32"/>
+        </w:rPr>
         <w:br/>
       </w:r>
       <w:r>
@@ -5507,228 +5479,135 @@
     <w:p>
       <w:pPr>
         <w:rPr>
-          <w:sz w:val="28"/>
-          <w:szCs w:val="28"/>
-          <w:rtl/>
-        </w:rPr>
-      </w:pPr>
-      <w:r>
-        <w:rPr>
-          <w:sz w:val="28"/>
-          <w:szCs w:val="28"/>
-        </w:rPr>
-        <w:t> Evolutionary Prototyping</w:t>
-      </w:r>
-    </w:p>
-    <w:p>
-      <w:pPr>
-        <w:rPr>
           <w:b/>
           <w:bCs/>
-          <w:sz w:val="28"/>
-          <w:szCs w:val="28"/>
+          <w:sz w:val="32"/>
+          <w:szCs w:val="32"/>
           <w:rtl/>
         </w:rPr>
       </w:pPr>
-      <w:r>
+    </w:p>
+    <w:p>
+      <w:pPr>
+        <w:pStyle w:val="ListParagraph"/>
+        <w:numPr>
+          <w:ilvl w:val="0"/>
+          <w:numId w:val="25"/>
+        </w:numPr>
+        <w:rPr>
+          <w:rtl/>
+        </w:rPr>
+      </w:pPr>
+      <w:r>
+        <w:t>Evolutionary Prototyping</w:t>
+      </w:r>
+    </w:p>
+    <w:p>
+      <w:pPr>
+        <w:rPr>
+          <w:rtl/>
+        </w:rPr>
+      </w:pPr>
+    </w:p>
+    <w:p>
+      <w:pPr>
         <w:rPr>
           <w:b/>
           <w:bCs/>
-          <w:sz w:val="28"/>
-          <w:szCs w:val="28"/>
-        </w:rPr>
-        <w:t>Justification</w:t>
-      </w:r>
-    </w:p>
-    <w:p>
-      <w:r>
-        <w:t>Evolutionary Prototyping was selected because it allows the system to be improved step by step based on user feedback. Since the Student Activities Management System includes different features such as browsing activities, registration, notifications, attendance tracking, and activity management, this approach is more suitable. It helps the team understand user needs better, make improvements during development, and reduce the chance of creating a system that does not meet user expectations. </w:t>
-      </w:r>
-    </w:p>
-    <w:p>
-      <w:pPr>
-        <w:rPr>
-          <w:lang w:val="en-US"/>
-        </w:rPr>
-      </w:pPr>
-    </w:p>
-    <w:p>
-      <w:pPr>
-        <w:rPr>
-          <w:sz w:val="28"/>
-          <w:szCs w:val="28"/>
+          <w:sz w:val="32"/>
+          <w:szCs w:val="32"/>
+          <w:rtl/>
         </w:rPr>
       </w:pPr>
       <w:r>
         <w:rPr>
           <w:b/>
           <w:bCs/>
-          <w:sz w:val="28"/>
-          <w:szCs w:val="28"/>
-        </w:rPr>
-        <w:t>Low-Fidelity Prototype Screens </w:t>
-      </w:r>
-    </w:p>
-    <w:p>
-      <w:pPr>
-        <w:rPr>
-          <w:lang w:val="en-US"/>
-        </w:rPr>
-      </w:pPr>
-    </w:p>
-    <w:p>
-      <w:pPr>
-        <w:rPr>
-          <w:lang w:val="en-US"/>
-        </w:rPr>
-      </w:pPr>
-    </w:p>
-    <w:p>
-      <w:pPr>
-        <w:rPr>
-          <w:lang w:val="en-US"/>
-        </w:rPr>
-      </w:pPr>
-    </w:p>
-    <w:p>
-      <w:pPr>
-        <w:rPr>
-          <w:lang w:val="en-US"/>
-        </w:rPr>
-      </w:pPr>
-    </w:p>
-    <w:p>
-      <w:pPr>
-        <w:rPr>
-          <w:lang w:val="en-US"/>
-        </w:rPr>
-      </w:pPr>
-    </w:p>
-    <w:p>
-      <w:pPr>
-        <w:rPr>
-          <w:lang w:val="en-US"/>
-        </w:rPr>
-      </w:pPr>
-    </w:p>
-    <w:p>
-      <w:pPr>
-        <w:rPr>
-          <w:lang w:val="en-US"/>
-        </w:rPr>
-      </w:pPr>
-    </w:p>
-    <w:p>
-      <w:pPr>
-        <w:rPr>
-          <w:lang w:val="en-US"/>
-        </w:rPr>
-      </w:pPr>
-    </w:p>
-    <w:p>
-      <w:pPr>
-        <w:rPr>
-          <w:lang w:val="en-US"/>
-        </w:rPr>
-      </w:pPr>
-    </w:p>
-    <w:p>
-      <w:pPr>
-        <w:rPr>
-          <w:lang w:val="en-US"/>
-        </w:rPr>
-      </w:pPr>
-    </w:p>
-    <w:p>
-      <w:pPr>
-        <w:rPr>
-          <w:lang w:val="en-US"/>
-        </w:rPr>
-      </w:pPr>
-    </w:p>
-    <w:p>
-      <w:pPr>
-        <w:rPr>
-          <w:lang w:val="en-US"/>
-        </w:rPr>
-      </w:pPr>
-    </w:p>
-    <w:p>
-      <w:pPr>
-        <w:rPr>
-          <w:lang w:val="en-US"/>
-        </w:rPr>
-      </w:pPr>
-    </w:p>
-    <w:p>
-      <w:pPr>
-        <w:rPr>
-          <w:lang w:val="en-US"/>
-        </w:rPr>
-      </w:pPr>
-    </w:p>
-    <w:p>
-      <w:pPr>
-        <w:rPr>
-          <w:lang w:val="en-US"/>
-        </w:rPr>
-      </w:pPr>
-    </w:p>
-    <w:p>
-      <w:pPr>
-        <w:rPr>
-          <w:lang w:val="en-US"/>
-        </w:rPr>
-      </w:pPr>
-    </w:p>
-    <w:p>
-      <w:pPr>
-        <w:rPr>
-          <w:lang w:val="en-US"/>
-        </w:rPr>
-      </w:pPr>
-    </w:p>
-    <w:p>
-      <w:pPr>
-        <w:rPr>
-          <w:lang w:val="en-US"/>
-        </w:rPr>
-      </w:pPr>
-    </w:p>
-    <w:p>
-      <w:pPr>
-        <w:rPr>
-          <w:lang w:val="en-US"/>
-        </w:rPr>
-      </w:pPr>
+          <w:sz w:val="32"/>
+          <w:szCs w:val="32"/>
+        </w:rPr>
+        <w:t>Justification</w:t>
+      </w:r>
     </w:p>
     <w:p>
       <w:pPr>
         <w:rPr>
           <w:b/>
           <w:bCs/>
+          <w:sz w:val="32"/>
+          <w:szCs w:val="32"/>
           <w:rtl/>
+        </w:rPr>
+      </w:pPr>
+    </w:p>
+    <w:p>
+      <w:r>
+        <w:t>Evolutionary Prototyping was selected because it allows the system to be improved step by step based on user feedback. Since the Student Activities Management System includes different features such as browsing activities, registration, notifications, attendance tracking, and activity management, this approach is more suitable. It helps the team understand user needs better, make improvements during development, and reduce the chance of creating a system that does not meet user expectations. </w:t>
+      </w:r>
+    </w:p>
+    <w:p/>
+    <w:p>
+      <w:pPr>
+        <w:rPr>
+          <w:sz w:val="32"/>
+          <w:szCs w:val="32"/>
         </w:rPr>
       </w:pPr>
       <w:r>
         <w:rPr>
           <w:b/>
           <w:bCs/>
+          <w:sz w:val="32"/>
+          <w:szCs w:val="32"/>
+        </w:rPr>
+        <w:t>Low-Fidelity Prototype Screens </w:t>
+      </w:r>
+    </w:p>
+    <w:p/>
+    <w:p/>
+    <w:p/>
+    <w:p/>
+    <w:p/>
+    <w:p/>
+    <w:p/>
+    <w:p/>
+    <w:p/>
+    <w:p/>
+    <w:p/>
+    <w:p>
+      <w:pPr>
+        <w:rPr>
+          <w:rtl/>
+        </w:rPr>
+      </w:pPr>
+    </w:p>
+    <w:p/>
+    <w:p/>
+    <w:p>
+      <w:pPr>
+        <w:rPr>
+          <w:b/>
+          <w:bCs/>
+          <w:sz w:val="32"/>
+          <w:szCs w:val="32"/>
+          <w:rtl/>
+        </w:rPr>
+      </w:pPr>
+      <w:r>
+        <w:rPr>
+          <w:b/>
+          <w:bCs/>
+          <w:sz w:val="32"/>
+          <w:szCs w:val="32"/>
         </w:rPr>
         <w:lastRenderedPageBreak/>
         <w:t>Screen 1: Home</w:t>
       </w:r>
     </w:p>
     <w:p>
-      <w:pPr>
-        <w:rPr>
-          <w:lang w:val="en-US"/>
-        </w:rPr>
-      </w:pPr>
       <w:r>
         <w:rPr>
           <w:noProof/>
-          <w:lang w:val="en-US"/>
         </w:rPr>
         <w:drawing>
           <wp:inline distT="0" distB="0" distL="0" distR="0" wp14:anchorId="7CE120E1" wp14:editId="7FFF6D56">
@@ -5767,60 +5646,32 @@
         </w:drawing>
       </w:r>
     </w:p>
-    <w:p>
-      <w:pPr>
-        <w:rPr>
-          <w:lang w:val="en-US"/>
-        </w:rPr>
-      </w:pPr>
-    </w:p>
-    <w:p>
-      <w:pPr>
-        <w:rPr>
-          <w:lang w:val="en-US"/>
-        </w:rPr>
-      </w:pPr>
-    </w:p>
-    <w:p>
-      <w:pPr>
-        <w:rPr>
-          <w:lang w:val="en-US"/>
-        </w:rPr>
-      </w:pPr>
-    </w:p>
+    <w:p/>
+    <w:p/>
+    <w:p/>
     <w:p>
       <w:pPr>
         <w:rPr>
           <w:b/>
           <w:bCs/>
+          <w:sz w:val="32"/>
+          <w:szCs w:val="32"/>
         </w:rPr>
       </w:pPr>
       <w:r>
         <w:rPr>
           <w:b/>
           <w:bCs/>
-        </w:rPr>
-        <w:lastRenderedPageBreak/>
-        <w:t>Screen 2: My Activitie</w:t>
-      </w:r>
-      <w:r>
-        <w:rPr>
-          <w:b/>
-          <w:bCs/>
-        </w:rPr>
-        <w:t>s</w:t>
-      </w:r>
-    </w:p>
-    <w:p>
-      <w:pPr>
-        <w:rPr>
-          <w:lang w:val="en-US"/>
-        </w:rPr>
-      </w:pPr>
+          <w:sz w:val="32"/>
+          <w:szCs w:val="32"/>
+        </w:rPr>
+        <w:t>Screen 2: My Activities</w:t>
+      </w:r>
+    </w:p>
+    <w:p>
       <w:r>
         <w:rPr>
           <w:noProof/>
-          <w:lang w:val="en-US"/>
         </w:rPr>
         <w:drawing>
           <wp:inline distT="0" distB="0" distL="0" distR="0" wp14:anchorId="69989472" wp14:editId="3D8B5DEE">
@@ -5862,9 +5713,193 @@
     <w:p>
       <w:pPr>
         <w:rPr>
-          <w:lang w:val="en-US"/>
-        </w:rPr>
-      </w:pPr>
+          <w:rtl/>
+        </w:rPr>
+      </w:pPr>
+    </w:p>
+    <w:p>
+      <w:pPr>
+        <w:rPr>
+          <w:rtl/>
+        </w:rPr>
+      </w:pPr>
+    </w:p>
+    <w:p>
+      <w:pPr>
+        <w:rPr>
+          <w:rtl/>
+        </w:rPr>
+      </w:pPr>
+    </w:p>
+    <w:p>
+      <w:pPr>
+        <w:rPr>
+          <w:rtl/>
+        </w:rPr>
+      </w:pPr>
+    </w:p>
+    <w:p>
+      <w:pPr>
+        <w:rPr>
+          <w:rtl/>
+        </w:rPr>
+      </w:pPr>
+    </w:p>
+    <w:p>
+      <w:pPr>
+        <w:rPr>
+          <w:b/>
+          <w:bCs/>
+          <w:sz w:val="32"/>
+          <w:szCs w:val="32"/>
+        </w:rPr>
+      </w:pPr>
+      <w:r>
+        <w:rPr>
+          <w:b/>
+          <w:bCs/>
+          <w:sz w:val="32"/>
+          <w:szCs w:val="32"/>
+        </w:rPr>
+        <w:t>Screen 3: Activity Details &amp; Registration</w:t>
+      </w:r>
+    </w:p>
+    <w:p>
+      <w:pPr>
+        <w:rPr>
+          <w:rtl/>
+        </w:rPr>
+      </w:pPr>
+      <w:r>
+        <w:rPr>
+          <w:noProof/>
+        </w:rPr>
+        <w:drawing>
+          <wp:inline distT="0" distB="0" distL="0" distR="0" wp14:anchorId="77557768" wp14:editId="03846AAB">
+            <wp:extent cx="3353268" cy="6420746"/>
+            <wp:effectExtent l="0" t="0" r="0" b="0"/>
+            <wp:docPr id="759020751" name="Picture 12"/>
+            <wp:cNvGraphicFramePr>
+              <a:graphicFrameLocks xmlns:a="http://schemas.openxmlformats.org/drawingml/2006/main" noChangeAspect="1"/>
+            </wp:cNvGraphicFramePr>
+            <a:graphic xmlns:a="http://schemas.openxmlformats.org/drawingml/2006/main">
+              <a:graphicData uri="http://schemas.openxmlformats.org/drawingml/2006/picture">
+                <pic:pic xmlns:pic="http://schemas.openxmlformats.org/drawingml/2006/picture">
+                  <pic:nvPicPr>
+                    <pic:cNvPr id="759020751" name="Picture 759020751"/>
+                    <pic:cNvPicPr/>
+                  </pic:nvPicPr>
+                  <pic:blipFill>
+                    <a:blip r:embed="rId18"/>
+                    <a:stretch>
+                      <a:fillRect/>
+                    </a:stretch>
+                  </pic:blipFill>
+                  <pic:spPr>
+                    <a:xfrm>
+                      <a:off x="0" y="0"/>
+                      <a:ext cx="3353268" cy="6420746"/>
+                    </a:xfrm>
+                    <a:prstGeom prst="rect">
+                      <a:avLst/>
+                    </a:prstGeom>
+                  </pic:spPr>
+                </pic:pic>
+              </a:graphicData>
+            </a:graphic>
+          </wp:inline>
+        </w:drawing>
+      </w:r>
+    </w:p>
+    <w:p>
+      <w:pPr>
+        <w:rPr>
+          <w:rtl/>
+        </w:rPr>
+      </w:pPr>
+    </w:p>
+    <w:p>
+      <w:pPr>
+        <w:rPr>
+          <w:rtl/>
+        </w:rPr>
+      </w:pPr>
+    </w:p>
+    <w:p>
+      <w:pPr>
+        <w:rPr>
+          <w:rtl/>
+        </w:rPr>
+      </w:pPr>
+    </w:p>
+    <w:p>
+      <w:pPr>
+        <w:rPr>
+          <w:b/>
+          <w:bCs/>
+          <w:sz w:val="32"/>
+          <w:szCs w:val="32"/>
+          <w:rtl/>
+        </w:rPr>
+      </w:pPr>
+      <w:r>
+        <w:rPr>
+          <w:b/>
+          <w:bCs/>
+          <w:sz w:val="32"/>
+          <w:szCs w:val="32"/>
+        </w:rPr>
+        <w:t>Reflection</w:t>
+      </w:r>
+      <w:r>
+        <w:rPr>
+          <w:rFonts w:hint="cs"/>
+          <w:b/>
+          <w:bCs/>
+          <w:sz w:val="32"/>
+          <w:szCs w:val="32"/>
+          <w:rtl/>
+        </w:rPr>
+        <w:t>:</w:t>
+      </w:r>
+    </w:p>
+    <w:p/>
+    <w:p>
+      <w:r>
+        <w:t>Working on Task 2, which involved designing the low</w:t>
+      </w:r>
+      <w:r>
+        <w:noBreakHyphen/>
+        <w:t>fidelity prototype, was a valuable experience for me. My responsibility was to choose a suitable prototyping approach, design three main screens for the Student Activities Management System, and explain why the selected approach was appropriate. This task helped me understand that interface design is not only about making the screens look good, but also about making them simple and easy for users to use.</w:t>
+      </w:r>
+    </w:p>
+    <w:p/>
+    <w:p>
+      <w:r>
+        <w:t>The biggest challenge I faced was creating the prototype itself. At first, I found it difficult to decide where to place each element and how to organise the screens in a clear and simple way. I spent time changing the layout several times until I was satisfied with the final result. Although it was challenging, I enjoyed the process. When I finally saw the completed prototype, I felt proud because it felt as though I had created something new from my own ideas. I even wished I could add colours and make it look more realistic, but since the project required a low</w:t>
+      </w:r>
+      <w:r>
+        <w:noBreakHyphen/>
+        <w:t>fidelity prototype, I kept the design simple and focused on the structure instead.</w:t>
+      </w:r>
+    </w:p>
+    <w:p/>
+    <w:p>
+      <w:r>
+        <w:t>I chose Evolutionary Prototyping instead of Throwaway Prototyping because I believe it is more suitable for this project. The Student Activities Management System contains different features, such as browsing activities, viewing details, and registering for events. These features may need further improvement after receiving user feedback, so Evolutionary Prototyping allows the design to be updated and refined gradually without starting over. In contrast, Throwaway Prototyping is mainly used to explore ideas and is usually discarded once the requirements are clear. For this reason, I believed Evolutionary Prototyping was the better choice.</w:t>
+      </w:r>
+    </w:p>
+    <w:p/>
+    <w:p>
+      <w:r>
+        <w:t>During this project, I used ChatGPT only as a supporting tool. I used it to help me understand some project requirements, improve the grammar of my writing, and organise my ideas more clearly. I did not copy the responses directly. Instead, I reviewed the suggestions carefully, compared them with the project instructions, and rewrote the content in my own words to ensure it reflected my understanding and matched the project requirements.</w:t>
+      </w:r>
+    </w:p>
+    <w:p/>
+    <w:p>
+      <w:r>
+        <w:t>If I had more time, I would create additional prototype screens and ask other students to test the interface before the final submission. Their feedback would help me improve the design and make the user experience even better. Overall, this project improved my design skills and gave me more confidence in creating user interfaces. It was a challenging but enjoyable experience, and I am pleased with what I achieved.</w:t>
+      </w:r>
     </w:p>
     <w:p>
       <w:pPr>
@@ -6001,18 +6036,30 @@
     </w:p>
     <w:p/>
     <w:p>
-      <w:r>
-        <w:rPr>
-          <w:highlight w:val="yellow"/>
-        </w:rPr>
-        <w:t>Context Diagram:</w:t>
-      </w:r>
-      <w:r>
-        <w:t xml:space="preserve"> </w:t>
-      </w:r>
-      <w:r>
-        <w:rPr>
+      <w:pPr>
+        <w:rPr>
+          <w:b/>
+          <w:bCs/>
+          <w:sz w:val="32"/>
+          <w:szCs w:val="32"/>
+        </w:rPr>
+      </w:pPr>
+      <w:r>
+        <w:rPr>
+          <w:b/>
+          <w:bCs/>
+          <w:sz w:val="32"/>
+          <w:szCs w:val="32"/>
+        </w:rPr>
+        <w:t xml:space="preserve">Context Diagram: </w:t>
+      </w:r>
+      <w:r>
+        <w:rPr>
+          <w:b/>
+          <w:bCs/>
           <w:noProof/>
+          <w:sz w:val="32"/>
+          <w:szCs w:val="32"/>
         </w:rPr>
         <w:drawing>
           <wp:inline distT="0" distB="0" distL="0" distR="0" wp14:anchorId="30DDD611" wp14:editId="7AC1925D">
@@ -6030,7 +6077,7 @@
                     <pic:cNvPicPr/>
                   </pic:nvPicPr>
                   <pic:blipFill>
-                    <a:blip r:embed="rId18"/>
+                    <a:blip r:embed="rId19"/>
                     <a:stretch>
                       <a:fillRect/>
                     </a:stretch>
@@ -6061,7 +6108,10 @@
       </w:pPr>
       <w:r>
         <w:rPr>
-          <w:highlight w:val="yellow"/>
+          <w:b/>
+          <w:bCs/>
+          <w:sz w:val="32"/>
+          <w:szCs w:val="32"/>
         </w:rPr>
         <w:lastRenderedPageBreak/>
         <w:t>Level-0 DFD :</w:t>
@@ -6089,7 +6139,7 @@
                     <pic:cNvPicPr/>
                   </pic:nvPicPr>
                   <pic:blipFill>
-                    <a:blip r:embed="rId19"/>
+                    <a:blip r:embed="rId20"/>
                     <a:stretch>
                       <a:fillRect/>
                     </a:stretch>
@@ -6115,26 +6165,118 @@
     <w:p/>
     <w:p/>
     <w:p/>
-    <w:p/>
-    <w:p/>
-    <w:p/>
-    <w:p>
-      <w:r>
-        <w:rPr>
+    <w:p>
+      <w:pPr>
+        <w:rPr>
+          <w:rtl/>
+        </w:rPr>
+      </w:pPr>
+    </w:p>
+    <w:p>
+      <w:pPr>
+        <w:rPr>
+          <w:rtl/>
+        </w:rPr>
+      </w:pPr>
+    </w:p>
+    <w:p>
+      <w:pPr>
+        <w:rPr>
+          <w:rtl/>
+        </w:rPr>
+      </w:pPr>
+    </w:p>
+    <w:p>
+      <w:pPr>
+        <w:rPr>
+          <w:rtl/>
+        </w:rPr>
+      </w:pPr>
+    </w:p>
+    <w:p>
+      <w:pPr>
+        <w:rPr>
+          <w:rtl/>
+        </w:rPr>
+      </w:pPr>
+    </w:p>
+    <w:p>
+      <w:pPr>
+        <w:rPr>
+          <w:rtl/>
+        </w:rPr>
+      </w:pPr>
+    </w:p>
+    <w:p>
+      <w:pPr>
+        <w:rPr>
+          <w:rtl/>
+        </w:rPr>
+      </w:pPr>
+    </w:p>
+    <w:p>
+      <w:pPr>
+        <w:rPr>
+          <w:rtl/>
+        </w:rPr>
+      </w:pPr>
+    </w:p>
+    <w:p>
+      <w:pPr>
+        <w:rPr>
+          <w:rtl/>
+        </w:rPr>
+      </w:pPr>
+    </w:p>
+    <w:p>
+      <w:pPr>
+        <w:rPr>
+          <w:rtl/>
+        </w:rPr>
+      </w:pPr>
+    </w:p>
+    <w:p>
+      <w:pPr>
+        <w:rPr>
+          <w:rtl/>
+        </w:rPr>
+      </w:pPr>
+    </w:p>
+    <w:p/>
+    <w:p/>
+    <w:p/>
+    <w:p>
+      <w:pPr>
+        <w:rPr>
+          <w:b/>
+          <w:bCs/>
+          <w:sz w:val="32"/>
+          <w:szCs w:val="32"/>
+        </w:rPr>
+      </w:pPr>
+      <w:r>
+        <w:rPr>
+          <w:b/>
+          <w:bCs/>
           <w:color w:val="000000"/>
-          <w:highlight w:val="yellow"/>
+          <w:sz w:val="32"/>
+          <w:szCs w:val="32"/>
           <w:shd w:val="clear" w:color="auto" w:fill="ECECEC"/>
         </w:rPr>
+        <w:lastRenderedPageBreak/>
         <w:t>Level-1 DFD: Process 1.0</w:t>
       </w:r>
     </w:p>
-    <w:p/>
-    <w:p>
+    <w:p>
+      <w:pPr>
+        <w:rPr>
+          <w:rtl/>
+        </w:rPr>
+      </w:pPr>
       <w:r>
         <w:rPr>
           <w:noProof/>
         </w:rPr>
-        <w:lastRenderedPageBreak/>
         <w:drawing>
           <wp:inline distT="0" distB="0" distL="0" distR="0" wp14:anchorId="4FB86ED1" wp14:editId="31F1D4E7">
             <wp:extent cx="3913632" cy="6040147"/>
@@ -6151,7 +6293,7 @@
                     <pic:cNvPicPr/>
                   </pic:nvPicPr>
                   <pic:blipFill>
-                    <a:blip r:embed="rId20"/>
+                    <a:blip r:embed="rId21"/>
                     <a:stretch>
                       <a:fillRect/>
                     </a:stretch>
@@ -6172,14 +6314,48 @@
         </w:drawing>
       </w:r>
     </w:p>
-    <w:p/>
-    <w:p>
-      <w:r>
-        <w:rPr>
+    <w:p>
+      <w:pPr>
+        <w:rPr>
+          <w:rtl/>
+        </w:rPr>
+      </w:pPr>
+    </w:p>
+    <w:p>
+      <w:pPr>
+        <w:rPr>
+          <w:rtl/>
+        </w:rPr>
+      </w:pPr>
+    </w:p>
+    <w:p>
+      <w:pPr>
+        <w:rPr>
+          <w:rtl/>
+        </w:rPr>
+      </w:pPr>
+    </w:p>
+    <w:p/>
+    <w:p/>
+    <w:p>
+      <w:pPr>
+        <w:rPr>
+          <w:b/>
+          <w:bCs/>
+          <w:sz w:val="32"/>
+          <w:szCs w:val="32"/>
+        </w:rPr>
+      </w:pPr>
+      <w:r>
+        <w:rPr>
+          <w:b/>
+          <w:bCs/>
           <w:color w:val="000000"/>
-          <w:highlight w:val="yellow"/>
+          <w:sz w:val="32"/>
+          <w:szCs w:val="32"/>
           <w:shd w:val="clear" w:color="auto" w:fill="ECECEC"/>
         </w:rPr>
+        <w:lastRenderedPageBreak/>
         <w:t>Level-1 DFD: Process 2.0:</w:t>
       </w:r>
     </w:p>
@@ -6188,7 +6364,6 @@
         <w:rPr>
           <w:noProof/>
         </w:rPr>
-        <w:lastRenderedPageBreak/>
         <w:drawing>
           <wp:inline distT="0" distB="0" distL="0" distR="0" wp14:anchorId="62C91584" wp14:editId="25AD474B">
             <wp:extent cx="4133088" cy="6076484"/>
@@ -6205,7 +6380,7 @@
                     <pic:cNvPicPr/>
                   </pic:nvPicPr>
                   <pic:blipFill>
-                    <a:blip r:embed="rId21"/>
+                    <a:blip r:embed="rId22"/>
                     <a:stretch>
                       <a:fillRect/>
                     </a:stretch>
@@ -6235,16 +6410,26 @@
     <w:p/>
     <w:p/>
     <w:p>
-      <w:r>
-        <w:rPr>
+      <w:pPr>
+        <w:rPr>
+          <w:b/>
+          <w:bCs/>
+          <w:sz w:val="32"/>
+          <w:szCs w:val="32"/>
+        </w:rPr>
+      </w:pPr>
+      <w:r>
+        <w:rPr>
+          <w:b/>
+          <w:bCs/>
           <w:color w:val="000000"/>
-          <w:highlight w:val="yellow"/>
+          <w:sz w:val="32"/>
+          <w:szCs w:val="32"/>
           <w:shd w:val="clear" w:color="auto" w:fill="ECECEC"/>
         </w:rPr>
         <w:t>Level-1 DFD: Process 3.0:</w:t>
       </w:r>
     </w:p>
-    <w:p/>
     <w:p>
       <w:r>
         <w:rPr>
@@ -6266,7 +6451,7 @@
                     <pic:cNvPicPr/>
                   </pic:nvPicPr>
                   <pic:blipFill>
-                    <a:blip r:embed="rId22"/>
+                    <a:blip r:embed="rId23"/>
                     <a:stretch>
                       <a:fillRect/>
                     </a:stretch>
@@ -6297,14 +6482,22 @@
     <w:p/>
     <w:p/>
     <w:p>
-      <w:r>
-        <w:rPr>
-          <w:highlight w:val="yellow"/>
-        </w:rPr>
-        <w:t>Reflection:</w:t>
-      </w:r>
-      <w:r>
-        <w:t xml:space="preserve">  </w:t>
+      <w:pPr>
+        <w:rPr>
+          <w:b/>
+          <w:bCs/>
+          <w:sz w:val="32"/>
+          <w:szCs w:val="32"/>
+        </w:rPr>
+      </w:pPr>
+      <w:r>
+        <w:rPr>
+          <w:b/>
+          <w:bCs/>
+          <w:sz w:val="32"/>
+          <w:szCs w:val="32"/>
+        </w:rPr>
+        <w:t xml:space="preserve">Reflection:  </w:t>
       </w:r>
     </w:p>
     <w:p/>
@@ -6635,7 +6828,7 @@
     </w:p>
     <w:p/>
     <w:sectPr>
-      <w:headerReference w:type="default" r:id="rId23"/>
+      <w:headerReference w:type="default" r:id="rId24"/>
       <w:pgSz w:w="12240" w:h="15840" w:code="1"/>
       <w:pgMar w:top="1080" w:right="720" w:bottom="2160" w:left="3096" w:header="1080" w:footer="720" w:gutter="0"/>
       <w:pgNumType w:start="1"/>
@@ -6769,13 +6962,13 @@
             </wp:anchor>
           </w:drawing>
         </mc:Choice>
-        <mc:Fallback xmlns:w16cei="http://schemas.microsoft.com/office/word/2026/wordml/cei">
+        <mc:Fallback>
           <w:pict>
             <v:shapetype w14:anchorId="1B6FB134" id="_x0000_t202" coordsize="21600,21600" o:spt="202" path="m,l,21600r21600,l21600,xe">
               <v:stroke joinstyle="miter"/>
               <v:path gradientshapeok="t" o:connecttype="rect"/>
             </v:shapetype>
-            <v:shape id="Text Box 9" o:spid="_x0000_s1034" type="#_x0000_t202" alt="Restricted - مقيد " style="position:absolute;left:0;text-align:left;margin-left:0;margin-top:0;width:84.4pt;height:32.1pt;z-index:251663360;visibility:visible;mso-wrap-style:none;mso-wrap-distance-left:0;mso-wrap-distance-top:0;mso-wrap-distance-right:0;mso-wrap-distance-bottom:0;mso-position-horizontal:left;mso-position-horizontal-relative:page;mso-position-vertical:bottom;mso-position-vertical-relative:page;v-text-anchor:bottom" o:gfxdata="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" filled="f" stroked="f">
+            <v:shape id="Text Box 9" o:spid="_x0000_s1034" type="#_x0000_t202" alt="Restricted - مقيد " style="position:absolute;left:0;text-align:left;margin-left:0;margin-top:0;width:84.4pt;height:32.1pt;z-index:251663360;visibility:visible;mso-wrap-style:none;mso-wrap-distance-left:0;mso-wrap-distance-top:0;mso-wrap-distance-right:0;mso-wrap-distance-bottom:0;mso-position-horizontal:left;mso-position-horizontal-relative:page;mso-position-vertical:bottom;mso-position-vertical-relative:page;v-text-anchor:bottom" o:gfxdata="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" filled="f" stroked="f">
               <v:textbox style="mso-fit-shape-to-text:t" inset="20pt,0,0,15pt">
                 <w:txbxContent>
                   <w:p>
@@ -6924,13 +7117,13 @@
             </wp:anchor>
           </w:drawing>
         </mc:Choice>
-        <mc:Fallback xmlns:w16cei="http://schemas.microsoft.com/office/word/2026/wordml/cei">
+        <mc:Fallback>
           <w:pict>
             <v:shapetype w14:anchorId="5602C1D6" id="_x0000_t202" coordsize="21600,21600" o:spt="202" path="m,l,21600r21600,l21600,xe">
               <v:stroke joinstyle="miter"/>
               <v:path gradientshapeok="t" o:connecttype="rect"/>
             </v:shapetype>
-            <v:shape id="Text Box 10" o:spid="_x0000_s1035" type="#_x0000_t202" alt="Restricted - مقيد " style="position:absolute;left:0;text-align:left;margin-left:0;margin-top:0;width:84.4pt;height:32.1pt;z-index:251664384;visibility:visible;mso-wrap-style:none;mso-wrap-distance-left:0;mso-wrap-distance-top:0;mso-wrap-distance-right:0;mso-wrap-distance-bottom:0;mso-position-horizontal:left;mso-position-horizontal-relative:page;mso-position-vertical:bottom;mso-position-vertical-relative:page;v-text-anchor:bottom" o:gfxdata="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" filled="f" stroked="f">
+            <v:shape id="Text Box 10" o:spid="_x0000_s1035" type="#_x0000_t202" alt="Restricted - مقيد " style="position:absolute;left:0;text-align:left;margin-left:0;margin-top:0;width:84.4pt;height:32.1pt;z-index:251664384;visibility:visible;mso-wrap-style:none;mso-wrap-distance-left:0;mso-wrap-distance-top:0;mso-wrap-distance-right:0;mso-wrap-distance-bottom:0;mso-position-horizontal:left;mso-position-horizontal-relative:page;mso-position-vertical:bottom;mso-position-vertical-relative:page;v-text-anchor:bottom" o:gfxdata="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" filled="f" stroked="f">
               <v:textbox style="mso-fit-shape-to-text:t" inset="20pt,0,0,15pt">
                 <w:txbxContent>
                   <w:p>
@@ -7079,13 +7272,13 @@
             </wp:anchor>
           </w:drawing>
         </mc:Choice>
-        <mc:Fallback xmlns:w16cei="http://schemas.microsoft.com/office/word/2026/wordml/cei">
+        <mc:Fallback>
           <w:pict>
             <v:shapetype w14:anchorId="30AB902B" id="_x0000_t202" coordsize="21600,21600" o:spt="202" path="m,l,21600r21600,l21600,xe">
               <v:stroke joinstyle="miter"/>
               <v:path gradientshapeok="t" o:connecttype="rect"/>
             </v:shapetype>
-            <v:shape id="Text Box 8" o:spid="_x0000_s1036" type="#_x0000_t202" alt="Restricted - مقيد " style="position:absolute;left:0;text-align:left;margin-left:0;margin-top:0;width:84.4pt;height:32.1pt;z-index:251662336;visibility:visible;mso-wrap-style:none;mso-wrap-distance-left:0;mso-wrap-distance-top:0;mso-wrap-distance-right:0;mso-wrap-distance-bottom:0;mso-position-horizontal:left;mso-position-horizontal-relative:page;mso-position-vertical:bottom;mso-position-vertical-relative:page;v-text-anchor:bottom" o:gfxdata="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" filled="f" stroked="f">
+            <v:shape id="Text Box 8" o:spid="_x0000_s1036" type="#_x0000_t202" alt="Restricted - مقيد " style="position:absolute;left:0;text-align:left;margin-left:0;margin-top:0;width:84.4pt;height:32.1pt;z-index:251662336;visibility:visible;mso-wrap-style:none;mso-wrap-distance-left:0;mso-wrap-distance-top:0;mso-wrap-distance-right:0;mso-wrap-distance-bottom:0;mso-position-horizontal:left;mso-position-horizontal-relative:page;mso-position-vertical:bottom;mso-position-vertical-relative:page;v-text-anchor:bottom" o:gfxdata="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" filled="f" stroked="f">
               <v:textbox style="mso-fit-shape-to-text:t" inset="20pt,0,0,15pt">
                 <w:txbxContent>
                   <w:p>
@@ -7537,7 +7730,7 @@
             <w:rPr>
               <w:noProof/>
             </w:rPr>
-            <w:instrText>Task 3</w:instrText>
+            <w:instrText>Task 1</w:instrText>
           </w:r>
           <w:r>
             <w:rPr>
@@ -7570,7 +7763,7 @@
             <w:rPr>
               <w:noProof/>
             </w:rPr>
-            <w:instrText>Task 3</w:instrText>
+            <w:instrText>Task 1</w:instrText>
           </w:r>
           <w:r>
             <w:rPr>
@@ -7588,7 +7781,7 @@
             <w:rPr>
               <w:noProof/>
             </w:rPr>
-            <w:t xml:space="preserve">Task 3 </w:t>
+            <w:t xml:space="preserve">Task 1 </w:t>
           </w:r>
           <w:r>
             <w:fldChar w:fldCharType="end"/>
@@ -7667,6 +7860,119 @@
     </w:lvl>
   </w:abstractNum>
   <w:abstractNum w:abstractNumId="1" w15:restartNumberingAfterBreak="0">
+    <w:nsid w:val="05136533"/>
+    <w:multiLevelType w:val="hybridMultilevel"/>
+    <w:tmpl w:val="57129FF2"/>
+    <w:lvl w:ilvl="0" w:tplc="0409000D">
+      <w:start w:val="1"/>
+      <w:numFmt w:val="bullet"/>
+      <w:lvlText w:val=""/>
+      <w:lvlJc w:val="left"/>
+      <w:pPr>
+        <w:ind w:left="780" w:hanging="360"/>
+      </w:pPr>
+      <w:rPr>
+        <w:rFonts w:ascii="Wingdings" w:hAnsi="Wingdings" w:hint="default"/>
+      </w:rPr>
+    </w:lvl>
+    <w:lvl w:ilvl="1" w:tplc="04090003" w:tentative="1">
+      <w:start w:val="1"/>
+      <w:numFmt w:val="bullet"/>
+      <w:lvlText w:val="o"/>
+      <w:lvlJc w:val="left"/>
+      <w:pPr>
+        <w:ind w:left="1500" w:hanging="360"/>
+      </w:pPr>
+      <w:rPr>
+        <w:rFonts w:ascii="Courier New" w:hAnsi="Courier New" w:cs="Courier New" w:hint="default"/>
+      </w:rPr>
+    </w:lvl>
+    <w:lvl w:ilvl="2" w:tplc="04090005" w:tentative="1">
+      <w:start w:val="1"/>
+      <w:numFmt w:val="bullet"/>
+      <w:lvlText w:val=""/>
+      <w:lvlJc w:val="left"/>
+      <w:pPr>
+        <w:ind w:left="2220" w:hanging="360"/>
+      </w:pPr>
+      <w:rPr>
+        <w:rFonts w:ascii="Wingdings" w:hAnsi="Wingdings" w:hint="default"/>
+      </w:rPr>
+    </w:lvl>
+    <w:lvl w:ilvl="3" w:tplc="04090001" w:tentative="1">
+      <w:start w:val="1"/>
+      <w:numFmt w:val="bullet"/>
+      <w:lvlText w:val=""/>
+      <w:lvlJc w:val="left"/>
+      <w:pPr>
+        <w:ind w:left="2940" w:hanging="360"/>
+      </w:pPr>
+      <w:rPr>
+        <w:rFonts w:ascii="Symbol" w:hAnsi="Symbol" w:hint="default"/>
+      </w:rPr>
+    </w:lvl>
+    <w:lvl w:ilvl="4" w:tplc="04090003" w:tentative="1">
+      <w:start w:val="1"/>
+      <w:numFmt w:val="bullet"/>
+      <w:lvlText w:val="o"/>
+      <w:lvlJc w:val="left"/>
+      <w:pPr>
+        <w:ind w:left="3660" w:hanging="360"/>
+      </w:pPr>
+      <w:rPr>
+        <w:rFonts w:ascii="Courier New" w:hAnsi="Courier New" w:cs="Courier New" w:hint="default"/>
+      </w:rPr>
+    </w:lvl>
+    <w:lvl w:ilvl="5" w:tplc="04090005" w:tentative="1">
+      <w:start w:val="1"/>
+      <w:numFmt w:val="bullet"/>
+      <w:lvlText w:val=""/>
+      <w:lvlJc w:val="left"/>
+      <w:pPr>
+        <w:ind w:left="4380" w:hanging="360"/>
+      </w:pPr>
+      <w:rPr>
+        <w:rFonts w:ascii="Wingdings" w:hAnsi="Wingdings" w:hint="default"/>
+      </w:rPr>
+    </w:lvl>
+    <w:lvl w:ilvl="6" w:tplc="04090001" w:tentative="1">
+      <w:start w:val="1"/>
+      <w:numFmt w:val="bullet"/>
+      <w:lvlText w:val=""/>
+      <w:lvlJc w:val="left"/>
+      <w:pPr>
+        <w:ind w:left="5100" w:hanging="360"/>
+      </w:pPr>
+      <w:rPr>
+        <w:rFonts w:ascii="Symbol" w:hAnsi="Symbol" w:hint="default"/>
+      </w:rPr>
+    </w:lvl>
+    <w:lvl w:ilvl="7" w:tplc="04090003" w:tentative="1">
+      <w:start w:val="1"/>
+      <w:numFmt w:val="bullet"/>
+      <w:lvlText w:val="o"/>
+      <w:lvlJc w:val="left"/>
+      <w:pPr>
+        <w:ind w:left="5820" w:hanging="360"/>
+      </w:pPr>
+      <w:rPr>
+        <w:rFonts w:ascii="Courier New" w:hAnsi="Courier New" w:cs="Courier New" w:hint="default"/>
+      </w:rPr>
+    </w:lvl>
+    <w:lvl w:ilvl="8" w:tplc="04090005" w:tentative="1">
+      <w:start w:val="1"/>
+      <w:numFmt w:val="bullet"/>
+      <w:lvlText w:val=""/>
+      <w:lvlJc w:val="left"/>
+      <w:pPr>
+        <w:ind w:left="6540" w:hanging="360"/>
+      </w:pPr>
+      <w:rPr>
+        <w:rFonts w:ascii="Wingdings" w:hAnsi="Wingdings" w:hint="default"/>
+      </w:rPr>
+    </w:lvl>
+  </w:abstractNum>
+  <w:abstractNum w:abstractNumId="2" w15:restartNumberingAfterBreak="0">
     <w:nsid w:val="076729CE"/>
     <w:multiLevelType w:val="hybridMultilevel"/>
     <w:tmpl w:val="2006EBEA"/>
@@ -7752,7 +8058,7 @@
       </w:pPr>
     </w:lvl>
   </w:abstractNum>
-  <w:abstractNum w:abstractNumId="2" w15:restartNumberingAfterBreak="0">
+  <w:abstractNum w:abstractNumId="3" w15:restartNumberingAfterBreak="0">
     <w:nsid w:val="0E742539"/>
     <w:multiLevelType w:val="hybridMultilevel"/>
     <w:tmpl w:val="2006EBEA"/>
@@ -7838,7 +8144,7 @@
       </w:pPr>
     </w:lvl>
   </w:abstractNum>
-  <w:abstractNum w:abstractNumId="3" w15:restartNumberingAfterBreak="0">
+  <w:abstractNum w:abstractNumId="4" w15:restartNumberingAfterBreak="0">
     <w:nsid w:val="1A0C651F"/>
     <w:multiLevelType w:val="multilevel"/>
     <w:tmpl w:val="562E872E"/>
@@ -7987,7 +8293,7 @@
       </w:rPr>
     </w:lvl>
   </w:abstractNum>
-  <w:abstractNum w:abstractNumId="4" w15:restartNumberingAfterBreak="0">
+  <w:abstractNum w:abstractNumId="5" w15:restartNumberingAfterBreak="0">
     <w:nsid w:val="1AFA2610"/>
     <w:multiLevelType w:val="hybridMultilevel"/>
     <w:tmpl w:val="2006EBEA"/>
@@ -8073,7 +8379,7 @@
       </w:pPr>
     </w:lvl>
   </w:abstractNum>
-  <w:abstractNum w:abstractNumId="5" w15:restartNumberingAfterBreak="0">
+  <w:abstractNum w:abstractNumId="6" w15:restartNumberingAfterBreak="0">
     <w:nsid w:val="1CB468F0"/>
     <w:multiLevelType w:val="multilevel"/>
     <w:tmpl w:val="35E4B990"/>
@@ -8222,7 +8528,7 @@
       </w:rPr>
     </w:lvl>
   </w:abstractNum>
-  <w:abstractNum w:abstractNumId="6" w15:restartNumberingAfterBreak="0">
+  <w:abstractNum w:abstractNumId="7" w15:restartNumberingAfterBreak="0">
     <w:nsid w:val="367F6A45"/>
     <w:multiLevelType w:val="multilevel"/>
     <w:tmpl w:val="0436C7FE"/>
@@ -8345,7 +8651,7 @@
       </w:rPr>
     </w:lvl>
   </w:abstractNum>
-  <w:abstractNum w:abstractNumId="7" w15:restartNumberingAfterBreak="0">
+  <w:abstractNum w:abstractNumId="8" w15:restartNumberingAfterBreak="0">
     <w:nsid w:val="3A5A4B88"/>
     <w:multiLevelType w:val="hybridMultilevel"/>
     <w:tmpl w:val="2006EBEA"/>
@@ -8431,7 +8737,7 @@
       </w:pPr>
     </w:lvl>
   </w:abstractNum>
-  <w:abstractNum w:abstractNumId="8" w15:restartNumberingAfterBreak="0">
+  <w:abstractNum w:abstractNumId="9" w15:restartNumberingAfterBreak="0">
     <w:nsid w:val="3BC36BF9"/>
     <w:multiLevelType w:val="multilevel"/>
     <w:tmpl w:val="06F4253A"/>
@@ -8580,7 +8886,7 @@
       </w:rPr>
     </w:lvl>
   </w:abstractNum>
-  <w:abstractNum w:abstractNumId="9" w15:restartNumberingAfterBreak="0">
+  <w:abstractNum w:abstractNumId="10" w15:restartNumberingAfterBreak="0">
     <w:nsid w:val="3DBA4501"/>
     <w:multiLevelType w:val="multilevel"/>
     <w:tmpl w:val="08ACF896"/>
@@ -8729,7 +9035,7 @@
       </w:rPr>
     </w:lvl>
   </w:abstractNum>
-  <w:abstractNum w:abstractNumId="10" w15:restartNumberingAfterBreak="0">
+  <w:abstractNum w:abstractNumId="11" w15:restartNumberingAfterBreak="0">
     <w:nsid w:val="44EE13B5"/>
     <w:multiLevelType w:val="hybridMultilevel"/>
     <w:tmpl w:val="2AE033A4"/>
@@ -8844,7 +9150,7 @@
       </w:rPr>
     </w:lvl>
   </w:abstractNum>
-  <w:abstractNum w:abstractNumId="11" w15:restartNumberingAfterBreak="0">
+  <w:abstractNum w:abstractNumId="12" w15:restartNumberingAfterBreak="0">
     <w:nsid w:val="574A7996"/>
     <w:multiLevelType w:val="multilevel"/>
     <w:tmpl w:val="8C42527C"/>
@@ -8993,7 +9299,7 @@
       </w:rPr>
     </w:lvl>
   </w:abstractNum>
-  <w:abstractNum w:abstractNumId="12" w15:restartNumberingAfterBreak="0">
+  <w:abstractNum w:abstractNumId="13" w15:restartNumberingAfterBreak="0">
     <w:nsid w:val="59A421A5"/>
     <w:multiLevelType w:val="hybridMultilevel"/>
     <w:tmpl w:val="BE28B77E"/>
@@ -9082,7 +9388,7 @@
       </w:pPr>
     </w:lvl>
   </w:abstractNum>
-  <w:abstractNum w:abstractNumId="13" w15:restartNumberingAfterBreak="0">
+  <w:abstractNum w:abstractNumId="14" w15:restartNumberingAfterBreak="0">
     <w:nsid w:val="59F83BB3"/>
     <w:multiLevelType w:val="hybridMultilevel"/>
     <w:tmpl w:val="F7449024"/>
@@ -9195,7 +9501,7 @@
       </w:rPr>
     </w:lvl>
   </w:abstractNum>
-  <w:abstractNum w:abstractNumId="14" w15:restartNumberingAfterBreak="0">
+  <w:abstractNum w:abstractNumId="15" w15:restartNumberingAfterBreak="0">
     <w:nsid w:val="60FD06F7"/>
     <w:multiLevelType w:val="hybridMultilevel"/>
     <w:tmpl w:val="2006EBEA"/>
@@ -9281,7 +9587,7 @@
       </w:pPr>
     </w:lvl>
   </w:abstractNum>
-  <w:abstractNum w:abstractNumId="15" w15:restartNumberingAfterBreak="0">
+  <w:abstractNum w:abstractNumId="16" w15:restartNumberingAfterBreak="0">
     <w:nsid w:val="61D86D18"/>
     <w:multiLevelType w:val="hybridMultilevel"/>
     <w:tmpl w:val="2006EBEA"/>
@@ -9367,7 +9673,7 @@
       </w:pPr>
     </w:lvl>
   </w:abstractNum>
-  <w:abstractNum w:abstractNumId="16" w15:restartNumberingAfterBreak="0">
+  <w:abstractNum w:abstractNumId="17" w15:restartNumberingAfterBreak="0">
     <w:nsid w:val="674A4B08"/>
     <w:multiLevelType w:val="hybridMultilevel"/>
     <w:tmpl w:val="2006EBEA"/>
@@ -9453,7 +9759,7 @@
       </w:pPr>
     </w:lvl>
   </w:abstractNum>
-  <w:abstractNum w:abstractNumId="17" w15:restartNumberingAfterBreak="0">
+  <w:abstractNum w:abstractNumId="18" w15:restartNumberingAfterBreak="0">
     <w:nsid w:val="68567E06"/>
     <w:multiLevelType w:val="hybridMultilevel"/>
     <w:tmpl w:val="133092C0"/>
@@ -9542,7 +9848,7 @@
       </w:pPr>
     </w:lvl>
   </w:abstractNum>
-  <w:abstractNum w:abstractNumId="18" w15:restartNumberingAfterBreak="0">
+  <w:abstractNum w:abstractNumId="19" w15:restartNumberingAfterBreak="0">
     <w:nsid w:val="694B3D43"/>
     <w:multiLevelType w:val="multilevel"/>
     <w:tmpl w:val="CA629762"/>
@@ -9655,7 +9961,7 @@
       </w:pPr>
     </w:lvl>
   </w:abstractNum>
-  <w:abstractNum w:abstractNumId="19" w15:restartNumberingAfterBreak="0">
+  <w:abstractNum w:abstractNumId="20" w15:restartNumberingAfterBreak="0">
     <w:nsid w:val="701D4D8A"/>
     <w:multiLevelType w:val="hybridMultilevel"/>
     <w:tmpl w:val="C6E85370"/>
@@ -9768,7 +10074,7 @@
       </w:rPr>
     </w:lvl>
   </w:abstractNum>
-  <w:abstractNum w:abstractNumId="20" w15:restartNumberingAfterBreak="0">
+  <w:abstractNum w:abstractNumId="21" w15:restartNumberingAfterBreak="0">
     <w:nsid w:val="75300294"/>
     <w:multiLevelType w:val="hybridMultilevel"/>
     <w:tmpl w:val="26DACB2E"/>
@@ -9891,7 +10197,7 @@
     </w:lvlOverride>
   </w:num>
   <w:num w:numId="3" w16cid:durableId="1046485672">
-    <w:abstractNumId w:val="6"/>
+    <w:abstractNumId w:val="7"/>
   </w:num>
   <w:num w:numId="4" w16cid:durableId="1348369148">
     <w:abstractNumId w:val="0"/>
@@ -9906,61 +10212,64 @@
     </w:lvlOverride>
   </w:num>
   <w:num w:numId="6" w16cid:durableId="123279202">
+    <w:abstractNumId w:val="11"/>
+  </w:num>
+  <w:num w:numId="7" w16cid:durableId="1541865961">
+    <w:abstractNumId w:val="12"/>
+  </w:num>
+  <w:num w:numId="8" w16cid:durableId="1130123299">
+    <w:abstractNumId w:val="9"/>
+  </w:num>
+  <w:num w:numId="9" w16cid:durableId="1020735855">
+    <w:abstractNumId w:val="6"/>
+  </w:num>
+  <w:num w:numId="10" w16cid:durableId="704987253">
     <w:abstractNumId w:val="10"/>
   </w:num>
-  <w:num w:numId="7" w16cid:durableId="1541865961">
-    <w:abstractNumId w:val="11"/>
+  <w:num w:numId="11" w16cid:durableId="718165009">
+    <w:abstractNumId w:val="4"/>
   </w:num>
-  <w:num w:numId="8" w16cid:durableId="1130123299">
+  <w:num w:numId="12" w16cid:durableId="1010454176">
+    <w:abstractNumId w:val="2"/>
+  </w:num>
+  <w:num w:numId="13" w16cid:durableId="1929000426">
+    <w:abstractNumId w:val="16"/>
+  </w:num>
+  <w:num w:numId="14" w16cid:durableId="1983654359">
+    <w:abstractNumId w:val="5"/>
+  </w:num>
+  <w:num w:numId="15" w16cid:durableId="1377894548">
+    <w:abstractNumId w:val="15"/>
+  </w:num>
+  <w:num w:numId="16" w16cid:durableId="780683629">
+    <w:abstractNumId w:val="3"/>
+  </w:num>
+  <w:num w:numId="17" w16cid:durableId="1215771571">
+    <w:abstractNumId w:val="17"/>
+  </w:num>
+  <w:num w:numId="18" w16cid:durableId="71204324">
+    <w:abstractNumId w:val="19"/>
+  </w:num>
+  <w:num w:numId="19" w16cid:durableId="684866198">
+    <w:abstractNumId w:val="13"/>
+  </w:num>
+  <w:num w:numId="20" w16cid:durableId="1964653278">
+    <w:abstractNumId w:val="18"/>
+  </w:num>
+  <w:num w:numId="21" w16cid:durableId="1308583101">
+    <w:abstractNumId w:val="21"/>
+  </w:num>
+  <w:num w:numId="22" w16cid:durableId="1937514100">
+    <w:abstractNumId w:val="20"/>
+  </w:num>
+  <w:num w:numId="23" w16cid:durableId="859926557">
+    <w:abstractNumId w:val="14"/>
+  </w:num>
+  <w:num w:numId="24" w16cid:durableId="1657798808">
     <w:abstractNumId w:val="8"/>
   </w:num>
-  <w:num w:numId="9" w16cid:durableId="1020735855">
-    <w:abstractNumId w:val="5"/>
-  </w:num>
-  <w:num w:numId="10" w16cid:durableId="704987253">
-    <w:abstractNumId w:val="9"/>
-  </w:num>
-  <w:num w:numId="11" w16cid:durableId="718165009">
-    <w:abstractNumId w:val="3"/>
-  </w:num>
-  <w:num w:numId="12" w16cid:durableId="1010454176">
+  <w:num w:numId="25" w16cid:durableId="28797375">
     <w:abstractNumId w:val="1"/>
-  </w:num>
-  <w:num w:numId="13" w16cid:durableId="1929000426">
-    <w:abstractNumId w:val="15"/>
-  </w:num>
-  <w:num w:numId="14" w16cid:durableId="1983654359">
-    <w:abstractNumId w:val="4"/>
-  </w:num>
-  <w:num w:numId="15" w16cid:durableId="1377894548">
-    <w:abstractNumId w:val="14"/>
-  </w:num>
-  <w:num w:numId="16" w16cid:durableId="780683629">
-    <w:abstractNumId w:val="2"/>
-  </w:num>
-  <w:num w:numId="17" w16cid:durableId="1215771571">
-    <w:abstractNumId w:val="16"/>
-  </w:num>
-  <w:num w:numId="18" w16cid:durableId="71204324">
-    <w:abstractNumId w:val="18"/>
-  </w:num>
-  <w:num w:numId="19" w16cid:durableId="684866198">
-    <w:abstractNumId w:val="12"/>
-  </w:num>
-  <w:num w:numId="20" w16cid:durableId="1964653278">
-    <w:abstractNumId w:val="17"/>
-  </w:num>
-  <w:num w:numId="21" w16cid:durableId="1308583101">
-    <w:abstractNumId w:val="20"/>
-  </w:num>
-  <w:num w:numId="22" w16cid:durableId="1937514100">
-    <w:abstractNumId w:val="19"/>
-  </w:num>
-  <w:num w:numId="23" w16cid:durableId="859926557">
-    <w:abstractNumId w:val="13"/>
-  </w:num>
-  <w:num w:numId="24" w16cid:durableId="1657798808">
-    <w:abstractNumId w:val="7"/>
   </w:num>
 </w:numbering>
 </file>
@@ -10396,7 +10705,7 @@
       <w:color w:val="000000" w:themeColor="text1"/>
       <w:sz w:val="40"/>
       <w:szCs w:val="20"/>
-      <w:lang w:val="en-US" w:eastAsia="ja-JP"/>
+      <w:lang w:eastAsia="ja-JP"/>
     </w:rPr>
   </w:style>
   <w:style w:type="paragraph" w:styleId="Heading2">
@@ -10420,7 +10729,7 @@
       <w:color w:val="000000" w:themeColor="text1"/>
       <w:sz w:val="28"/>
       <w:szCs w:val="20"/>
-      <w:lang w:val="en-US" w:eastAsia="ja-JP"/>
+      <w:lang w:eastAsia="ja-JP"/>
     </w:rPr>
   </w:style>
   <w:style w:type="paragraph" w:styleId="Heading3">
@@ -10442,13 +10751,12 @@
     <w:rPr>
       <w:rFonts w:asciiTheme="majorHAnsi" w:eastAsiaTheme="majorEastAsia" w:hAnsiTheme="majorHAnsi" w:cstheme="majorBidi"/>
       <w:color w:val="7F1D09" w:themeColor="accent1" w:themeShade="7F"/>
-      <w:lang w:val="en-US" w:eastAsia="ja-JP"/>
+      <w:lang w:eastAsia="ja-JP"/>
     </w:rPr>
   </w:style>
   <w:style w:type="character" w:default="1" w:styleId="DefaultParagraphFont">
     <w:name w:val="Default Paragraph Font"/>
     <w:uiPriority w:val="1"/>
-    <w:semiHidden/>
     <w:unhideWhenUsed/>
   </w:style>
   <w:style w:type="table" w:default="1" w:styleId="TableNormal">
@@ -10487,7 +10795,7 @@
       <w:color w:val="EF4623" w:themeColor="accent1"/>
       <w:sz w:val="20"/>
       <w:szCs w:val="20"/>
-      <w:lang w:val="en-US" w:eastAsia="ja-JP"/>
+      <w:lang w:eastAsia="ja-JP"/>
     </w:rPr>
   </w:style>
   <w:style w:type="character" w:customStyle="1" w:styleId="FooterChar">
@@ -10523,7 +10831,7 @@
       <w:kern w:val="20"/>
       <w:sz w:val="60"/>
       <w:szCs w:val="20"/>
-      <w:lang w:val="en-US" w:eastAsia="ja-JP"/>
+      <w:lang w:eastAsia="ja-JP"/>
     </w:rPr>
   </w:style>
   <w:style w:type="paragraph" w:customStyle="1" w:styleId="Graphic">
@@ -10539,7 +10847,7 @@
       <w:color w:val="404040" w:themeColor="text1" w:themeTint="BF"/>
       <w:sz w:val="20"/>
       <w:szCs w:val="20"/>
-      <w:lang w:val="en-US" w:eastAsia="ja-JP"/>
+      <w:lang w:eastAsia="ja-JP"/>
     </w:rPr>
   </w:style>
   <w:style w:type="paragraph" w:styleId="Header">
@@ -10556,7 +10864,7 @@
       <w:color w:val="404040" w:themeColor="text1" w:themeTint="BF"/>
       <w:sz w:val="20"/>
       <w:szCs w:val="20"/>
-      <w:lang w:val="en-US" w:eastAsia="ja-JP"/>
+      <w:lang w:eastAsia="ja-JP"/>
     </w:rPr>
   </w:style>
   <w:style w:type="character" w:customStyle="1" w:styleId="HeaderChar">
@@ -10643,7 +10951,7 @@
       <w:color w:val="EF4623" w:themeColor="accent1"/>
       <w:sz w:val="36"/>
       <w:szCs w:val="20"/>
-      <w:lang w:val="en-US" w:eastAsia="ja-JP"/>
+      <w:lang w:eastAsia="ja-JP"/>
     </w:rPr>
   </w:style>
   <w:style w:type="paragraph" w:customStyle="1" w:styleId="Page">
@@ -10662,7 +10970,7 @@
       <w:color w:val="000000" w:themeColor="text1"/>
       <w:sz w:val="36"/>
       <w:szCs w:val="20"/>
-      <w:lang w:val="en-US" w:eastAsia="ja-JP"/>
+      <w:lang w:eastAsia="ja-JP"/>
     </w:rPr>
   </w:style>
   <w:style w:type="paragraph" w:styleId="Title">
@@ -10682,7 +10990,7 @@
       <w:color w:val="EF4623" w:themeColor="accent1"/>
       <w:sz w:val="200"/>
       <w:szCs w:val="20"/>
-      <w:lang w:val="en-US" w:eastAsia="ja-JP"/>
+      <w:lang w:eastAsia="ja-JP"/>
     </w:rPr>
   </w:style>
   <w:style w:type="character" w:customStyle="1" w:styleId="TitleChar">
@@ -10719,7 +11027,7 @@
       <w:color w:val="404040" w:themeColor="text1" w:themeTint="BF"/>
       <w:sz w:val="16"/>
       <w:szCs w:val="20"/>
-      <w:lang w:val="en-US" w:eastAsia="ja-JP"/>
+      <w:lang w:eastAsia="ja-JP"/>
     </w:rPr>
   </w:style>
   <w:style w:type="character" w:customStyle="1" w:styleId="BalloonTextChar">
@@ -10774,7 +11082,7 @@
       <w:kern w:val="20"/>
       <w:sz w:val="28"/>
       <w:szCs w:val="20"/>
-      <w:lang w:val="en-US" w:eastAsia="ja-JP"/>
+      <w:lang w:eastAsia="ja-JP"/>
     </w:rPr>
   </w:style>
   <w:style w:type="paragraph" w:styleId="NoSpacing">
@@ -10817,7 +11125,7 @@
       <w:kern w:val="20"/>
       <w:sz w:val="20"/>
       <w:szCs w:val="20"/>
-      <w:lang w:val="en-US" w:eastAsia="ja-JP"/>
+      <w:lang w:eastAsia="ja-JP"/>
     </w:rPr>
   </w:style>
   <w:style w:type="character" w:customStyle="1" w:styleId="Heading1Char">
@@ -10884,7 +11192,7 @@
       <w:color w:val="EF4623" w:themeColor="accent1"/>
       <w:kern w:val="20"/>
       <w:szCs w:val="20"/>
-      <w:lang w:val="en-US" w:eastAsia="ja-JP"/>
+      <w:lang w:eastAsia="ja-JP"/>
     </w:rPr>
   </w:style>
   <w:style w:type="character" w:customStyle="1" w:styleId="QuoteChar">
@@ -10917,7 +11225,7 @@
       <w:kern w:val="20"/>
       <w:sz w:val="20"/>
       <w:szCs w:val="20"/>
-      <w:lang w:val="en-US" w:eastAsia="ja-JP"/>
+      <w:lang w:eastAsia="ja-JP"/>
     </w:rPr>
   </w:style>
   <w:style w:type="character" w:customStyle="1" w:styleId="SignatureChar">
@@ -10954,7 +11262,7 @@
       <w:kern w:val="20"/>
       <w:sz w:val="20"/>
       <w:szCs w:val="20"/>
-      <w:lang w:val="en-US" w:eastAsia="ja-JP"/>
+      <w:lang w:eastAsia="ja-JP"/>
     </w:rPr>
   </w:style>
   <w:style w:type="paragraph" w:styleId="ListNumber">
@@ -10976,7 +11284,7 @@
       <w:kern w:val="20"/>
       <w:sz w:val="20"/>
       <w:szCs w:val="20"/>
-      <w:lang w:val="en-US" w:eastAsia="ja-JP"/>
+      <w:lang w:eastAsia="ja-JP"/>
     </w:rPr>
   </w:style>
   <w:style w:type="paragraph" w:styleId="ListNumber2">
@@ -10999,7 +11307,7 @@
       <w:kern w:val="20"/>
       <w:sz w:val="20"/>
       <w:szCs w:val="20"/>
-      <w:lang w:val="en-US" w:eastAsia="ja-JP"/>
+      <w:lang w:eastAsia="ja-JP"/>
     </w:rPr>
   </w:style>
   <w:style w:type="paragraph" w:styleId="ListNumber3">
@@ -11021,7 +11329,7 @@
       <w:kern w:val="20"/>
       <w:sz w:val="20"/>
       <w:szCs w:val="20"/>
-      <w:lang w:val="en-US" w:eastAsia="ja-JP"/>
+      <w:lang w:eastAsia="ja-JP"/>
     </w:rPr>
   </w:style>
   <w:style w:type="paragraph" w:styleId="ListNumber4">
@@ -11043,7 +11351,7 @@
       <w:kern w:val="20"/>
       <w:sz w:val="20"/>
       <w:szCs w:val="20"/>
-      <w:lang w:val="en-US" w:eastAsia="ja-JP"/>
+      <w:lang w:eastAsia="ja-JP"/>
     </w:rPr>
   </w:style>
   <w:style w:type="paragraph" w:styleId="ListNumber5">
@@ -11065,7 +11373,7 @@
       <w:kern w:val="20"/>
       <w:sz w:val="20"/>
       <w:szCs w:val="20"/>
-      <w:lang w:val="en-US" w:eastAsia="ja-JP"/>
+      <w:lang w:eastAsia="ja-JP"/>
     </w:rPr>
   </w:style>
   <w:style w:type="table" w:customStyle="1" w:styleId="FinancialTable">
@@ -11136,7 +11444,7 @@
       <w:color w:val="404040" w:themeColor="text1" w:themeTint="BF"/>
       <w:sz w:val="20"/>
       <w:szCs w:val="20"/>
-      <w:lang w:val="en-US" w:eastAsia="ja-JP"/>
+      <w:lang w:eastAsia="ja-JP"/>
     </w:rPr>
   </w:style>
   <w:style w:type="character" w:customStyle="1" w:styleId="CommentTextChar">
@@ -11280,7 +11588,7 @@
       <w:color w:val="404040" w:themeColor="text1" w:themeTint="BF"/>
       <w:sz w:val="20"/>
       <w:szCs w:val="20"/>
-      <w:lang w:val="en-US" w:eastAsia="ja-JP"/>
+      <w:lang w:eastAsia="ja-JP"/>
     </w:rPr>
   </w:style>
   <w:style w:type="paragraph" w:customStyle="1" w:styleId="TableText">
@@ -11296,7 +11604,7 @@
       <w:color w:val="404040" w:themeColor="text1" w:themeTint="BF"/>
       <w:sz w:val="20"/>
       <w:szCs w:val="20"/>
-      <w:lang w:val="en-US" w:eastAsia="ja-JP"/>
+      <w:lang w:eastAsia="ja-JP"/>
     </w:rPr>
   </w:style>
   <w:style w:type="paragraph" w:customStyle="1" w:styleId="Organization">
@@ -11315,7 +11623,7 @@
       <w:color w:val="EF4623" w:themeColor="accent1"/>
       <w:sz w:val="36"/>
       <w:szCs w:val="20"/>
-      <w:lang w:val="en-US" w:eastAsia="ja-JP"/>
+      <w:lang w:eastAsia="ja-JP"/>
     </w:rPr>
   </w:style>
   <w:style w:type="paragraph" w:styleId="ListParagraph">
@@ -11334,7 +11642,7 @@
       <w:color w:val="404040" w:themeColor="text1" w:themeTint="BF"/>
       <w:sz w:val="20"/>
       <w:szCs w:val="20"/>
-      <w:lang w:val="en-US" w:eastAsia="ja-JP"/>
+      <w:lang w:eastAsia="ja-JP"/>
     </w:rPr>
   </w:style>
   <w:style w:type="character" w:styleId="UnresolvedMention">
@@ -11375,7 +11683,6 @@
     </w:pPr>
     <w:rPr>
       <w:rFonts w:eastAsiaTheme="minorEastAsia"/>
-      <w:lang w:val="en-US"/>
     </w:rPr>
   </w:style>
 </w:styles>
@@ -11482,10 +11789,10 @@
     <w:pitch w:val="variable"/>
     <w:sig w:usb0="E0002EFF" w:usb1="C000785B" w:usb2="00000009" w:usb3="00000000" w:csb0="000001FF" w:csb1="00000000"/>
   </w:font>
-  <w:font w:name="Symbol">
-    <w:panose1 w:val="05050102010706020507"/>
+  <w:font w:name="Wingdings">
+    <w:panose1 w:val="05000000000000000000"/>
     <w:charset w:val="02"/>
-    <w:family w:val="roman"/>
+    <w:family w:val="auto"/>
     <w:pitch w:val="variable"/>
     <w:sig w:usb0="00000000" w:usb1="10000000" w:usb2="00000000" w:usb3="00000000" w:csb0="80000000" w:csb1="00000000"/>
   </w:font>
@@ -11496,10 +11803,10 @@
     <w:pitch w:val="fixed"/>
     <w:sig w:usb0="E0002EFF" w:usb1="C0007843" w:usb2="00000009" w:usb3="00000000" w:csb0="000001FF" w:csb1="00000000"/>
   </w:font>
-  <w:font w:name="Wingdings">
-    <w:panose1 w:val="05000000000000000000"/>
+  <w:font w:name="Symbol">
+    <w:panose1 w:val="05050102010706020507"/>
     <w:charset w:val="02"/>
-    <w:family w:val="auto"/>
+    <w:family w:val="roman"/>
     <w:pitch w:val="variable"/>
     <w:sig w:usb0="00000000" w:usb1="10000000" w:usb2="00000000" w:usb3="00000000" w:csb0="80000000" w:csb1="00000000"/>
   </w:font>
@@ -11615,6 +11922,7 @@
     <w:rsid w:val="003B2F21"/>
     <w:rsid w:val="003F6FA6"/>
     <w:rsid w:val="00432929"/>
+    <w:rsid w:val="00450C1D"/>
     <w:rsid w:val="004A7EE6"/>
     <w:rsid w:val="005178B3"/>
     <w:rsid w:val="005443A0"/>
@@ -11623,6 +11931,7 @@
     <w:rsid w:val="00660EF5"/>
     <w:rsid w:val="0067264F"/>
     <w:rsid w:val="00695677"/>
+    <w:rsid w:val="006B6E37"/>
     <w:rsid w:val="0073624A"/>
     <w:rsid w:val="007D0B29"/>
     <w:rsid w:val="008955C3"/>
@@ -11636,6 +11945,7 @@
     <w:rsid w:val="00AF3CCC"/>
     <w:rsid w:val="00B2031C"/>
     <w:rsid w:val="00B4602D"/>
+    <w:rsid w:val="00C14CD2"/>
     <w:rsid w:val="00C346F5"/>
     <w:rsid w:val="00C40158"/>
     <w:rsid w:val="00C54676"/>
@@ -11645,6 +11955,7 @@
     <w:rsid w:val="00D1374E"/>
     <w:rsid w:val="00D248BA"/>
     <w:rsid w:val="00D36B88"/>
+    <w:rsid w:val="00D43F39"/>
     <w:rsid w:val="00D56FB7"/>
     <w:rsid w:val="00D91447"/>
     <w:rsid w:val="00DD75D6"/>

</xml_diff>